<commit_message>
docs: expand chapter four and refresh report
</commit_message>
<xml_diff>
--- a/网站建设大作业-学号-姓名.docx
+++ b/网站建设大作业-学号-姓名.docx
@@ -455,7 +455,7 @@
           <w:sz w:val="22"/>
           <w:szCs w:val="22"/>
         </w:rPr>
-        <w:t xml:space="preserve">2026年秋季学期</w:t>
+        <w:t xml:space="preserve">2026年11月1日</w:t>
       </w:r>
     </w:p>
     <w:p>
@@ -687,7 +687,7 @@
           <w:sz w:val="22"/>
           <w:szCs w:val="22"/>
         </w:rPr>
-        <w:t xml:space="preserve">	5</w:t>
+        <w:t xml:space="preserve">	6</w:t>
       </w:r>
     </w:p>
     <w:p>
@@ -714,7 +714,7 @@
           <w:sz w:val="22"/>
           <w:szCs w:val="22"/>
         </w:rPr>
-        <w:t xml:space="preserve">	6</w:t>
+        <w:t xml:space="preserve">	7</w:t>
       </w:r>
     </w:p>
     <w:p>
@@ -741,7 +741,7 @@
           <w:sz w:val="22"/>
           <w:szCs w:val="22"/>
         </w:rPr>
-        <w:t xml:space="preserve">	7</w:t>
+        <w:t xml:space="preserve">	8</w:t>
       </w:r>
     </w:p>
     <w:p>
@@ -768,7 +768,7 @@
           <w:sz w:val="22"/>
           <w:szCs w:val="22"/>
         </w:rPr>
-        <w:t xml:space="preserve">	12</w:t>
+        <w:t xml:space="preserve">	13</w:t>
       </w:r>
     </w:p>
     <w:p>
@@ -795,7 +795,7 @@
           <w:sz w:val="24"/>
           <w:szCs w:val="24"/>
         </w:rPr>
-        <w:t xml:space="preserve">	14</w:t>
+        <w:t xml:space="preserve">	15</w:t>
       </w:r>
     </w:p>
     <w:p>
@@ -822,7 +822,7 @@
           <w:sz w:val="22"/>
           <w:szCs w:val="22"/>
         </w:rPr>
-        <w:t xml:space="preserve">	14</w:t>
+        <w:t xml:space="preserve">	15</w:t>
       </w:r>
     </w:p>
     <w:p>
@@ -849,7 +849,7 @@
           <w:sz w:val="22"/>
           <w:szCs w:val="22"/>
         </w:rPr>
-        <w:t xml:space="preserve">	15</w:t>
+        <w:t xml:space="preserve">	16</w:t>
       </w:r>
     </w:p>
     <w:p>
@@ -876,7 +876,7 @@
           <w:sz w:val="22"/>
           <w:szCs w:val="22"/>
         </w:rPr>
-        <w:t xml:space="preserve">	17</w:t>
+        <w:t xml:space="preserve">	18</w:t>
       </w:r>
     </w:p>
     <w:p>
@@ -903,7 +903,7 @@
           <w:sz w:val="22"/>
           <w:szCs w:val="22"/>
         </w:rPr>
-        <w:t xml:space="preserve">	20</w:t>
+        <w:t xml:space="preserve">	21</w:t>
       </w:r>
     </w:p>
     <w:p>
@@ -930,7 +930,7 @@
           <w:sz w:val="22"/>
           <w:szCs w:val="22"/>
         </w:rPr>
-        <w:t xml:space="preserve">	21</w:t>
+        <w:t xml:space="preserve">	22</w:t>
       </w:r>
     </w:p>
     <w:p>
@@ -957,7 +957,7 @@
           <w:sz w:val="22"/>
           <w:szCs w:val="22"/>
         </w:rPr>
-        <w:t xml:space="preserve">	22</w:t>
+        <w:t xml:space="preserve">	23</w:t>
       </w:r>
     </w:p>
     <w:p>
@@ -967,6 +967,141 @@
         </w:tabs>
         <w:spacing w:after="45" w:line="320"/>
         <w:ind w:left="0"/>
+      </w:pPr>
+      <w:r>
+        <w:rPr>
+          <w:rFonts w:ascii="黑体" w:cs="黑体" w:eastAsia="黑体" w:hAnsi="黑体"/>
+          <w:b/>
+          <w:bCs/>
+          <w:sz w:val="24"/>
+          <w:szCs w:val="24"/>
+        </w:rPr>
+        <w:t xml:space="preserve">第4章  开发总结</w:t>
+      </w:r>
+      <w:r>
+        <w:rPr>
+          <w:rFonts w:ascii="宋体" w:cs="宋体" w:eastAsia="宋体" w:hAnsi="宋体"/>
+          <w:sz w:val="24"/>
+          <w:szCs w:val="24"/>
+        </w:rPr>
+        <w:t xml:space="preserve">	25</w:t>
+      </w:r>
+    </w:p>
+    <w:p>
+      <w:pPr>
+        <w:tabs>
+          <w:tab w:val="right" w:pos="9026" w:leader="dot"/>
+        </w:tabs>
+        <w:spacing w:after="45" w:line="320"/>
+        <w:ind w:left="360"/>
+      </w:pPr>
+      <w:r>
+        <w:rPr>
+          <w:rFonts w:ascii="宋体" w:cs="宋体" w:eastAsia="宋体" w:hAnsi="宋体"/>
+          <w:b w:val="false"/>
+          <w:bCs w:val="false"/>
+          <w:sz w:val="22"/>
+          <w:szCs w:val="22"/>
+        </w:rPr>
+        <w:t xml:space="preserve">4.1  功能完成情况</w:t>
+      </w:r>
+      <w:r>
+        <w:rPr>
+          <w:rFonts w:ascii="宋体" w:cs="宋体" w:eastAsia="宋体" w:hAnsi="宋体"/>
+          <w:sz w:val="22"/>
+          <w:szCs w:val="22"/>
+        </w:rPr>
+        <w:t xml:space="preserve">	25</w:t>
+      </w:r>
+    </w:p>
+    <w:p>
+      <w:pPr>
+        <w:tabs>
+          <w:tab w:val="right" w:pos="9026" w:leader="dot"/>
+        </w:tabs>
+        <w:spacing w:after="45" w:line="320"/>
+        <w:ind w:left="360"/>
+      </w:pPr>
+      <w:r>
+        <w:rPr>
+          <w:rFonts w:ascii="宋体" w:cs="宋体" w:eastAsia="宋体" w:hAnsi="宋体"/>
+          <w:b w:val="false"/>
+          <w:bCs w:val="false"/>
+          <w:sz w:val="22"/>
+          <w:szCs w:val="22"/>
+        </w:rPr>
+        <w:t xml:space="preserve">4.2  开发过程与问题处理</w:t>
+      </w:r>
+      <w:r>
+        <w:rPr>
+          <w:rFonts w:ascii="宋体" w:cs="宋体" w:eastAsia="宋体" w:hAnsi="宋体"/>
+          <w:sz w:val="22"/>
+          <w:szCs w:val="22"/>
+        </w:rPr>
+        <w:t xml:space="preserve">	25</w:t>
+      </w:r>
+    </w:p>
+    <w:p>
+      <w:pPr>
+        <w:tabs>
+          <w:tab w:val="right" w:pos="9026" w:leader="dot"/>
+        </w:tabs>
+        <w:spacing w:after="45" w:line="320"/>
+        <w:ind w:left="360"/>
+      </w:pPr>
+      <w:r>
+        <w:rPr>
+          <w:rFonts w:ascii="宋体" w:cs="宋体" w:eastAsia="宋体" w:hAnsi="宋体"/>
+          <w:b w:val="false"/>
+          <w:bCs w:val="false"/>
+          <w:sz w:val="22"/>
+          <w:szCs w:val="22"/>
+        </w:rPr>
+        <w:t xml:space="preserve">4.3  测试与验收</w:t>
+      </w:r>
+      <w:r>
+        <w:rPr>
+          <w:rFonts w:ascii="宋体" w:cs="宋体" w:eastAsia="宋体" w:hAnsi="宋体"/>
+          <w:sz w:val="22"/>
+          <w:szCs w:val="22"/>
+        </w:rPr>
+        <w:t xml:space="preserve">	26</w:t>
+      </w:r>
+    </w:p>
+    <w:p>
+      <w:pPr>
+        <w:tabs>
+          <w:tab w:val="right" w:pos="9026" w:leader="dot"/>
+        </w:tabs>
+        <w:spacing w:after="45" w:line="320"/>
+        <w:ind w:left="360"/>
+      </w:pPr>
+      <w:r>
+        <w:rPr>
+          <w:rFonts w:ascii="宋体" w:cs="宋体" w:eastAsia="宋体" w:hAnsi="宋体"/>
+          <w:b w:val="false"/>
+          <w:bCs w:val="false"/>
+          <w:sz w:val="22"/>
+          <w:szCs w:val="22"/>
+        </w:rPr>
+        <w:t xml:space="preserve">4.4  不足与改进方向</w:t>
+      </w:r>
+      <w:r>
+        <w:rPr>
+          <w:rFonts w:ascii="宋体" w:cs="宋体" w:eastAsia="宋体" w:hAnsi="宋体"/>
+          <w:sz w:val="22"/>
+          <w:szCs w:val="22"/>
+        </w:rPr>
+        <w:t xml:space="preserve">	27</w:t>
+      </w:r>
+    </w:p>
+    <w:p>
+      <w:pPr>
+        <w:tabs>
+          <w:tab w:val="right" w:pos="9026" w:leader="dot"/>
+        </w:tabs>
+        <w:spacing w:after="45" w:line="320"/>
+        <w:ind w:left="360"/>
         <w:sectPr>
           <w:headerReference w:type="default" r:id="rId6"/>
           <w:footerReference w:type="default" r:id="rId7"/>
@@ -978,21 +1113,21 @@
       </w:pPr>
       <w:r>
         <w:rPr>
-          <w:rFonts w:ascii="黑体" w:cs="黑体" w:eastAsia="黑体" w:hAnsi="黑体"/>
-          <w:b/>
-          <w:bCs/>
-          <w:sz w:val="24"/>
-          <w:szCs w:val="24"/>
-        </w:rPr>
-        <w:t xml:space="preserve">第4章  开发总结</w:t>
-      </w:r>
-      <w:r>
-        <w:rPr>
-          <w:rFonts w:ascii="宋体" w:cs="宋体" w:eastAsia="宋体" w:hAnsi="宋体"/>
-          <w:sz w:val="24"/>
-          <w:szCs w:val="24"/>
-        </w:rPr>
-        <w:t xml:space="preserve">	23</w:t>
+          <w:rFonts w:ascii="宋体" w:cs="宋体" w:eastAsia="宋体" w:hAnsi="宋体"/>
+          <w:b w:val="false"/>
+          <w:bCs w:val="false"/>
+          <w:sz w:val="22"/>
+          <w:szCs w:val="22"/>
+        </w:rPr>
+        <w:t xml:space="preserve">4.5  总结</w:t>
+      </w:r>
+      <w:r>
+        <w:rPr>
+          <w:rFonts w:ascii="宋体" w:cs="宋体" w:eastAsia="宋体" w:hAnsi="宋体"/>
+          <w:sz w:val="22"/>
+          <w:szCs w:val="22"/>
+        </w:rPr>
+        <w:t xml:space="preserve">	27</w:t>
       </w:r>
     </w:p>
     <w:p>
@@ -4590,11 +4725,68 @@
     </w:p>
     <w:p>
       <w:pPr>
+        <w:pStyle w:val="Heading3"/>
+        <w:keepNext/>
+        <w:spacing w:after="90" w:before="170" w:line="360"/>
+      </w:pPr>
+      <w:bookmarkStart w:name="h3_af31f183" w:id="13"/>
+      <w:r>
+        <w:rPr>
+          <w:rFonts w:ascii="黑体" w:cs="黑体" w:eastAsia="黑体" w:hAnsi="黑体"/>
+          <w:b/>
+          <w:bCs/>
+          <w:sz w:val="24"/>
+          <w:szCs w:val="24"/>
+        </w:rPr>
+        <w:t xml:space="preserve">2.2.3  一次请求的处理过程</w:t>
+      </w:r>
+      <w:bookmarkEnd w:id="13"/>
+    </w:p>
+    <w:p>
+      <w:pPr>
+        <w:keepNext w:val="false"/>
+        <w:spacing w:after="110" w:line="360"/>
+        <w:ind w:firstLine="480"/>
+        <w:jc w:val="both"/>
+      </w:pPr>
+      <w:r>
+        <w:rPr>
+          <w:rFonts w:ascii="宋体" w:cs="宋体" w:eastAsia="宋体" w:hAnsi="宋体"/>
+          <w:b w:val="false"/>
+          <w:bCs w:val="false"/>
+          <w:color w:val="000000"/>
+          <w:sz w:val="24"/>
+          <w:szCs w:val="24"/>
+        </w:rPr>
+        <w:t xml:space="preserve">以读者提交预约为例，浏览器先向 LoanController 发送 POST 请求，控制器从 session 中读取当前用户和表单参数，再把业务处理交给 LoanService。Service 先检查预约时间、应还日期和重复借阅，随后调用 BookMapper 扣减可借数量，再写入借阅单。只要数量更新或记录插入任意一步失败，事务都会回滚。</w:t>
+      </w:r>
+    </w:p>
+    <w:p>
+      <w:pPr>
+        <w:keepNext w:val="false"/>
+        <w:spacing w:after="110" w:line="360"/>
+        <w:ind w:firstLine="480"/>
+        <w:jc w:val="both"/>
+      </w:pPr>
+      <w:r>
+        <w:rPr>
+          <w:rFonts w:ascii="宋体" w:cs="宋体" w:eastAsia="宋体" w:hAnsi="宋体"/>
+          <w:b w:val="false"/>
+          <w:bCs w:val="false"/>
+          <w:color w:val="000000"/>
+          <w:sz w:val="24"/>
+          <w:szCs w:val="24"/>
+        </w:rPr>
+        <w:t xml:space="preserve">查询请求的路径更短。BookController 接收关键词、分类和状态，BookService 清理空参数后调用 BookMapper 的动态 SQL，结果和馆藏统计一起放入 Model，最后由 Thymeleaf 生成目录页。页面不直接保存借阅状态，刷新后仍以数据库中的记录为准。</w:t>
+      </w:r>
+    </w:p>
+    <w:p>
+      <w:pPr>
         <w:pStyle w:val="Heading2"/>
         <w:keepNext/>
         <w:spacing w:after="120" w:before="220" w:line="360"/>
       </w:pPr>
-      <w:bookmarkStart w:name="h2_a3f9df61" w:id="13"/>
+      <w:bookmarkStart w:name="h2_a3f9df61" w:id="14"/>
       <w:r>
         <w:rPr>
           <w:rFonts w:ascii="黑体" w:cs="黑体" w:eastAsia="黑体" w:hAnsi="黑体"/>
@@ -4605,7 +4797,7 @@
         </w:rPr>
         <w:t xml:space="preserve">2.3  数据库设计</w:t>
       </w:r>
-      <w:bookmarkEnd w:id="13"/>
+      <w:bookmarkEnd w:id="14"/>
     </w:p>
     <w:p>
       <w:pPr>
@@ -4613,7 +4805,7 @@
         <w:keepNext/>
         <w:spacing w:after="90" w:before="170" w:line="360"/>
       </w:pPr>
-      <w:bookmarkStart w:name="h3_e4d6eef0" w:id="14"/>
+      <w:bookmarkStart w:name="h3_e4d6eef0" w:id="15"/>
       <w:r>
         <w:rPr>
           <w:rFonts w:ascii="黑体" w:cs="黑体" w:eastAsia="黑体" w:hAnsi="黑体"/>
@@ -4624,7 +4816,7 @@
         </w:rPr>
         <w:t xml:space="preserve">2.3.1  数据表</w:t>
       </w:r>
-      <w:bookmarkEnd w:id="14"/>
+      <w:bookmarkEnd w:id="15"/>
     </w:p>
     <w:p>
       <w:pPr>
@@ -5022,7 +5214,7 @@
         <w:keepNext/>
         <w:spacing w:after="90" w:before="170" w:line="360"/>
       </w:pPr>
-      <w:bookmarkStart w:name="h3_4f5a81f4" w:id="15"/>
+      <w:bookmarkStart w:name="h3_4f5a81f4" w:id="16"/>
       <w:r>
         <w:rPr>
           <w:rFonts w:ascii="黑体" w:cs="黑体" w:eastAsia="黑体" w:hAnsi="黑体"/>
@@ -5033,7 +5225,7 @@
         </w:rPr>
         <w:t xml:space="preserve">2.3.2  馆藏统计与初始数据</w:t>
       </w:r>
-      <w:bookmarkEnd w:id="15"/>
+      <w:bookmarkEnd w:id="16"/>
     </w:p>
     <w:p>
       <w:pPr>
@@ -5075,11 +5267,68 @@
     </w:p>
     <w:p>
       <w:pPr>
+        <w:pStyle w:val="Heading3"/>
+        <w:keepNext/>
+        <w:spacing w:after="90" w:before="170" w:line="360"/>
+      </w:pPr>
+      <w:bookmarkStart w:name="h3_7ed6ee95" w:id="17"/>
+      <w:r>
+        <w:rPr>
+          <w:rFonts w:ascii="黑体" w:cs="黑体" w:eastAsia="黑体" w:hAnsi="黑体"/>
+          <w:b/>
+          <w:bCs/>
+          <w:sz w:val="24"/>
+          <w:szCs w:val="24"/>
+        </w:rPr>
+        <w:t xml:space="preserve">2.3.3  数据一致性与权限边界</w:t>
+      </w:r>
+      <w:bookmarkEnd w:id="17"/>
+    </w:p>
+    <w:p>
+      <w:pPr>
+        <w:keepNext w:val="false"/>
+        <w:spacing w:after="110" w:line="360"/>
+        <w:ind w:firstLine="480"/>
+        <w:jc w:val="both"/>
+      </w:pPr>
+      <w:r>
+        <w:rPr>
+          <w:rFonts w:ascii="宋体" w:cs="宋体" w:eastAsia="宋体" w:hAnsi="宋体"/>
+          <w:b w:val="false"/>
+          <w:bCs w:val="false"/>
+          <w:color w:val="000000"/>
+          <w:sz w:val="24"/>
+          <w:szCs w:val="24"/>
+        </w:rPr>
+        <w:t xml:space="preserve">借阅表保存业务状态，书目表保存实时复本数量，两者必须同步变化。预约时先扣减可借数量，再插入借阅单；取消或归还时先更新借阅状态，再恢复一册。更新可借数量的 SQL 带有 available_copies &gt; 0 条件，更新行数不为 1 就停止后续操作。这样即使两个请求同时到达，也不会把同一册书重复分配。</w:t>
+      </w:r>
+    </w:p>
+    <w:p>
+      <w:pPr>
+        <w:keepNext w:val="false"/>
+        <w:spacing w:after="110" w:line="360"/>
+        <w:ind w:firstLine="480"/>
+        <w:jc w:val="both"/>
+      </w:pPr>
+      <w:r>
+        <w:rPr>
+          <w:rFonts w:ascii="宋体" w:cs="宋体" w:eastAsia="宋体" w:hAnsi="宋体"/>
+          <w:b w:val="false"/>
+          <w:bCs w:val="false"/>
+          <w:color w:val="000000"/>
+          <w:sz w:val="24"/>
+          <w:szCs w:val="24"/>
+        </w:rPr>
+        <w:t xml:space="preserve">权限检查分为两层：拦截器负责把未登录请求转到登录页，Controller 在写入馆藏或确认取书前再次核对 session 中的角色。数据库中的 username 与 ISBN 唯一约束作为最后一道检查，防止重复账号和重复书目进入系统。</w:t>
+      </w:r>
+    </w:p>
+    <w:p>
+      <w:pPr>
         <w:pStyle w:val="Heading2"/>
         <w:keepNext/>
         <w:spacing w:after="120" w:before="220" w:line="360"/>
       </w:pPr>
-      <w:bookmarkStart w:name="h2_d87b4abb" w:id="16"/>
+      <w:bookmarkStart w:name="h2_d87b4abb" w:id="18"/>
       <w:r>
         <w:rPr>
           <w:rFonts w:ascii="黑体" w:cs="黑体" w:eastAsia="黑体" w:hAnsi="黑体"/>
@@ -5090,7 +5339,7 @@
         </w:rPr>
         <w:t xml:space="preserve">2.4  详细设计</w:t>
       </w:r>
-      <w:bookmarkEnd w:id="16"/>
+      <w:bookmarkEnd w:id="18"/>
     </w:p>
     <w:p>
       <w:pPr>
@@ -5098,7 +5347,7 @@
         <w:keepNext/>
         <w:spacing w:after="90" w:before="170" w:line="360"/>
       </w:pPr>
-      <w:bookmarkStart w:name="h3_522ed073" w:id="17"/>
+      <w:bookmarkStart w:name="h3_522ed073" w:id="19"/>
       <w:r>
         <w:rPr>
           <w:rFonts w:ascii="黑体" w:cs="黑体" w:eastAsia="黑体" w:hAnsi="黑体"/>
@@ -5109,7 +5358,7 @@
         </w:rPr>
         <w:t xml:space="preserve">2.4.1  目录结构</w:t>
       </w:r>
-      <w:bookmarkEnd w:id="17"/>
+      <w:bookmarkEnd w:id="19"/>
     </w:p>
     <w:p>
       <w:pPr>
@@ -5387,7 +5636,7 @@
         <w:keepNext/>
         <w:spacing w:after="90" w:before="170" w:line="360"/>
       </w:pPr>
-      <w:bookmarkStart w:name="h3_3c0fb394" w:id="18"/>
+      <w:bookmarkStart w:name="h3_3c0fb394" w:id="20"/>
       <w:r>
         <w:rPr>
           <w:rFonts w:ascii="黑体" w:cs="黑体" w:eastAsia="黑体" w:hAnsi="黑体"/>
@@ -5398,7 +5647,7 @@
         </w:rPr>
         <w:t xml:space="preserve">2.4.2  主要文件与职责</w:t>
       </w:r>
-      <w:bookmarkEnd w:id="18"/>
+      <w:bookmarkEnd w:id="20"/>
     </w:p>
     <w:p>
       <w:pPr>
@@ -6282,7 +6531,7 @@
         <w:keepNext/>
         <w:spacing w:after="120" w:before="220" w:line="360"/>
       </w:pPr>
-      <w:bookmarkStart w:name="h2_453c7556" w:id="19"/>
+      <w:bookmarkStart w:name="h2_453c7556" w:id="21"/>
       <w:r>
         <w:rPr>
           <w:rFonts w:ascii="黑体" w:cs="黑体" w:eastAsia="黑体" w:hAnsi="黑体"/>
@@ -6293,7 +6542,7 @@
         </w:rPr>
         <w:t xml:space="preserve">2.5  核心功能实现代码与说明</w:t>
       </w:r>
-      <w:bookmarkEnd w:id="19"/>
+      <w:bookmarkEnd w:id="21"/>
     </w:p>
     <w:p>
       <w:pPr>
@@ -6320,7 +6569,7 @@
         <w:keepNext/>
         <w:spacing w:after="90" w:before="170" w:line="360"/>
       </w:pPr>
-      <w:bookmarkStart w:name="h3_a474497e" w:id="20"/>
+      <w:bookmarkStart w:name="h3_a474497e" w:id="22"/>
       <w:r>
         <w:rPr>
           <w:rFonts w:ascii="黑体" w:cs="黑体" w:eastAsia="黑体" w:hAnsi="黑体"/>
@@ -6331,7 +6580,7 @@
         </w:rPr>
         <w:t xml:space="preserve">2.5.1  项目依赖与启动配置</w:t>
       </w:r>
-      <w:bookmarkEnd w:id="20"/>
+      <w:bookmarkEnd w:id="22"/>
     </w:p>
     <w:p>
       <w:pPr>
@@ -6628,7 +6877,7 @@
         <w:keepNext/>
         <w:spacing w:after="90" w:before="170" w:line="360"/>
       </w:pPr>
-      <w:bookmarkStart w:name="h3_d9f491fc" w:id="21"/>
+      <w:bookmarkStart w:name="h3_d9f491fc" w:id="23"/>
       <w:r>
         <w:rPr>
           <w:rFonts w:ascii="黑体" w:cs="黑体" w:eastAsia="黑体" w:hAnsi="黑体"/>
@@ -6639,7 +6888,7 @@
         </w:rPr>
         <w:t xml:space="preserve">2.5.2  登录拦截配置</w:t>
       </w:r>
-      <w:bookmarkEnd w:id="21"/>
+      <w:bookmarkEnd w:id="23"/>
     </w:p>
     <w:p>
       <w:pPr>
@@ -6876,7 +7125,7 @@
         <w:keepNext/>
         <w:spacing w:after="90" w:before="170" w:line="360"/>
       </w:pPr>
-      <w:bookmarkStart w:name="h3_319ce172" w:id="22"/>
+      <w:bookmarkStart w:name="h3_319ce172" w:id="24"/>
       <w:r>
         <w:rPr>
           <w:rFonts w:ascii="黑体" w:cs="黑体" w:eastAsia="黑体" w:hAnsi="黑体"/>
@@ -6887,7 +7136,7 @@
         </w:rPr>
         <w:t xml:space="preserve">2.5.3  注册与密码校验</w:t>
       </w:r>
-      <w:bookmarkEnd w:id="22"/>
+      <w:bookmarkEnd w:id="24"/>
     </w:p>
     <w:p>
       <w:pPr>
@@ -7289,7 +7538,7 @@
         <w:keepNext/>
         <w:spacing w:after="90" w:before="170" w:line="360"/>
       </w:pPr>
-      <w:bookmarkStart w:name="h3_e5a5af03" w:id="23"/>
+      <w:bookmarkStart w:name="h3_e5a5af03" w:id="25"/>
       <w:r>
         <w:rPr>
           <w:rFonts w:ascii="黑体" w:cs="黑体" w:eastAsia="黑体" w:hAnsi="黑体"/>
@@ -7300,7 +7549,7 @@
         </w:rPr>
         <w:t xml:space="preserve">2.5.4  馆藏动态检索</w:t>
       </w:r>
-      <w:bookmarkEnd w:id="23"/>
+      <w:bookmarkEnd w:id="25"/>
     </w:p>
     <w:p>
       <w:pPr>
@@ -7732,7 +7981,7 @@
         <w:keepNext/>
         <w:spacing w:after="90" w:before="170" w:line="360"/>
       </w:pPr>
-      <w:bookmarkStart w:name="h3_3614eb83" w:id="24"/>
+      <w:bookmarkStart w:name="h3_3614eb83" w:id="26"/>
       <w:r>
         <w:rPr>
           <w:rFonts w:ascii="黑体" w:cs="黑体" w:eastAsia="黑体" w:hAnsi="黑体"/>
@@ -7743,7 +7992,7 @@
         </w:rPr>
         <w:t xml:space="preserve">2.5.5  借阅事务与库存扣减</w:t>
       </w:r>
-      <w:bookmarkEnd w:id="24"/>
+      <w:bookmarkEnd w:id="26"/>
     </w:p>
     <w:p>
       <w:pPr>
@@ -8100,7 +8349,7 @@
         <w:keepNext/>
         <w:spacing w:after="90" w:before="170" w:line="360"/>
       </w:pPr>
-      <w:bookmarkStart w:name="h3_7b7a40d0" w:id="25"/>
+      <w:bookmarkStart w:name="h3_7b7a40d0" w:id="27"/>
       <w:r>
         <w:rPr>
           <w:rFonts w:ascii="黑体" w:cs="黑体" w:eastAsia="黑体" w:hAnsi="黑体"/>
@@ -8111,7 +8360,7 @@
         </w:rPr>
         <w:t xml:space="preserve">2.5.6  状态更新与数量恢复</w:t>
       </w:r>
-      <w:bookmarkEnd w:id="25"/>
+      <w:bookmarkEnd w:id="27"/>
     </w:p>
     <w:p>
       <w:pPr>
@@ -8483,7 +8732,7 @@
         <w:keepNext/>
         <w:spacing w:after="90" w:before="170" w:line="360"/>
       </w:pPr>
-      <w:bookmarkStart w:name="h3_ad8e733c" w:id="26"/>
+      <w:bookmarkStart w:name="h3_ad8e733c" w:id="28"/>
       <w:r>
         <w:rPr>
           <w:rFonts w:ascii="黑体" w:cs="黑体" w:eastAsia="黑体" w:hAnsi="黑体"/>
@@ -8494,7 +8743,7 @@
         </w:rPr>
         <w:t xml:space="preserve">2.5.7  借阅控制器中的取书与归还</w:t>
       </w:r>
-      <w:bookmarkEnd w:id="26"/>
+      <w:bookmarkEnd w:id="28"/>
     </w:p>
     <w:p>
       <w:pPr>
@@ -8911,7 +9160,7 @@
         <w:keepNext/>
         <w:spacing w:after="90" w:before="170" w:line="360"/>
       </w:pPr>
-      <w:bookmarkStart w:name="h3_c9bed0b3" w:id="27"/>
+      <w:bookmarkStart w:name="h3_c9bed0b3" w:id="29"/>
       <w:r>
         <w:rPr>
           <w:rFonts w:ascii="黑体" w:cs="黑体" w:eastAsia="黑体" w:hAnsi="黑体"/>
@@ -8922,7 +9171,7 @@
         </w:rPr>
         <w:t xml:space="preserve">2.5.8  馆藏修改的复本保护</w:t>
       </w:r>
-      <w:bookmarkEnd w:id="27"/>
+      <w:bookmarkEnd w:id="29"/>
     </w:p>
     <w:p>
       <w:pPr>
@@ -9234,7 +9483,7 @@
         <w:keepNext/>
         <w:spacing w:after="120" w:before="220" w:line="360"/>
       </w:pPr>
-      <w:bookmarkStart w:name="h2_58a3cf09" w:id="28"/>
+      <w:bookmarkStart w:name="h2_58a3cf09" w:id="30"/>
       <w:r>
         <w:rPr>
           <w:rFonts w:ascii="黑体" w:cs="黑体" w:eastAsia="黑体" w:hAnsi="黑体"/>
@@ -9245,7 +9494,7 @@
         </w:rPr>
         <w:t xml:space="preserve">2.6  云端部署与运行配置</w:t>
       </w:r>
-      <w:bookmarkEnd w:id="28"/>
+      <w:bookmarkEnd w:id="30"/>
     </w:p>
     <w:p>
       <w:pPr>
@@ -9272,7 +9521,7 @@
         <w:keepNext/>
         <w:spacing w:after="90" w:before="170" w:line="360"/>
       </w:pPr>
-      <w:bookmarkStart w:name="h3_480b1db8" w:id="29"/>
+      <w:bookmarkStart w:name="h3_480b1db8" w:id="31"/>
       <w:r>
         <w:rPr>
           <w:rFonts w:ascii="黑体" w:cs="黑体" w:eastAsia="黑体" w:hAnsi="黑体"/>
@@ -9283,7 +9532,7 @@
         </w:rPr>
         <w:t xml:space="preserve">2.6.1  云端数据源配置</w:t>
       </w:r>
-      <w:bookmarkEnd w:id="29"/>
+      <w:bookmarkEnd w:id="31"/>
     </w:p>
     <w:p>
       <w:pPr>
@@ -9655,7 +9904,7 @@
         <w:keepNext/>
         <w:spacing w:after="90" w:before="170" w:line="360"/>
       </w:pPr>
-      <w:bookmarkStart w:name="h3_2e7cfe60" w:id="30"/>
+      <w:bookmarkStart w:name="h3_2e7cfe60" w:id="32"/>
       <w:r>
         <w:rPr>
           <w:rFonts w:ascii="黑体" w:cs="黑体" w:eastAsia="黑体" w:hAnsi="黑体"/>
@@ -9666,7 +9915,7 @@
         </w:rPr>
         <w:t xml:space="preserve">2.6.2  提交前检查</w:t>
       </w:r>
-      <w:bookmarkEnd w:id="30"/>
+      <w:bookmarkEnd w:id="32"/>
     </w:p>
     <w:p>
       <w:pPr>
@@ -9684,7 +9933,7 @@
           <w:sz w:val="24"/>
           <w:szCs w:val="24"/>
         </w:rPr>
-        <w:t xml:space="preserve">后端使用 Maven Wrapper 执行测试，覆盖注册登录、馆藏查询、预约、确认取书和归还。页面验收在公开地址上完成，实际操作包括首位馆员注册、第二位读者注册、图书入藏、编辑、删除、预约、确认取书和归还。验收结束后清理临时账号和借阅记录，保留正式馆藏，让交付后的首次注册仍能初始化馆员。</w:t>
+        <w:t xml:space="preserve">后端使用 Maven Wrapper 执行自动化测试，覆盖注册登录、首位馆员规则、BCrypt 密码、新书入藏、读者借阅和可借数量扣减。确认取书、归还、编辑、删除和移动端页面在公开地址上人工验收。验收结束后清理临时账号和借阅记录，保留正式馆藏，让交付后的首次注册仍能初始化馆员。</w:t>
       </w:r>
     </w:p>
     <w:p>
@@ -9694,7 +9943,7 @@
         <w:pageBreakBefore/>
         <w:spacing w:after="240" w:before="0" w:line="360"/>
       </w:pPr>
-      <w:bookmarkStart w:name="h1_41d96201" w:id="31"/>
+      <w:bookmarkStart w:name="h1_41d96201" w:id="33"/>
       <w:r>
         <w:rPr>
           <w:rFonts w:ascii="黑体" w:cs="黑体" w:eastAsia="黑体" w:hAnsi="黑体"/>
@@ -9705,7 +9954,7 @@
         </w:rPr>
         <w:t xml:space="preserve">第3章  网站功能介绍</w:t>
       </w:r>
-      <w:bookmarkEnd w:id="31"/>
+      <w:bookmarkEnd w:id="33"/>
     </w:p>
     <w:p>
       <w:pPr>
@@ -9713,7 +9962,7 @@
         <w:keepNext/>
         <w:spacing w:after="120" w:before="220" w:line="360"/>
       </w:pPr>
-      <w:bookmarkStart w:name="h2_cb08b97f" w:id="32"/>
+      <w:bookmarkStart w:name="h2_cb08b97f" w:id="34"/>
       <w:r>
         <w:rPr>
           <w:rFonts w:ascii="黑体" w:cs="黑体" w:eastAsia="黑体" w:hAnsi="黑体"/>
@@ -9724,7 +9973,7 @@
         </w:rPr>
         <w:t xml:space="preserve">3.1  用户注册与登录</w:t>
       </w:r>
-      <w:bookmarkEnd w:id="32"/>
+      <w:bookmarkEnd w:id="34"/>
     </w:p>
     <w:p>
       <w:pPr>
@@ -9894,7 +10143,7 @@
         <w:keepNext/>
         <w:spacing w:after="120" w:before="220" w:line="360"/>
       </w:pPr>
-      <w:bookmarkStart w:name="h2_326e7812" w:id="33"/>
+      <w:bookmarkStart w:name="h2_326e7812" w:id="35"/>
       <w:r>
         <w:rPr>
           <w:rFonts w:ascii="黑体" w:cs="黑体" w:eastAsia="黑体" w:hAnsi="黑体"/>
@@ -9905,7 +10154,7 @@
         </w:rPr>
         <w:t xml:space="preserve">3.2  馆藏首页与分类筛选</w:t>
       </w:r>
-      <w:bookmarkEnd w:id="33"/>
+      <w:bookmarkEnd w:id="35"/>
     </w:p>
     <w:p>
       <w:pPr>
@@ -10094,7 +10343,7 @@
         <w:keepNext/>
         <w:spacing w:after="120" w:before="220" w:line="360"/>
       </w:pPr>
-      <w:bookmarkStart w:name="h2_b2e101a7" w:id="34"/>
+      <w:bookmarkStart w:name="h2_b2e101a7" w:id="36"/>
       <w:r>
         <w:rPr>
           <w:rFonts w:ascii="黑体" w:cs="黑体" w:eastAsia="黑体" w:hAnsi="黑体"/>
@@ -10105,7 +10354,7 @@
         </w:rPr>
         <w:t xml:space="preserve">3.3  馆藏信息与预约借阅</w:t>
       </w:r>
-      <w:bookmarkEnd w:id="34"/>
+      <w:bookmarkEnd w:id="36"/>
     </w:p>
     <w:p>
       <w:pPr>
@@ -10356,7 +10605,7 @@
         <w:keepNext/>
         <w:spacing w:after="120" w:before="220" w:line="360"/>
       </w:pPr>
-      <w:bookmarkStart w:name="h2_51e89744" w:id="35"/>
+      <w:bookmarkStart w:name="h2_51e89744" w:id="37"/>
       <w:r>
         <w:rPr>
           <w:rFonts w:ascii="黑体" w:cs="黑体" w:eastAsia="黑体" w:hAnsi="黑体"/>
@@ -10367,7 +10616,7 @@
         </w:rPr>
         <w:t xml:space="preserve">3.4  借阅管理</w:t>
       </w:r>
-      <w:bookmarkEnd w:id="35"/>
+      <w:bookmarkEnd w:id="37"/>
     </w:p>
     <w:p>
       <w:pPr>
@@ -10475,7 +10724,7 @@
         <w:keepNext/>
         <w:spacing w:after="120" w:before="220" w:line="360"/>
       </w:pPr>
-      <w:bookmarkStart w:name="h2_314b2c70" w:id="36"/>
+      <w:bookmarkStart w:name="h2_314b2c70" w:id="38"/>
       <w:r>
         <w:rPr>
           <w:rFonts w:ascii="黑体" w:cs="黑体" w:eastAsia="黑体" w:hAnsi="黑体"/>
@@ -10486,7 +10735,7 @@
         </w:rPr>
         <w:t xml:space="preserve">3.5  馆员入藏与书目维护</w:t>
       </w:r>
-      <w:bookmarkEnd w:id="36"/>
+      <w:bookmarkEnd w:id="38"/>
     </w:p>
     <w:p>
       <w:pPr>
@@ -10613,7 +10862,7 @@
         <w:keepNext/>
         <w:spacing w:after="120" w:before="220" w:line="360"/>
       </w:pPr>
-      <w:bookmarkStart w:name="h2_e344a27a" w:id="37"/>
+      <w:bookmarkStart w:name="h2_e344a27a" w:id="39"/>
       <w:r>
         <w:rPr>
           <w:rFonts w:ascii="黑体" w:cs="黑体" w:eastAsia="黑体" w:hAnsi="黑体"/>
@@ -10624,7 +10873,7 @@
         </w:rPr>
         <w:t xml:space="preserve">3.6  响应式页面</w:t>
       </w:r>
-      <w:bookmarkEnd w:id="37"/>
+      <w:bookmarkEnd w:id="39"/>
     </w:p>
     <w:p>
       <w:pPr>
@@ -10733,7 +10982,7 @@
         <w:pageBreakBefore/>
         <w:spacing w:after="240" w:before="0" w:line="360"/>
       </w:pPr>
-      <w:bookmarkStart w:name="h1_dd5a8de1" w:id="38"/>
+      <w:bookmarkStart w:name="h1_dd5a8de1" w:id="40"/>
       <w:r>
         <w:rPr>
           <w:rFonts w:ascii="黑体" w:cs="黑体" w:eastAsia="黑体" w:hAnsi="黑体"/>
@@ -10744,7 +10993,26 @@
         </w:rPr>
         <w:t xml:space="preserve">第4章  开发总结</w:t>
       </w:r>
-      <w:bookmarkEnd w:id="38"/>
+      <w:bookmarkEnd w:id="40"/>
+    </w:p>
+    <w:p>
+      <w:pPr>
+        <w:pStyle w:val="Heading2"/>
+        <w:keepNext/>
+        <w:spacing w:after="120" w:before="220" w:line="360"/>
+      </w:pPr>
+      <w:bookmarkStart w:name="h2_5f29a9c9" w:id="41"/>
+      <w:r>
+        <w:rPr>
+          <w:rFonts w:ascii="黑体" w:cs="黑体" w:eastAsia="黑体" w:hAnsi="黑体"/>
+          <w:b/>
+          <w:bCs/>
+          <w:sz w:val="28"/>
+          <w:szCs w:val="28"/>
+        </w:rPr>
+        <w:t xml:space="preserve">4.1  功能完成情况</w:t>
+      </w:r>
+      <w:bookmarkEnd w:id="41"/>
     </w:p>
     <w:p>
       <w:pPr>
@@ -10762,8 +11030,730 @@
           <w:sz w:val="24"/>
           <w:szCs w:val="24"/>
         </w:rPr>
-        <w:t xml:space="preserve">本次作业完成了一个能直接注册、登录、检索、预约、取书和归还的图书管理系统。与只展示几张静态页面相比，真正把借阅状态写进 MySQL 更能发现问题，例如重复预约、复本被扣成负数、编辑总册数时覆盖借出数量，以及代理部署后跳转回 localhost。</w:t>
-      </w:r>
+        <w:t xml:space="preserve">本次作业完成了一个能够直接注册、登录、检索、预约、取书和归还的图书管理系统。网站不仅有页面展示，还将用户、书目和借阅记录写入云端 MySQL。交付后的公开地址可以正常访问，首次注册账号自动成为馆员，后续账号按读者处理，不依赖预置的演示账号。</w:t>
+      </w:r>
+    </w:p>
+    <w:p>
+      <w:pPr>
+        <w:keepNext/>
+        <w:spacing w:after="150" w:before="70" w:line="280"/>
+        <w:jc w:val="center"/>
+      </w:pPr>
+      <w:r>
+        <w:rPr>
+          <w:rFonts w:ascii="宋体" w:cs="宋体" w:eastAsia="宋体" w:hAnsi="宋体"/>
+          <w:sz w:val="21"/>
+          <w:szCs w:val="21"/>
+        </w:rPr>
+        <w:t xml:space="preserve">表4-1  功能完成情况</w:t>
+      </w:r>
+    </w:p>
+    <w:tbl>
+      <w:tblPr>
+        <w:tblW w:type="dxa" w:w="9026"/>
+        <w:tblBorders>
+          <w:top w:val="single" w:color="000000" w:sz="4"/>
+          <w:left w:val="single" w:color="000000" w:sz="4"/>
+          <w:bottom w:val="single" w:color="000000" w:sz="4"/>
+          <w:right w:val="single" w:color="000000" w:sz="4"/>
+          <w:insideH w:val="single" w:color="000000" w:sz="4"/>
+          <w:insideV w:val="single" w:color="000000" w:sz="4"/>
+        </w:tblBorders>
+      </w:tblPr>
+      <w:tblGrid>
+        <w:gridCol w:w="1500"/>
+        <w:gridCol w:w="6000"/>
+        <w:gridCol w:w="1526"/>
+      </w:tblGrid>
+      <w:tr>
+        <w:tc>
+          <w:tcPr>
+            <w:tcW w:type="dxa" w:w="1500"/>
+            <w:tcMar>
+              <w:top w:type="dxa" w:w="92"/>
+              <w:left w:type="dxa" w:w="110"/>
+              <w:bottom w:type="dxa" w:w="92"/>
+              <w:right w:type="dxa" w:w="110"/>
+            </w:tcMar>
+            <w:vAlign w:val="center"/>
+          </w:tcPr>
+          <w:p>
+            <w:pPr>
+              <w:spacing w:after="0" w:line="260"/>
+              <w:jc w:val="center"/>
+            </w:pPr>
+            <w:r>
+              <w:rPr>
+                <w:rFonts w:ascii="黑体" w:cs="黑体" w:eastAsia="黑体" w:hAnsi="黑体"/>
+                <w:b/>
+                <w:bCs/>
+                <w:color w:val="000000"/>
+                <w:sz w:val="18"/>
+                <w:szCs w:val="18"/>
+              </w:rPr>
+              <w:t xml:space="preserve">功能模块</w:t>
+            </w:r>
+          </w:p>
+        </w:tc>
+        <w:tc>
+          <w:tcPr>
+            <w:tcW w:type="dxa" w:w="6000"/>
+            <w:tcMar>
+              <w:top w:type="dxa" w:w="92"/>
+              <w:left w:type="dxa" w:w="110"/>
+              <w:bottom w:type="dxa" w:w="92"/>
+              <w:right w:type="dxa" w:w="110"/>
+            </w:tcMar>
+            <w:vAlign w:val="center"/>
+          </w:tcPr>
+          <w:p>
+            <w:pPr>
+              <w:spacing w:after="0" w:line="260"/>
+              <w:jc w:val="center"/>
+            </w:pPr>
+            <w:r>
+              <w:rPr>
+                <w:rFonts w:ascii="黑体" w:cs="黑体" w:eastAsia="黑体" w:hAnsi="黑体"/>
+                <w:b/>
+                <w:bCs/>
+                <w:color w:val="000000"/>
+                <w:sz w:val="18"/>
+                <w:szCs w:val="18"/>
+              </w:rPr>
+              <w:t xml:space="preserve">实现内容</w:t>
+            </w:r>
+          </w:p>
+        </w:tc>
+        <w:tc>
+          <w:tcPr>
+            <w:tcW w:type="dxa" w:w="1526"/>
+            <w:tcMar>
+              <w:top w:type="dxa" w:w="92"/>
+              <w:left w:type="dxa" w:w="110"/>
+              <w:bottom w:type="dxa" w:w="92"/>
+              <w:right w:type="dxa" w:w="110"/>
+            </w:tcMar>
+            <w:vAlign w:val="center"/>
+          </w:tcPr>
+          <w:p>
+            <w:pPr>
+              <w:spacing w:after="0" w:line="260"/>
+              <w:jc w:val="center"/>
+            </w:pPr>
+            <w:r>
+              <w:rPr>
+                <w:rFonts w:ascii="黑体" w:cs="黑体" w:eastAsia="黑体" w:hAnsi="黑体"/>
+                <w:b/>
+                <w:bCs/>
+                <w:color w:val="000000"/>
+                <w:sz w:val="18"/>
+                <w:szCs w:val="18"/>
+              </w:rPr>
+              <w:t xml:space="preserve">完成情况</w:t>
+            </w:r>
+          </w:p>
+        </w:tc>
+      </w:tr>
+      <w:tr>
+        <w:tc>
+          <w:tcPr>
+            <w:tcW w:type="dxa" w:w="1500"/>
+            <w:tcMar>
+              <w:top w:type="dxa" w:w="92"/>
+              <w:left w:type="dxa" w:w="110"/>
+              <w:bottom w:type="dxa" w:w="92"/>
+              <w:right w:type="dxa" w:w="110"/>
+            </w:tcMar>
+            <w:vAlign w:val="center"/>
+          </w:tcPr>
+          <w:p>
+            <w:pPr>
+              <w:spacing w:after="0" w:line="280"/>
+              <w:jc w:val="left"/>
+            </w:pPr>
+            <w:r>
+              <w:rPr>
+                <w:rFonts w:ascii="宋体" w:cs="宋体" w:eastAsia="宋体" w:hAnsi="宋体"/>
+                <w:color w:val="000000"/>
+                <w:sz w:val="18"/>
+                <w:szCs w:val="18"/>
+              </w:rPr>
+              <w:t xml:space="preserve">用户与权限</w:t>
+            </w:r>
+          </w:p>
+        </w:tc>
+        <w:tc>
+          <w:tcPr>
+            <w:tcW w:type="dxa" w:w="6000"/>
+            <w:tcMar>
+              <w:top w:type="dxa" w:w="92"/>
+              <w:left w:type="dxa" w:w="110"/>
+              <w:bottom w:type="dxa" w:w="92"/>
+              <w:right w:type="dxa" w:w="110"/>
+            </w:tcMar>
+            <w:vAlign w:val="center"/>
+          </w:tcPr>
+          <w:p>
+            <w:pPr>
+              <w:spacing w:after="0" w:line="280"/>
+              <w:jc w:val="left"/>
+            </w:pPr>
+            <w:r>
+              <w:rPr>
+                <w:rFonts w:ascii="宋体" w:cs="宋体" w:eastAsia="宋体" w:hAnsi="宋体"/>
+                <w:color w:val="000000"/>
+                <w:sz w:val="18"/>
+                <w:szCs w:val="18"/>
+              </w:rPr>
+              <w:t xml:space="preserve">注册、登录、退出、BCrypt 密码、读者与馆员角色</w:t>
+            </w:r>
+          </w:p>
+        </w:tc>
+        <w:tc>
+          <w:tcPr>
+            <w:tcW w:type="dxa" w:w="1526"/>
+            <w:tcMar>
+              <w:top w:type="dxa" w:w="92"/>
+              <w:left w:type="dxa" w:w="110"/>
+              <w:bottom w:type="dxa" w:w="92"/>
+              <w:right w:type="dxa" w:w="110"/>
+            </w:tcMar>
+            <w:vAlign w:val="center"/>
+          </w:tcPr>
+          <w:p>
+            <w:pPr>
+              <w:spacing w:after="0" w:line="280"/>
+              <w:jc w:val="center"/>
+            </w:pPr>
+            <w:r>
+              <w:rPr>
+                <w:rFonts w:ascii="宋体" w:cs="宋体" w:eastAsia="宋体" w:hAnsi="宋体"/>
+                <w:color w:val="000000"/>
+                <w:sz w:val="18"/>
+                <w:szCs w:val="18"/>
+              </w:rPr>
+              <w:t xml:space="preserve">已完成</w:t>
+            </w:r>
+          </w:p>
+        </w:tc>
+      </w:tr>
+      <w:tr>
+        <w:tc>
+          <w:tcPr>
+            <w:tcW w:type="dxa" w:w="1500"/>
+            <w:tcMar>
+              <w:top w:type="dxa" w:w="92"/>
+              <w:left w:type="dxa" w:w="110"/>
+              <w:bottom w:type="dxa" w:w="92"/>
+              <w:right w:type="dxa" w:w="110"/>
+            </w:tcMar>
+            <w:vAlign w:val="center"/>
+          </w:tcPr>
+          <w:p>
+            <w:pPr>
+              <w:spacing w:after="0" w:line="280"/>
+              <w:jc w:val="left"/>
+            </w:pPr>
+            <w:r>
+              <w:rPr>
+                <w:rFonts w:ascii="宋体" w:cs="宋体" w:eastAsia="宋体" w:hAnsi="宋体"/>
+                <w:color w:val="000000"/>
+                <w:sz w:val="18"/>
+                <w:szCs w:val="18"/>
+              </w:rPr>
+              <w:t xml:space="preserve">馆藏检索</w:t>
+            </w:r>
+          </w:p>
+        </w:tc>
+        <w:tc>
+          <w:tcPr>
+            <w:tcW w:type="dxa" w:w="6000"/>
+            <w:tcMar>
+              <w:top w:type="dxa" w:w="92"/>
+              <w:left w:type="dxa" w:w="110"/>
+              <w:bottom w:type="dxa" w:w="92"/>
+              <w:right w:type="dxa" w:w="110"/>
+            </w:tcMar>
+            <w:vAlign w:val="center"/>
+          </w:tcPr>
+          <w:p>
+            <w:pPr>
+              <w:spacing w:after="0" w:line="280"/>
+              <w:jc w:val="left"/>
+            </w:pPr>
+            <w:r>
+              <w:rPr>
+                <w:rFonts w:ascii="宋体" w:cs="宋体" w:eastAsia="宋体" w:hAnsi="宋体"/>
+                <w:color w:val="000000"/>
+                <w:sz w:val="18"/>
+                <w:szCs w:val="18"/>
+              </w:rPr>
+              <w:t xml:space="preserve">题名、作者、ISBN、索书号、分类和可借状态组合查询</w:t>
+            </w:r>
+          </w:p>
+        </w:tc>
+        <w:tc>
+          <w:tcPr>
+            <w:tcW w:type="dxa" w:w="1526"/>
+            <w:tcMar>
+              <w:top w:type="dxa" w:w="92"/>
+              <w:left w:type="dxa" w:w="110"/>
+              <w:bottom w:type="dxa" w:w="92"/>
+              <w:right w:type="dxa" w:w="110"/>
+            </w:tcMar>
+            <w:vAlign w:val="center"/>
+          </w:tcPr>
+          <w:p>
+            <w:pPr>
+              <w:spacing w:after="0" w:line="280"/>
+              <w:jc w:val="center"/>
+            </w:pPr>
+            <w:r>
+              <w:rPr>
+                <w:rFonts w:ascii="宋体" w:cs="宋体" w:eastAsia="宋体" w:hAnsi="宋体"/>
+                <w:color w:val="000000"/>
+                <w:sz w:val="18"/>
+                <w:szCs w:val="18"/>
+              </w:rPr>
+              <w:t xml:space="preserve">已完成</w:t>
+            </w:r>
+          </w:p>
+        </w:tc>
+      </w:tr>
+      <w:tr>
+        <w:tc>
+          <w:tcPr>
+            <w:tcW w:type="dxa" w:w="1500"/>
+            <w:tcMar>
+              <w:top w:type="dxa" w:w="92"/>
+              <w:left w:type="dxa" w:w="110"/>
+              <w:bottom w:type="dxa" w:w="92"/>
+              <w:right w:type="dxa" w:w="110"/>
+            </w:tcMar>
+            <w:vAlign w:val="center"/>
+          </w:tcPr>
+          <w:p>
+            <w:pPr>
+              <w:spacing w:after="0" w:line="280"/>
+              <w:jc w:val="left"/>
+            </w:pPr>
+            <w:r>
+              <w:rPr>
+                <w:rFonts w:ascii="宋体" w:cs="宋体" w:eastAsia="宋体" w:hAnsi="宋体"/>
+                <w:color w:val="000000"/>
+                <w:sz w:val="18"/>
+                <w:szCs w:val="18"/>
+              </w:rPr>
+              <w:t xml:space="preserve">图书详情</w:t>
+            </w:r>
+          </w:p>
+        </w:tc>
+        <w:tc>
+          <w:tcPr>
+            <w:tcW w:type="dxa" w:w="6000"/>
+            <w:tcMar>
+              <w:top w:type="dxa" w:w="92"/>
+              <w:left w:type="dxa" w:w="110"/>
+              <w:bottom w:type="dxa" w:w="92"/>
+              <w:right w:type="dxa" w:w="110"/>
+            </w:tcMar>
+            <w:vAlign w:val="center"/>
+          </w:tcPr>
+          <w:p>
+            <w:pPr>
+              <w:spacing w:after="0" w:line="280"/>
+              <w:jc w:val="left"/>
+            </w:pPr>
+            <w:r>
+              <w:rPr>
+                <w:rFonts w:ascii="宋体" w:cs="宋体" w:eastAsia="宋体" w:hAnsi="宋体"/>
+                <w:color w:val="000000"/>
+                <w:sz w:val="18"/>
+                <w:szCs w:val="18"/>
+              </w:rPr>
+              <w:t xml:space="preserve">真实封面、出版信息、索书号、馆藏地和复本数量</w:t>
+            </w:r>
+          </w:p>
+        </w:tc>
+        <w:tc>
+          <w:tcPr>
+            <w:tcW w:type="dxa" w:w="1526"/>
+            <w:tcMar>
+              <w:top w:type="dxa" w:w="92"/>
+              <w:left w:type="dxa" w:w="110"/>
+              <w:bottom w:type="dxa" w:w="92"/>
+              <w:right w:type="dxa" w:w="110"/>
+            </w:tcMar>
+            <w:vAlign w:val="center"/>
+          </w:tcPr>
+          <w:p>
+            <w:pPr>
+              <w:spacing w:after="0" w:line="280"/>
+              <w:jc w:val="center"/>
+            </w:pPr>
+            <w:r>
+              <w:rPr>
+                <w:rFonts w:ascii="宋体" w:cs="宋体" w:eastAsia="宋体" w:hAnsi="宋体"/>
+                <w:color w:val="000000"/>
+                <w:sz w:val="18"/>
+                <w:szCs w:val="18"/>
+              </w:rPr>
+              <w:t xml:space="preserve">已完成</w:t>
+            </w:r>
+          </w:p>
+        </w:tc>
+      </w:tr>
+      <w:tr>
+        <w:tc>
+          <w:tcPr>
+            <w:tcW w:type="dxa" w:w="1500"/>
+            <w:tcMar>
+              <w:top w:type="dxa" w:w="92"/>
+              <w:left w:type="dxa" w:w="110"/>
+              <w:bottom w:type="dxa" w:w="92"/>
+              <w:right w:type="dxa" w:w="110"/>
+            </w:tcMar>
+            <w:vAlign w:val="center"/>
+          </w:tcPr>
+          <w:p>
+            <w:pPr>
+              <w:spacing w:after="0" w:line="280"/>
+              <w:jc w:val="left"/>
+            </w:pPr>
+            <w:r>
+              <w:rPr>
+                <w:rFonts w:ascii="宋体" w:cs="宋体" w:eastAsia="宋体" w:hAnsi="宋体"/>
+                <w:color w:val="000000"/>
+                <w:sz w:val="18"/>
+                <w:szCs w:val="18"/>
+              </w:rPr>
+              <w:t xml:space="preserve">借阅业务</w:t>
+            </w:r>
+          </w:p>
+        </w:tc>
+        <w:tc>
+          <w:tcPr>
+            <w:tcW w:type="dxa" w:w="6000"/>
+            <w:tcMar>
+              <w:top w:type="dxa" w:w="92"/>
+              <w:left w:type="dxa" w:w="110"/>
+              <w:bottom w:type="dxa" w:w="92"/>
+              <w:right w:type="dxa" w:w="110"/>
+            </w:tcMar>
+            <w:vAlign w:val="center"/>
+          </w:tcPr>
+          <w:p>
+            <w:pPr>
+              <w:spacing w:after="0" w:line="280"/>
+              <w:jc w:val="left"/>
+            </w:pPr>
+            <w:r>
+              <w:rPr>
+                <w:rFonts w:ascii="宋体" w:cs="宋体" w:eastAsia="宋体" w:hAnsi="宋体"/>
+                <w:color w:val="000000"/>
+                <w:sz w:val="18"/>
+                <w:szCs w:val="18"/>
+              </w:rPr>
+              <w:t xml:space="preserve">预约、取消、确认取书、办理归还和状态跟踪</w:t>
+            </w:r>
+          </w:p>
+        </w:tc>
+        <w:tc>
+          <w:tcPr>
+            <w:tcW w:type="dxa" w:w="1526"/>
+            <w:tcMar>
+              <w:top w:type="dxa" w:w="92"/>
+              <w:left w:type="dxa" w:w="110"/>
+              <w:bottom w:type="dxa" w:w="92"/>
+              <w:right w:type="dxa" w:w="110"/>
+            </w:tcMar>
+            <w:vAlign w:val="center"/>
+          </w:tcPr>
+          <w:p>
+            <w:pPr>
+              <w:spacing w:after="0" w:line="280"/>
+              <w:jc w:val="center"/>
+            </w:pPr>
+            <w:r>
+              <w:rPr>
+                <w:rFonts w:ascii="宋体" w:cs="宋体" w:eastAsia="宋体" w:hAnsi="宋体"/>
+                <w:color w:val="000000"/>
+                <w:sz w:val="18"/>
+                <w:szCs w:val="18"/>
+              </w:rPr>
+              <w:t xml:space="preserve">已完成</w:t>
+            </w:r>
+          </w:p>
+        </w:tc>
+      </w:tr>
+      <w:tr>
+        <w:tc>
+          <w:tcPr>
+            <w:tcW w:type="dxa" w:w="1500"/>
+            <w:tcMar>
+              <w:top w:type="dxa" w:w="92"/>
+              <w:left w:type="dxa" w:w="110"/>
+              <w:bottom w:type="dxa" w:w="92"/>
+              <w:right w:type="dxa" w:w="110"/>
+            </w:tcMar>
+            <w:vAlign w:val="center"/>
+          </w:tcPr>
+          <w:p>
+            <w:pPr>
+              <w:spacing w:after="0" w:line="280"/>
+              <w:jc w:val="left"/>
+            </w:pPr>
+            <w:r>
+              <w:rPr>
+                <w:rFonts w:ascii="宋体" w:cs="宋体" w:eastAsia="宋体" w:hAnsi="宋体"/>
+                <w:color w:val="000000"/>
+                <w:sz w:val="18"/>
+                <w:szCs w:val="18"/>
+              </w:rPr>
+              <w:t xml:space="preserve">馆藏维护</w:t>
+            </w:r>
+          </w:p>
+        </w:tc>
+        <w:tc>
+          <w:tcPr>
+            <w:tcW w:type="dxa" w:w="6000"/>
+            <w:tcMar>
+              <w:top w:type="dxa" w:w="92"/>
+              <w:left w:type="dxa" w:w="110"/>
+              <w:bottom w:type="dxa" w:w="92"/>
+              <w:right w:type="dxa" w:w="110"/>
+            </w:tcMar>
+            <w:vAlign w:val="center"/>
+          </w:tcPr>
+          <w:p>
+            <w:pPr>
+              <w:spacing w:after="0" w:line="280"/>
+              <w:jc w:val="left"/>
+            </w:pPr>
+            <w:r>
+              <w:rPr>
+                <w:rFonts w:ascii="宋体" w:cs="宋体" w:eastAsia="宋体" w:hAnsi="宋体"/>
+                <w:color w:val="000000"/>
+                <w:sz w:val="18"/>
+                <w:szCs w:val="18"/>
+              </w:rPr>
+              <w:t xml:space="preserve">新书入藏、编辑、删除和借出数量保护</w:t>
+            </w:r>
+          </w:p>
+        </w:tc>
+        <w:tc>
+          <w:tcPr>
+            <w:tcW w:type="dxa" w:w="1526"/>
+            <w:tcMar>
+              <w:top w:type="dxa" w:w="92"/>
+              <w:left w:type="dxa" w:w="110"/>
+              <w:bottom w:type="dxa" w:w="92"/>
+              <w:right w:type="dxa" w:w="110"/>
+            </w:tcMar>
+            <w:vAlign w:val="center"/>
+          </w:tcPr>
+          <w:p>
+            <w:pPr>
+              <w:spacing w:after="0" w:line="280"/>
+              <w:jc w:val="center"/>
+            </w:pPr>
+            <w:r>
+              <w:rPr>
+                <w:rFonts w:ascii="宋体" w:cs="宋体" w:eastAsia="宋体" w:hAnsi="宋体"/>
+                <w:color w:val="000000"/>
+                <w:sz w:val="18"/>
+                <w:szCs w:val="18"/>
+              </w:rPr>
+              <w:t xml:space="preserve">已完成</w:t>
+            </w:r>
+          </w:p>
+        </w:tc>
+      </w:tr>
+      <w:tr>
+        <w:tc>
+          <w:tcPr>
+            <w:tcW w:type="dxa" w:w="1500"/>
+            <w:tcMar>
+              <w:top w:type="dxa" w:w="92"/>
+              <w:left w:type="dxa" w:w="110"/>
+              <w:bottom w:type="dxa" w:w="92"/>
+              <w:right w:type="dxa" w:w="110"/>
+            </w:tcMar>
+            <w:vAlign w:val="center"/>
+          </w:tcPr>
+          <w:p>
+            <w:pPr>
+              <w:spacing w:after="0" w:line="280"/>
+              <w:jc w:val="left"/>
+            </w:pPr>
+            <w:r>
+              <w:rPr>
+                <w:rFonts w:ascii="宋体" w:cs="宋体" w:eastAsia="宋体" w:hAnsi="宋体"/>
+                <w:color w:val="000000"/>
+                <w:sz w:val="18"/>
+                <w:szCs w:val="18"/>
+              </w:rPr>
+              <w:t xml:space="preserve">云端数据</w:t>
+            </w:r>
+          </w:p>
+        </w:tc>
+        <w:tc>
+          <w:tcPr>
+            <w:tcW w:type="dxa" w:w="6000"/>
+            <w:tcMar>
+              <w:top w:type="dxa" w:w="92"/>
+              <w:left w:type="dxa" w:w="110"/>
+              <w:bottom w:type="dxa" w:w="92"/>
+              <w:right w:type="dxa" w:w="110"/>
+            </w:tcMar>
+            <w:vAlign w:val="center"/>
+          </w:tcPr>
+          <w:p>
+            <w:pPr>
+              <w:spacing w:after="0" w:line="280"/>
+              <w:jc w:val="left"/>
+            </w:pPr>
+            <w:r>
+              <w:rPr>
+                <w:rFonts w:ascii="宋体" w:cs="宋体" w:eastAsia="宋体" w:hAnsi="宋体"/>
+                <w:color w:val="000000"/>
+                <w:sz w:val="18"/>
+                <w:szCs w:val="18"/>
+              </w:rPr>
+              <w:t xml:space="preserve">MySQL 8 持久化、环境变量配置和公开部署</w:t>
+            </w:r>
+          </w:p>
+        </w:tc>
+        <w:tc>
+          <w:tcPr>
+            <w:tcW w:type="dxa" w:w="1526"/>
+            <w:tcMar>
+              <w:top w:type="dxa" w:w="92"/>
+              <w:left w:type="dxa" w:w="110"/>
+              <w:bottom w:type="dxa" w:w="92"/>
+              <w:right w:type="dxa" w:w="110"/>
+            </w:tcMar>
+            <w:vAlign w:val="center"/>
+          </w:tcPr>
+          <w:p>
+            <w:pPr>
+              <w:spacing w:after="0" w:line="280"/>
+              <w:jc w:val="center"/>
+            </w:pPr>
+            <w:r>
+              <w:rPr>
+                <w:rFonts w:ascii="宋体" w:cs="宋体" w:eastAsia="宋体" w:hAnsi="宋体"/>
+                <w:color w:val="000000"/>
+                <w:sz w:val="18"/>
+                <w:szCs w:val="18"/>
+              </w:rPr>
+              <w:t xml:space="preserve">已完成</w:t>
+            </w:r>
+          </w:p>
+        </w:tc>
+      </w:tr>
+      <w:tr>
+        <w:tc>
+          <w:tcPr>
+            <w:tcW w:type="dxa" w:w="1500"/>
+            <w:tcMar>
+              <w:top w:type="dxa" w:w="92"/>
+              <w:left w:type="dxa" w:w="110"/>
+              <w:bottom w:type="dxa" w:w="92"/>
+              <w:right w:type="dxa" w:w="110"/>
+            </w:tcMar>
+            <w:vAlign w:val="center"/>
+          </w:tcPr>
+          <w:p>
+            <w:pPr>
+              <w:spacing w:after="0" w:line="280"/>
+              <w:jc w:val="left"/>
+            </w:pPr>
+            <w:r>
+              <w:rPr>
+                <w:rFonts w:ascii="宋体" w:cs="宋体" w:eastAsia="宋体" w:hAnsi="宋体"/>
+                <w:color w:val="000000"/>
+                <w:sz w:val="18"/>
+                <w:szCs w:val="18"/>
+              </w:rPr>
+              <w:t xml:space="preserve">响应式页面</w:t>
+            </w:r>
+          </w:p>
+        </w:tc>
+        <w:tc>
+          <w:tcPr>
+            <w:tcW w:type="dxa" w:w="6000"/>
+            <w:tcMar>
+              <w:top w:type="dxa" w:w="92"/>
+              <w:left w:type="dxa" w:w="110"/>
+              <w:bottom w:type="dxa" w:w="92"/>
+              <w:right w:type="dxa" w:w="110"/>
+            </w:tcMar>
+            <w:vAlign w:val="center"/>
+          </w:tcPr>
+          <w:p>
+            <w:pPr>
+              <w:spacing w:after="0" w:line="280"/>
+              <w:jc w:val="left"/>
+            </w:pPr>
+            <w:r>
+              <w:rPr>
+                <w:rFonts w:ascii="宋体" w:cs="宋体" w:eastAsia="宋体" w:hAnsi="宋体"/>
+                <w:color w:val="000000"/>
+                <w:sz w:val="18"/>
+                <w:szCs w:val="18"/>
+              </w:rPr>
+              <w:t xml:space="preserve">桌面、平板和手机共用同一套模板</w:t>
+            </w:r>
+          </w:p>
+        </w:tc>
+        <w:tc>
+          <w:tcPr>
+            <w:tcW w:type="dxa" w:w="1526"/>
+            <w:tcMar>
+              <w:top w:type="dxa" w:w="92"/>
+              <w:left w:type="dxa" w:w="110"/>
+              <w:bottom w:type="dxa" w:w="92"/>
+              <w:right w:type="dxa" w:w="110"/>
+            </w:tcMar>
+            <w:vAlign w:val="center"/>
+          </w:tcPr>
+          <w:p>
+            <w:pPr>
+              <w:spacing w:after="0" w:line="280"/>
+              <w:jc w:val="center"/>
+            </w:pPr>
+            <w:r>
+              <w:rPr>
+                <w:rFonts w:ascii="宋体" w:cs="宋体" w:eastAsia="宋体" w:hAnsi="宋体"/>
+                <w:color w:val="000000"/>
+                <w:sz w:val="18"/>
+                <w:szCs w:val="18"/>
+              </w:rPr>
+              <w:t xml:space="preserve">已完成</w:t>
+            </w:r>
+          </w:p>
+        </w:tc>
+      </w:tr>
+    </w:tbl>
+    <w:p>
+      <w:pPr>
+        <w:pStyle w:val="Heading2"/>
+        <w:keepNext/>
+        <w:spacing w:after="120" w:before="220" w:line="360"/>
+      </w:pPr>
+      <w:bookmarkStart w:name="h2_2712c9ed" w:id="42"/>
+      <w:r>
+        <w:rPr>
+          <w:rFonts w:ascii="黑体" w:cs="黑体" w:eastAsia="黑体" w:hAnsi="黑体"/>
+          <w:b/>
+          <w:bCs/>
+          <w:sz w:val="28"/>
+          <w:szCs w:val="28"/>
+        </w:rPr>
+        <w:t xml:space="preserve">4.2  开发过程与问题处理</w:t>
+      </w:r>
+      <w:bookmarkEnd w:id="42"/>
     </w:p>
     <w:p>
       <w:pPr>
@@ -10781,7 +11771,7 @@
           <w:sz w:val="24"/>
           <w:szCs w:val="24"/>
         </w:rPr>
-        <w:t xml:space="preserve">SSM 的分工在实现中比较直接。Controller 处理 URL、表单和 session；Service 管业务规则和事务；Mapper 保存 SQL；Thymeleaf 只负责渲染。公开检索和登录后借阅共用同一套图书查询结果，没有为页面另外维护一份假数据。</w:t>
+        <w:t xml:space="preserve">最先处理的是首位馆员初始化。系统没有预置管理员，因此注册方法会在事务中读取用户数量，再决定当前账号是 LIBRARIAN 还是 READER。同步方法和唯一用户名约束共同避免两个注册请求同时判断为空表，造成多个初始馆员。</w:t>
       </w:r>
     </w:p>
     <w:p>
@@ -10800,7 +11790,7 @@
           <w:sz w:val="24"/>
           <w:szCs w:val="24"/>
         </w:rPr>
-        <w:t xml:space="preserve">界面调整过几次。最初信息密度偏低，封面和装饰占的空间较多；最后把检索条件、馆藏统计和图书行压到同一条工作流中，保留真实封面、书架照片、索书号和馆藏地。桌面端便于比较书目，手机端也能完成查找和预约。</w:t>
+        <w:t xml:space="preserve">借阅功能的关键不是按钮，而是复本数量与借阅记录保持一致。实现时把扣减数量、插入借阅单放在同一个事务里，并在 SQL 中加入可借数大于零的条件。若更新行数不是 1，业务层立即抛出异常，避免出现超借或负库存。</w:t>
       </w:r>
     </w:p>
     <w:p>
@@ -10819,7 +11809,7 @@
           <w:sz w:val="24"/>
           <w:szCs w:val="24"/>
         </w:rPr>
-        <w:t xml:space="preserve">系统仍有明确边界。当前没有统一身份认证、短信通知、逾期罚款和预约排队；封面由馆员填写站内路径，没有做文件上传；目录一次显示全部 87 条，继续增加时应改为服务端分页。这些限制没有被包装成已经完成的功能，后续可以按实际需求补上。</w:t>
+        <w:t xml:space="preserve">编辑馆藏时也遇到过数量覆盖问题。页面允许修改总册数，却不能直接修改可借数。Service 先计算“总册数减可借数”得到仍在借出的册数，再按新总册数重新计算可借数量；如果新总册数小于借出数，就拒绝保存。这样修改书目不会破坏正在进行的借阅。</w:t>
       </w:r>
     </w:p>
     <w:p>
@@ -10838,7 +11828,817 @@
           <w:sz w:val="24"/>
           <w:szCs w:val="24"/>
         </w:rPr>
-        <w:t xml:space="preserve">从课程作业的角度看，当前版本已经覆盖任务书要求的注册登录、查询、录入、修改、删除和数据库连接。公开站点的数据保存在云端 MySQL，源码已提交到 GitHub。报告中的页面截图来自公开地址，不使用本地 localhost 截图代替。</w:t>
+        <w:t xml:space="preserve">云端部署还暴露出反向代理下的跳转问题。应用通过 forward-headers-strategy 识别外部 HTTPS 请求，登录和业务操作使用相对地址重定向。浏览器访问公开域名后不会跳回服务器内部的 localhost。SSM 的分工也在这几轮修改中保持清楚：Controller 处理路由和会话，Service 管理规则与事务，Mapper 负责 SQL，Thymeleaf 只渲染数据。</w:t>
+      </w:r>
+    </w:p>
+    <w:p>
+      <w:pPr>
+        <w:pStyle w:val="Heading2"/>
+        <w:keepNext/>
+        <w:spacing w:after="120" w:before="220" w:line="360"/>
+      </w:pPr>
+      <w:bookmarkStart w:name="h2_d60af75" w:id="43"/>
+      <w:r>
+        <w:rPr>
+          <w:rFonts w:ascii="黑体" w:cs="黑体" w:eastAsia="黑体" w:hAnsi="黑体"/>
+          <w:b/>
+          <w:bCs/>
+          <w:sz w:val="28"/>
+          <w:szCs w:val="28"/>
+        </w:rPr>
+        <w:t xml:space="preserve">4.3  测试与验收</w:t>
+      </w:r>
+      <w:bookmarkEnd w:id="43"/>
+    </w:p>
+    <w:p>
+      <w:pPr>
+        <w:keepNext w:val="false"/>
+        <w:spacing w:after="110" w:line="360"/>
+        <w:ind w:firstLine="480"/>
+        <w:jc w:val="both"/>
+      </w:pPr>
+      <w:r>
+        <w:rPr>
+          <w:rFonts w:ascii="宋体" w:cs="宋体" w:eastAsia="宋体" w:hAnsi="宋体"/>
+          <w:b w:val="false"/>
+          <w:bCs w:val="false"/>
+          <w:color w:val="000000"/>
+          <w:sz w:val="24"/>
+          <w:szCs w:val="24"/>
+        </w:rPr>
+        <w:t xml:space="preserve">测试分为自动化测试和公开页面验收两部分。自动化测试使用 H2 内存数据库，执行后不会污染云端正式数据；页面验收在公开地址上完成，检查实际登录、预约和馆员操作。测试中涉及预约时间的参数按运行日期动态生成，避免固定日期过期造成误报。</w:t>
+      </w:r>
+    </w:p>
+    <w:p>
+      <w:pPr>
+        <w:keepNext/>
+        <w:spacing w:after="150" w:before="70" w:line="280"/>
+        <w:jc w:val="center"/>
+      </w:pPr>
+      <w:r>
+        <w:rPr>
+          <w:rFonts w:ascii="宋体" w:cs="宋体" w:eastAsia="宋体" w:hAnsi="宋体"/>
+          <w:sz w:val="21"/>
+          <w:szCs w:val="21"/>
+        </w:rPr>
+        <w:t xml:space="preserve">表4-2  测试与验收结果</w:t>
+      </w:r>
+    </w:p>
+    <w:tbl>
+      <w:tblPr>
+        <w:tblW w:type="dxa" w:w="9026"/>
+        <w:tblBorders>
+          <w:top w:val="single" w:color="000000" w:sz="4"/>
+          <w:left w:val="single" w:color="000000" w:sz="4"/>
+          <w:bottom w:val="single" w:color="000000" w:sz="4"/>
+          <w:right w:val="single" w:color="000000" w:sz="4"/>
+          <w:insideH w:val="single" w:color="000000" w:sz="4"/>
+          <w:insideV w:val="single" w:color="000000" w:sz="4"/>
+        </w:tblBorders>
+      </w:tblPr>
+      <w:tblGrid>
+        <w:gridCol w:w="1800"/>
+        <w:gridCol w:w="5700"/>
+        <w:gridCol w:w="1526"/>
+      </w:tblGrid>
+      <w:tr>
+        <w:tc>
+          <w:tcPr>
+            <w:tcW w:type="dxa" w:w="1800"/>
+            <w:tcMar>
+              <w:top w:type="dxa" w:w="92"/>
+              <w:left w:type="dxa" w:w="110"/>
+              <w:bottom w:type="dxa" w:w="92"/>
+              <w:right w:type="dxa" w:w="110"/>
+            </w:tcMar>
+            <w:vAlign w:val="center"/>
+          </w:tcPr>
+          <w:p>
+            <w:pPr>
+              <w:spacing w:after="0" w:line="260"/>
+              <w:jc w:val="center"/>
+            </w:pPr>
+            <w:r>
+              <w:rPr>
+                <w:rFonts w:ascii="黑体" w:cs="黑体" w:eastAsia="黑体" w:hAnsi="黑体"/>
+                <w:b/>
+                <w:bCs/>
+                <w:color w:val="000000"/>
+                <w:sz w:val="18"/>
+                <w:szCs w:val="18"/>
+              </w:rPr>
+              <w:t xml:space="preserve">测试项目</w:t>
+            </w:r>
+          </w:p>
+        </w:tc>
+        <w:tc>
+          <w:tcPr>
+            <w:tcW w:type="dxa" w:w="5700"/>
+            <w:tcMar>
+              <w:top w:type="dxa" w:w="92"/>
+              <w:left w:type="dxa" w:w="110"/>
+              <w:bottom w:type="dxa" w:w="92"/>
+              <w:right w:type="dxa" w:w="110"/>
+            </w:tcMar>
+            <w:vAlign w:val="center"/>
+          </w:tcPr>
+          <w:p>
+            <w:pPr>
+              <w:spacing w:after="0" w:line="260"/>
+              <w:jc w:val="center"/>
+            </w:pPr>
+            <w:r>
+              <w:rPr>
+                <w:rFonts w:ascii="黑体" w:cs="黑体" w:eastAsia="黑体" w:hAnsi="黑体"/>
+                <w:b/>
+                <w:bCs/>
+                <w:color w:val="000000"/>
+                <w:sz w:val="18"/>
+                <w:szCs w:val="18"/>
+              </w:rPr>
+              <w:t xml:space="preserve">检查内容</w:t>
+            </w:r>
+          </w:p>
+        </w:tc>
+        <w:tc>
+          <w:tcPr>
+            <w:tcW w:type="dxa" w:w="1526"/>
+            <w:tcMar>
+              <w:top w:type="dxa" w:w="92"/>
+              <w:left w:type="dxa" w:w="110"/>
+              <w:bottom w:type="dxa" w:w="92"/>
+              <w:right w:type="dxa" w:w="110"/>
+            </w:tcMar>
+            <w:vAlign w:val="center"/>
+          </w:tcPr>
+          <w:p>
+            <w:pPr>
+              <w:spacing w:after="0" w:line="260"/>
+              <w:jc w:val="center"/>
+            </w:pPr>
+            <w:r>
+              <w:rPr>
+                <w:rFonts w:ascii="黑体" w:cs="黑体" w:eastAsia="黑体" w:hAnsi="黑体"/>
+                <w:b/>
+                <w:bCs/>
+                <w:color w:val="000000"/>
+                <w:sz w:val="18"/>
+                <w:szCs w:val="18"/>
+              </w:rPr>
+              <w:t xml:space="preserve">结果</w:t>
+            </w:r>
+          </w:p>
+        </w:tc>
+      </w:tr>
+      <w:tr>
+        <w:tc>
+          <w:tcPr>
+            <w:tcW w:type="dxa" w:w="1800"/>
+            <w:tcMar>
+              <w:top w:type="dxa" w:w="92"/>
+              <w:left w:type="dxa" w:w="110"/>
+              <w:bottom w:type="dxa" w:w="92"/>
+              <w:right w:type="dxa" w:w="110"/>
+            </w:tcMar>
+            <w:vAlign w:val="center"/>
+          </w:tcPr>
+          <w:p>
+            <w:pPr>
+              <w:spacing w:after="0" w:line="280"/>
+              <w:jc w:val="left"/>
+            </w:pPr>
+            <w:r>
+              <w:rPr>
+                <w:rFonts w:ascii="宋体" w:cs="宋体" w:eastAsia="宋体" w:hAnsi="宋体"/>
+                <w:color w:val="000000"/>
+                <w:sz w:val="18"/>
+                <w:szCs w:val="18"/>
+              </w:rPr>
+              <w:t xml:space="preserve">Maven 集成测试</w:t>
+            </w:r>
+          </w:p>
+        </w:tc>
+        <w:tc>
+          <w:tcPr>
+            <w:tcW w:type="dxa" w:w="5700"/>
+            <w:tcMar>
+              <w:top w:type="dxa" w:w="92"/>
+              <w:left w:type="dxa" w:w="110"/>
+              <w:bottom w:type="dxa" w:w="92"/>
+              <w:right w:type="dxa" w:w="110"/>
+            </w:tcMar>
+            <w:vAlign w:val="center"/>
+          </w:tcPr>
+          <w:p>
+            <w:pPr>
+              <w:spacing w:after="0" w:line="280"/>
+              <w:jc w:val="left"/>
+            </w:pPr>
+            <w:r>
+              <w:rPr>
+                <w:rFonts w:ascii="宋体" w:cs="宋体" w:eastAsia="宋体" w:hAnsi="宋体"/>
+                <w:color w:val="000000"/>
+                <w:sz w:val="18"/>
+                <w:szCs w:val="18"/>
+              </w:rPr>
+              <w:t xml:space="preserve">注册登录、角色初始化、密码哈希、新书入藏、借阅和库存扣减</w:t>
+            </w:r>
+          </w:p>
+        </w:tc>
+        <w:tc>
+          <w:tcPr>
+            <w:tcW w:type="dxa" w:w="1526"/>
+            <w:tcMar>
+              <w:top w:type="dxa" w:w="92"/>
+              <w:left w:type="dxa" w:w="110"/>
+              <w:bottom w:type="dxa" w:w="92"/>
+              <w:right w:type="dxa" w:w="110"/>
+            </w:tcMar>
+            <w:vAlign w:val="center"/>
+          </w:tcPr>
+          <w:p>
+            <w:pPr>
+              <w:spacing w:after="0" w:line="280"/>
+              <w:jc w:val="center"/>
+            </w:pPr>
+            <w:r>
+              <w:rPr>
+                <w:rFonts w:ascii="宋体" w:cs="宋体" w:eastAsia="宋体" w:hAnsi="宋体"/>
+                <w:color w:val="000000"/>
+                <w:sz w:val="18"/>
+                <w:szCs w:val="18"/>
+              </w:rPr>
+              <w:t xml:space="preserve">通过</w:t>
+            </w:r>
+          </w:p>
+        </w:tc>
+      </w:tr>
+      <w:tr>
+        <w:tc>
+          <w:tcPr>
+            <w:tcW w:type="dxa" w:w="1800"/>
+            <w:tcMar>
+              <w:top w:type="dxa" w:w="92"/>
+              <w:left w:type="dxa" w:w="110"/>
+              <w:bottom w:type="dxa" w:w="92"/>
+              <w:right w:type="dxa" w:w="110"/>
+            </w:tcMar>
+            <w:vAlign w:val="center"/>
+          </w:tcPr>
+          <w:p>
+            <w:pPr>
+              <w:spacing w:after="0" w:line="280"/>
+              <w:jc w:val="left"/>
+            </w:pPr>
+            <w:r>
+              <w:rPr>
+                <w:rFonts w:ascii="宋体" w:cs="宋体" w:eastAsia="宋体" w:hAnsi="宋体"/>
+                <w:color w:val="000000"/>
+                <w:sz w:val="18"/>
+                <w:szCs w:val="18"/>
+              </w:rPr>
+              <w:t xml:space="preserve">公开页面检查</w:t>
+            </w:r>
+          </w:p>
+        </w:tc>
+        <w:tc>
+          <w:tcPr>
+            <w:tcW w:type="dxa" w:w="5700"/>
+            <w:tcMar>
+              <w:top w:type="dxa" w:w="92"/>
+              <w:left w:type="dxa" w:w="110"/>
+              <w:bottom w:type="dxa" w:w="92"/>
+              <w:right w:type="dxa" w:w="110"/>
+            </w:tcMar>
+            <w:vAlign w:val="center"/>
+          </w:tcPr>
+          <w:p>
+            <w:pPr>
+              <w:spacing w:after="0" w:line="280"/>
+              <w:jc w:val="left"/>
+            </w:pPr>
+            <w:r>
+              <w:rPr>
+                <w:rFonts w:ascii="宋体" w:cs="宋体" w:eastAsia="宋体" w:hAnsi="宋体"/>
+                <w:color w:val="000000"/>
+                <w:sz w:val="18"/>
+                <w:szCs w:val="18"/>
+              </w:rPr>
+              <w:t xml:space="preserve">目录访问、搜索筛选、详情、注册和登录页面状态</w:t>
+            </w:r>
+          </w:p>
+        </w:tc>
+        <w:tc>
+          <w:tcPr>
+            <w:tcW w:type="dxa" w:w="1526"/>
+            <w:tcMar>
+              <w:top w:type="dxa" w:w="92"/>
+              <w:left w:type="dxa" w:w="110"/>
+              <w:bottom w:type="dxa" w:w="92"/>
+              <w:right w:type="dxa" w:w="110"/>
+            </w:tcMar>
+            <w:vAlign w:val="center"/>
+          </w:tcPr>
+          <w:p>
+            <w:pPr>
+              <w:spacing w:after="0" w:line="280"/>
+              <w:jc w:val="center"/>
+            </w:pPr>
+            <w:r>
+              <w:rPr>
+                <w:rFonts w:ascii="宋体" w:cs="宋体" w:eastAsia="宋体" w:hAnsi="宋体"/>
+                <w:color w:val="000000"/>
+                <w:sz w:val="18"/>
+                <w:szCs w:val="18"/>
+              </w:rPr>
+              <w:t xml:space="preserve">通过</w:t>
+            </w:r>
+          </w:p>
+        </w:tc>
+      </w:tr>
+      <w:tr>
+        <w:tc>
+          <w:tcPr>
+            <w:tcW w:type="dxa" w:w="1800"/>
+            <w:tcMar>
+              <w:top w:type="dxa" w:w="92"/>
+              <w:left w:type="dxa" w:w="110"/>
+              <w:bottom w:type="dxa" w:w="92"/>
+              <w:right w:type="dxa" w:w="110"/>
+            </w:tcMar>
+            <w:vAlign w:val="center"/>
+          </w:tcPr>
+          <w:p>
+            <w:pPr>
+              <w:spacing w:after="0" w:line="280"/>
+              <w:jc w:val="left"/>
+            </w:pPr>
+            <w:r>
+              <w:rPr>
+                <w:rFonts w:ascii="宋体" w:cs="宋体" w:eastAsia="宋体" w:hAnsi="宋体"/>
+                <w:color w:val="000000"/>
+                <w:sz w:val="18"/>
+                <w:szCs w:val="18"/>
+              </w:rPr>
+              <w:t xml:space="preserve">权限拦截</w:t>
+            </w:r>
+          </w:p>
+        </w:tc>
+        <w:tc>
+          <w:tcPr>
+            <w:tcW w:type="dxa" w:w="5700"/>
+            <w:tcMar>
+              <w:top w:type="dxa" w:w="92"/>
+              <w:left w:type="dxa" w:w="110"/>
+              <w:bottom w:type="dxa" w:w="92"/>
+              <w:right w:type="dxa" w:w="110"/>
+            </w:tcMar>
+            <w:vAlign w:val="center"/>
+          </w:tcPr>
+          <w:p>
+            <w:pPr>
+              <w:spacing w:after="0" w:line="280"/>
+              <w:jc w:val="left"/>
+            </w:pPr>
+            <w:r>
+              <w:rPr>
+                <w:rFonts w:ascii="宋体" w:cs="宋体" w:eastAsia="宋体" w:hAnsi="宋体"/>
+                <w:color w:val="000000"/>
+                <w:sz w:val="18"/>
+                <w:szCs w:val="18"/>
+              </w:rPr>
+              <w:t xml:space="preserve">未登录访问借阅地址时跳转到站内登录页</w:t>
+            </w:r>
+          </w:p>
+        </w:tc>
+        <w:tc>
+          <w:tcPr>
+            <w:tcW w:type="dxa" w:w="1526"/>
+            <w:tcMar>
+              <w:top w:type="dxa" w:w="92"/>
+              <w:left w:type="dxa" w:w="110"/>
+              <w:bottom w:type="dxa" w:w="92"/>
+              <w:right w:type="dxa" w:w="110"/>
+            </w:tcMar>
+            <w:vAlign w:val="center"/>
+          </w:tcPr>
+          <w:p>
+            <w:pPr>
+              <w:spacing w:after="0" w:line="280"/>
+              <w:jc w:val="center"/>
+            </w:pPr>
+            <w:r>
+              <w:rPr>
+                <w:rFonts w:ascii="宋体" w:cs="宋体" w:eastAsia="宋体" w:hAnsi="宋体"/>
+                <w:color w:val="000000"/>
+                <w:sz w:val="18"/>
+                <w:szCs w:val="18"/>
+              </w:rPr>
+              <w:t xml:space="preserve">通过</w:t>
+            </w:r>
+          </w:p>
+        </w:tc>
+      </w:tr>
+      <w:tr>
+        <w:tc>
+          <w:tcPr>
+            <w:tcW w:type="dxa" w:w="1800"/>
+            <w:tcMar>
+              <w:top w:type="dxa" w:w="92"/>
+              <w:left w:type="dxa" w:w="110"/>
+              <w:bottom w:type="dxa" w:w="92"/>
+              <w:right w:type="dxa" w:w="110"/>
+            </w:tcMar>
+            <w:vAlign w:val="center"/>
+          </w:tcPr>
+          <w:p>
+            <w:pPr>
+              <w:spacing w:after="0" w:line="280"/>
+              <w:jc w:val="left"/>
+            </w:pPr>
+            <w:r>
+              <w:rPr>
+                <w:rFonts w:ascii="宋体" w:cs="宋体" w:eastAsia="宋体" w:hAnsi="宋体"/>
+                <w:color w:val="000000"/>
+                <w:sz w:val="18"/>
+                <w:szCs w:val="18"/>
+              </w:rPr>
+              <w:t xml:space="preserve">业务流程</w:t>
+            </w:r>
+          </w:p>
+        </w:tc>
+        <w:tc>
+          <w:tcPr>
+            <w:tcW w:type="dxa" w:w="5700"/>
+            <w:tcMar>
+              <w:top w:type="dxa" w:w="92"/>
+              <w:left w:type="dxa" w:w="110"/>
+              <w:bottom w:type="dxa" w:w="92"/>
+              <w:right w:type="dxa" w:w="110"/>
+            </w:tcMar>
+            <w:vAlign w:val="center"/>
+          </w:tcPr>
+          <w:p>
+            <w:pPr>
+              <w:spacing w:after="0" w:line="280"/>
+              <w:jc w:val="left"/>
+            </w:pPr>
+            <w:r>
+              <w:rPr>
+                <w:rFonts w:ascii="宋体" w:cs="宋体" w:eastAsia="宋体" w:hAnsi="宋体"/>
+                <w:color w:val="000000"/>
+                <w:sz w:val="18"/>
+                <w:szCs w:val="18"/>
+              </w:rPr>
+              <w:t xml:space="preserve">预约、取消、确认取书、归还、编辑和删除</w:t>
+            </w:r>
+          </w:p>
+        </w:tc>
+        <w:tc>
+          <w:tcPr>
+            <w:tcW w:type="dxa" w:w="1526"/>
+            <w:tcMar>
+              <w:top w:type="dxa" w:w="92"/>
+              <w:left w:type="dxa" w:w="110"/>
+              <w:bottom w:type="dxa" w:w="92"/>
+              <w:right w:type="dxa" w:w="110"/>
+            </w:tcMar>
+            <w:vAlign w:val="center"/>
+          </w:tcPr>
+          <w:p>
+            <w:pPr>
+              <w:spacing w:after="0" w:line="280"/>
+              <w:jc w:val="center"/>
+            </w:pPr>
+            <w:r>
+              <w:rPr>
+                <w:rFonts w:ascii="宋体" w:cs="宋体" w:eastAsia="宋体" w:hAnsi="宋体"/>
+                <w:color w:val="000000"/>
+                <w:sz w:val="18"/>
+                <w:szCs w:val="18"/>
+              </w:rPr>
+              <w:t xml:space="preserve">通过</w:t>
+            </w:r>
+          </w:p>
+        </w:tc>
+      </w:tr>
+      <w:tr>
+        <w:tc>
+          <w:tcPr>
+            <w:tcW w:type="dxa" w:w="1800"/>
+            <w:tcMar>
+              <w:top w:type="dxa" w:w="92"/>
+              <w:left w:type="dxa" w:w="110"/>
+              <w:bottom w:type="dxa" w:w="92"/>
+              <w:right w:type="dxa" w:w="110"/>
+            </w:tcMar>
+            <w:vAlign w:val="center"/>
+          </w:tcPr>
+          <w:p>
+            <w:pPr>
+              <w:spacing w:after="0" w:line="280"/>
+              <w:jc w:val="left"/>
+            </w:pPr>
+            <w:r>
+              <w:rPr>
+                <w:rFonts w:ascii="宋体" w:cs="宋体" w:eastAsia="宋体" w:hAnsi="宋体"/>
+                <w:color w:val="000000"/>
+                <w:sz w:val="18"/>
+                <w:szCs w:val="18"/>
+              </w:rPr>
+              <w:t xml:space="preserve">移动端检查</w:t>
+            </w:r>
+          </w:p>
+        </w:tc>
+        <w:tc>
+          <w:tcPr>
+            <w:tcW w:type="dxa" w:w="5700"/>
+            <w:tcMar>
+              <w:top w:type="dxa" w:w="92"/>
+              <w:left w:type="dxa" w:w="110"/>
+              <w:bottom w:type="dxa" w:w="92"/>
+              <w:right w:type="dxa" w:w="110"/>
+            </w:tcMar>
+            <w:vAlign w:val="center"/>
+          </w:tcPr>
+          <w:p>
+            <w:pPr>
+              <w:spacing w:after="0" w:line="280"/>
+              <w:jc w:val="left"/>
+            </w:pPr>
+            <w:r>
+              <w:rPr>
+                <w:rFonts w:ascii="宋体" w:cs="宋体" w:eastAsia="宋体" w:hAnsi="宋体"/>
+                <w:color w:val="000000"/>
+                <w:sz w:val="18"/>
+                <w:szCs w:val="18"/>
+              </w:rPr>
+              <w:t xml:space="preserve">390 像素宽度下导航、表单、统计和书目列表</w:t>
+            </w:r>
+          </w:p>
+        </w:tc>
+        <w:tc>
+          <w:tcPr>
+            <w:tcW w:type="dxa" w:w="1526"/>
+            <w:tcMar>
+              <w:top w:type="dxa" w:w="92"/>
+              <w:left w:type="dxa" w:w="110"/>
+              <w:bottom w:type="dxa" w:w="92"/>
+              <w:right w:type="dxa" w:w="110"/>
+            </w:tcMar>
+            <w:vAlign w:val="center"/>
+          </w:tcPr>
+          <w:p>
+            <w:pPr>
+              <w:spacing w:after="0" w:line="280"/>
+              <w:jc w:val="center"/>
+            </w:pPr>
+            <w:r>
+              <w:rPr>
+                <w:rFonts w:ascii="宋体" w:cs="宋体" w:eastAsia="宋体" w:hAnsi="宋体"/>
+                <w:color w:val="000000"/>
+                <w:sz w:val="18"/>
+                <w:szCs w:val="18"/>
+              </w:rPr>
+              <w:t xml:space="preserve">通过</w:t>
+            </w:r>
+          </w:p>
+        </w:tc>
+      </w:tr>
+      <w:tr>
+        <w:tc>
+          <w:tcPr>
+            <w:tcW w:type="dxa" w:w="1800"/>
+            <w:tcMar>
+              <w:top w:type="dxa" w:w="92"/>
+              <w:left w:type="dxa" w:w="110"/>
+              <w:bottom w:type="dxa" w:w="92"/>
+              <w:right w:type="dxa" w:w="110"/>
+            </w:tcMar>
+            <w:vAlign w:val="center"/>
+          </w:tcPr>
+          <w:p>
+            <w:pPr>
+              <w:spacing w:after="0" w:line="280"/>
+              <w:jc w:val="left"/>
+            </w:pPr>
+            <w:r>
+              <w:rPr>
+                <w:rFonts w:ascii="宋体" w:cs="宋体" w:eastAsia="宋体" w:hAnsi="宋体"/>
+                <w:color w:val="000000"/>
+                <w:sz w:val="18"/>
+                <w:szCs w:val="18"/>
+              </w:rPr>
+              <w:t xml:space="preserve">交付数据</w:t>
+            </w:r>
+          </w:p>
+        </w:tc>
+        <w:tc>
+          <w:tcPr>
+            <w:tcW w:type="dxa" w:w="5700"/>
+            <w:tcMar>
+              <w:top w:type="dxa" w:w="92"/>
+              <w:left w:type="dxa" w:w="110"/>
+              <w:bottom w:type="dxa" w:w="92"/>
+              <w:right w:type="dxa" w:w="110"/>
+            </w:tcMar>
+            <w:vAlign w:val="center"/>
+          </w:tcPr>
+          <w:p>
+            <w:pPr>
+              <w:spacing w:after="0" w:line="280"/>
+              <w:jc w:val="left"/>
+            </w:pPr>
+            <w:r>
+              <w:rPr>
+                <w:rFonts w:ascii="宋体" w:cs="宋体" w:eastAsia="宋体" w:hAnsi="宋体"/>
+                <w:color w:val="000000"/>
+                <w:sz w:val="18"/>
+                <w:szCs w:val="18"/>
+              </w:rPr>
+              <w:t xml:space="preserve">0 个测试账号、0 条借阅、87 种图书、403 册馆藏</w:t>
+            </w:r>
+          </w:p>
+        </w:tc>
+        <w:tc>
+          <w:tcPr>
+            <w:tcW w:type="dxa" w:w="1526"/>
+            <w:tcMar>
+              <w:top w:type="dxa" w:w="92"/>
+              <w:left w:type="dxa" w:w="110"/>
+              <w:bottom w:type="dxa" w:w="92"/>
+              <w:right w:type="dxa" w:w="110"/>
+            </w:tcMar>
+            <w:vAlign w:val="center"/>
+          </w:tcPr>
+          <w:p>
+            <w:pPr>
+              <w:spacing w:after="0" w:line="280"/>
+              <w:jc w:val="center"/>
+            </w:pPr>
+            <w:r>
+              <w:rPr>
+                <w:rFonts w:ascii="宋体" w:cs="宋体" w:eastAsia="宋体" w:hAnsi="宋体"/>
+                <w:color w:val="000000"/>
+                <w:sz w:val="18"/>
+                <w:szCs w:val="18"/>
+              </w:rPr>
+              <w:t xml:space="preserve">通过</w:t>
+            </w:r>
+          </w:p>
+        </w:tc>
+      </w:tr>
+    </w:tbl>
+    <w:p>
+      <w:pPr>
+        <w:keepNext w:val="false"/>
+        <w:spacing w:after="110" w:line="360"/>
+        <w:ind w:firstLine="480"/>
+        <w:jc w:val="both"/>
+      </w:pPr>
+      <w:r>
+        <w:rPr>
+          <w:rFonts w:ascii="宋体" w:cs="宋体" w:eastAsia="宋体" w:hAnsi="宋体"/>
+          <w:b w:val="false"/>
+          <w:bCs w:val="false"/>
+          <w:color w:val="000000"/>
+          <w:sz w:val="24"/>
+          <w:szCs w:val="24"/>
+        </w:rPr>
+        <w:t xml:space="preserve">测试过程中还修正了自动化用例中的固定日期。当前用例会根据运行当天生成预约取书时间和应还日期，既继续检查了日期校验，也不会因为几个月后再次运行而失败。测试结束后重新检查云端数据，确认临时账号和借阅记录均已清理。</w:t>
+      </w:r>
+    </w:p>
+    <w:p>
+      <w:pPr>
+        <w:pStyle w:val="Heading2"/>
+        <w:keepNext/>
+        <w:spacing w:after="120" w:before="220" w:line="360"/>
+      </w:pPr>
+      <w:bookmarkStart w:name="h2_9368ac88" w:id="44"/>
+      <w:r>
+        <w:rPr>
+          <w:rFonts w:ascii="黑体" w:cs="黑体" w:eastAsia="黑体" w:hAnsi="黑体"/>
+          <w:b/>
+          <w:bCs/>
+          <w:sz w:val="28"/>
+          <w:szCs w:val="28"/>
+        </w:rPr>
+        <w:t xml:space="preserve">4.4  不足与改进方向</w:t>
+      </w:r>
+      <w:bookmarkEnd w:id="44"/>
+    </w:p>
+    <w:p>
+      <w:pPr>
+        <w:keepNext w:val="false"/>
+        <w:spacing w:after="110" w:line="360"/>
+        <w:ind w:firstLine="480"/>
+        <w:jc w:val="both"/>
+      </w:pPr>
+      <w:r>
+        <w:rPr>
+          <w:rFonts w:ascii="宋体" w:cs="宋体" w:eastAsia="宋体" w:hAnsi="宋体"/>
+          <w:b w:val="false"/>
+          <w:bCs w:val="false"/>
+          <w:color w:val="000000"/>
+          <w:sz w:val="24"/>
+          <w:szCs w:val="24"/>
+        </w:rPr>
+        <w:t xml:space="preserve">当前系统没有接入学校统一身份认证、短信通知、逾期罚款和预约排队。对课程作业而言，这些功能不影响主流程演示，但投入真实使用后仍需补齐。尤其是预约到期未取书和逾期未归还，应由定时任务产生提醒并更新状态。</w:t>
+      </w:r>
+    </w:p>
+    <w:p>
+      <w:pPr>
+        <w:keepNext w:val="false"/>
+        <w:spacing w:after="110" w:line="360"/>
+        <w:ind w:firstLine="480"/>
+        <w:jc w:val="both"/>
+      </w:pPr>
+      <w:r>
+        <w:rPr>
+          <w:rFonts w:ascii="宋体" w:cs="宋体" w:eastAsia="宋体" w:hAnsi="宋体"/>
+          <w:b w:val="false"/>
+          <w:bCs w:val="false"/>
+          <w:color w:val="000000"/>
+          <w:sz w:val="24"/>
+          <w:szCs w:val="24"/>
+        </w:rPr>
+        <w:t xml:space="preserve">书目封面目前由馆员填写站内路径，没有提供文件上传。后续可以增加图片上传、尺寸校验和对象存储，让馆员直接维护封面。目录一次显示全部 87 条，数据量继续增长时应改为服务端分页，并为常用检索字段建立组合索引。</w:t>
+      </w:r>
+    </w:p>
+    <w:p>
+      <w:pPr>
+        <w:keepNext w:val="false"/>
+        <w:spacing w:after="110" w:line="360"/>
+        <w:ind w:firstLine="480"/>
+        <w:jc w:val="both"/>
+      </w:pPr>
+      <w:r>
+        <w:rPr>
+          <w:rFonts w:ascii="宋体" w:cs="宋体" w:eastAsia="宋体" w:hAnsi="宋体"/>
+          <w:b w:val="false"/>
+          <w:bCs w:val="false"/>
+          <w:color w:val="000000"/>
+          <w:sz w:val="24"/>
+          <w:szCs w:val="24"/>
+        </w:rPr>
+        <w:t xml:space="preserve">生产环境还需要补强安全与运维能力，包括 CSRF 防护、登录限流、操作审计、数据库备份和异常告警。当前部署已经限制数据库只在本机监听，公网只开放 Web 端口，但课程项目不应直接视为正式生产系统。</w:t>
+      </w:r>
+    </w:p>
+    <w:p>
+      <w:pPr>
+        <w:pStyle w:val="Heading2"/>
+        <w:keepNext/>
+        <w:spacing w:after="120" w:before="220" w:line="360"/>
+      </w:pPr>
+      <w:bookmarkStart w:name="h2_1048fd73" w:id="45"/>
+      <w:r>
+        <w:rPr>
+          <w:rFonts w:ascii="黑体" w:cs="黑体" w:eastAsia="黑体" w:hAnsi="黑体"/>
+          <w:b/>
+          <w:bCs/>
+          <w:sz w:val="28"/>
+          <w:szCs w:val="28"/>
+        </w:rPr>
+        <w:t xml:space="preserve">4.5  总结</w:t>
+      </w:r>
+      <w:bookmarkEnd w:id="45"/>
+    </w:p>
+    <w:p>
+      <w:pPr>
+        <w:keepNext w:val="false"/>
+        <w:spacing w:after="110" w:line="360"/>
+        <w:ind w:firstLine="480"/>
+        <w:jc w:val="both"/>
+      </w:pPr>
+      <w:r>
+        <w:rPr>
+          <w:rFonts w:ascii="宋体" w:cs="宋体" w:eastAsia="宋体" w:hAnsi="宋体"/>
+          <w:b w:val="false"/>
+          <w:bCs w:val="false"/>
+          <w:color w:val="000000"/>
+          <w:sz w:val="24"/>
+          <w:szCs w:val="24"/>
+        </w:rPr>
+        <w:t xml:space="preserve">本次作业完成了从需求分析、数据库设计、SSM 编码到云端部署和页面验收的完整流程。公开馆藏可以立即浏览，读者注册后可以预约，馆员可以确认取书并维护馆藏，归还后复本数量会恢复到数据库。页面截图和报告中的数据均来自实际运行结果。</w:t>
+      </w:r>
+    </w:p>
+    <w:p>
+      <w:pPr>
+        <w:keepNext w:val="false"/>
+        <w:spacing w:after="110" w:line="360"/>
+        <w:ind w:firstLine="480"/>
+        <w:jc w:val="both"/>
+      </w:pPr>
+      <w:r>
+        <w:rPr>
+          <w:rFonts w:ascii="宋体" w:cs="宋体" w:eastAsia="宋体" w:hAnsi="宋体"/>
+          <w:b w:val="false"/>
+          <w:bCs w:val="false"/>
+          <w:color w:val="000000"/>
+          <w:sz w:val="24"/>
+          <w:szCs w:val="24"/>
+        </w:rPr>
+        <w:t xml:space="preserve">这次实现让我认识到，课程项目是否完整，不在于页面数量，而在于一次业务操作能否在数据库里形成可追踪的闭环。后续若继续迭代，我会优先处理预约提醒、文件上传、分页和审计记录，再扩展其他辅助功能。</w:t>
       </w:r>
     </w:p>
     <w:sectPr>
@@ -10906,11 +12706,18 @@
       </w:rPr>
       <w:t xml:space="preserve">第 </w:t>
     </w:r>
-    <w:fldSimple w:instr="PAGE">
-      <w:r>
-        <w:t xml:space="preserve">2</w:t>
-      </w:r>
-    </w:fldSimple>
+    <w:r>
+      <w:fldChar w:fldCharType="begin"/>
+    </w:r>
+    <w:r>
+      <w:instrText xml:space="preserve">PAGE</w:instrText>
+    </w:r>
+    <w:r>
+      <w:fldChar w:fldCharType="separate"/>
+    </w:r>
+    <w:r>
+      <w:fldChar w:fldCharType="end"/>
+    </w:r>
     <w:r>
       <w:rPr>
         <w:rFonts w:ascii="宋体" w:cs="宋体" w:eastAsia="宋体" w:hAnsi="宋体"/>
@@ -10940,11 +12747,18 @@
       </w:rPr>
       <w:t xml:space="preserve">第 </w:t>
     </w:r>
-    <w:fldSimple w:instr="PAGE">
-      <w:r>
-        <w:t xml:space="preserve">1</w:t>
-      </w:r>
-    </w:fldSimple>
+    <w:r>
+      <w:fldChar w:fldCharType="begin"/>
+    </w:r>
+    <w:r>
+      <w:instrText xml:space="preserve">PAGE</w:instrText>
+    </w:r>
+    <w:r>
+      <w:fldChar w:fldCharType="separate"/>
+    </w:r>
+    <w:r>
+      <w:fldChar w:fldCharType="end"/>
+    </w:r>
     <w:r>
       <w:rPr>
         <w:rFonts w:ascii="宋体" w:cs="宋体" w:eastAsia="宋体" w:hAnsi="宋体"/>

</xml_diff>

<commit_message>
docs: revise report tone and page layout
</commit_message>
<xml_diff>
--- a/网站建设大作业-学号-姓名.docx
+++ b/网站建设大作业-学号-姓名.docx
@@ -455,7 +455,7 @@
           <w:sz w:val="22"/>
           <w:szCs w:val="22"/>
         </w:rPr>
-        <w:t xml:space="preserve">2026年11月1日</w:t>
+        <w:t xml:space="preserve">2026年10月31日</w:t>
       </w:r>
     </w:p>
     <w:p>
@@ -479,7 +479,7 @@
         <w:tabs>
           <w:tab w:val="right" w:pos="9026" w:leader="dot"/>
         </w:tabs>
-        <w:spacing w:after="45" w:line="320"/>
+        <w:spacing w:after="30" w:line="300"/>
         <w:ind w:left="0"/>
       </w:pPr>
       <w:r>
@@ -506,7 +506,7 @@
         <w:tabs>
           <w:tab w:val="right" w:pos="9026" w:leader="dot"/>
         </w:tabs>
-        <w:spacing w:after="45" w:line="320"/>
+        <w:spacing w:after="30" w:line="300"/>
         <w:ind w:left="360"/>
       </w:pPr>
       <w:r>
@@ -533,7 +533,7 @@
         <w:tabs>
           <w:tab w:val="right" w:pos="9026" w:leader="dot"/>
         </w:tabs>
-        <w:spacing w:after="45" w:line="320"/>
+        <w:spacing w:after="30" w:line="300"/>
         <w:ind w:left="360"/>
       </w:pPr>
       <w:r>
@@ -560,7 +560,7 @@
         <w:tabs>
           <w:tab w:val="right" w:pos="9026" w:leader="dot"/>
         </w:tabs>
-        <w:spacing w:after="45" w:line="320"/>
+        <w:spacing w:after="30" w:line="300"/>
         <w:ind w:left="360"/>
       </w:pPr>
       <w:r>
@@ -587,7 +587,7 @@
         <w:tabs>
           <w:tab w:val="right" w:pos="9026" w:leader="dot"/>
         </w:tabs>
-        <w:spacing w:after="45" w:line="320"/>
+        <w:spacing w:after="30" w:line="300"/>
         <w:ind w:left="360"/>
       </w:pPr>
       <w:r>
@@ -606,7 +606,7 @@
           <w:sz w:val="22"/>
           <w:szCs w:val="22"/>
         </w:rPr>
-        <w:t xml:space="preserve">	2</w:t>
+        <w:t xml:space="preserve">	3</w:t>
       </w:r>
     </w:p>
     <w:p>
@@ -614,7 +614,7 @@
         <w:tabs>
           <w:tab w:val="right" w:pos="9026" w:leader="dot"/>
         </w:tabs>
-        <w:spacing w:after="45" w:line="320"/>
+        <w:spacing w:after="30" w:line="300"/>
         <w:ind w:left="0"/>
       </w:pPr>
       <w:r>
@@ -633,7 +633,7 @@
           <w:sz w:val="24"/>
           <w:szCs w:val="24"/>
         </w:rPr>
-        <w:t xml:space="preserve">	4</w:t>
+        <w:t xml:space="preserve">	3</w:t>
       </w:r>
     </w:p>
     <w:p>
@@ -641,7 +641,7 @@
         <w:tabs>
           <w:tab w:val="right" w:pos="9026" w:leader="dot"/>
         </w:tabs>
-        <w:spacing w:after="45" w:line="320"/>
+        <w:spacing w:after="30" w:line="300"/>
         <w:ind w:left="360"/>
       </w:pPr>
       <w:r>
@@ -660,7 +660,7 @@
           <w:sz w:val="22"/>
           <w:szCs w:val="22"/>
         </w:rPr>
-        <w:t xml:space="preserve">	4</w:t>
+        <w:t xml:space="preserve">	3</w:t>
       </w:r>
     </w:p>
     <w:p>
@@ -668,7 +668,7 @@
         <w:tabs>
           <w:tab w:val="right" w:pos="9026" w:leader="dot"/>
         </w:tabs>
-        <w:spacing w:after="45" w:line="320"/>
+        <w:spacing w:after="30" w:line="300"/>
         <w:ind w:left="360"/>
       </w:pPr>
       <w:r>
@@ -695,7 +695,7 @@
         <w:tabs>
           <w:tab w:val="right" w:pos="9026" w:leader="dot"/>
         </w:tabs>
-        <w:spacing w:after="45" w:line="320"/>
+        <w:spacing w:after="30" w:line="300"/>
         <w:ind w:left="360"/>
       </w:pPr>
       <w:r>
@@ -714,7 +714,7 @@
           <w:sz w:val="22"/>
           <w:szCs w:val="22"/>
         </w:rPr>
-        <w:t xml:space="preserve">	7</w:t>
+        <w:t xml:space="preserve">	6</w:t>
       </w:r>
     </w:p>
     <w:p>
@@ -722,7 +722,7 @@
         <w:tabs>
           <w:tab w:val="right" w:pos="9026" w:leader="dot"/>
         </w:tabs>
-        <w:spacing w:after="45" w:line="320"/>
+        <w:spacing w:after="30" w:line="300"/>
         <w:ind w:left="360"/>
       </w:pPr>
       <w:r>
@@ -741,7 +741,7 @@
           <w:sz w:val="22"/>
           <w:szCs w:val="22"/>
         </w:rPr>
-        <w:t xml:space="preserve">	8</w:t>
+        <w:t xml:space="preserve">	7</w:t>
       </w:r>
     </w:p>
     <w:p>
@@ -749,7 +749,7 @@
         <w:tabs>
           <w:tab w:val="right" w:pos="9026" w:leader="dot"/>
         </w:tabs>
-        <w:spacing w:after="45" w:line="320"/>
+        <w:spacing w:after="30" w:line="300"/>
         <w:ind w:left="360"/>
       </w:pPr>
       <w:r>
@@ -768,7 +768,7 @@
           <w:sz w:val="22"/>
           <w:szCs w:val="22"/>
         </w:rPr>
-        <w:t xml:space="preserve">	9</w:t>
+        <w:t xml:space="preserve">	8</w:t>
       </w:r>
     </w:p>
     <w:p>
@@ -776,7 +776,7 @@
         <w:tabs>
           <w:tab w:val="right" w:pos="9026" w:leader="dot"/>
         </w:tabs>
-        <w:spacing w:after="45" w:line="320"/>
+        <w:spacing w:after="30" w:line="300"/>
         <w:ind w:left="360"/>
       </w:pPr>
       <w:r>
@@ -795,7 +795,7 @@
           <w:sz w:val="22"/>
           <w:szCs w:val="22"/>
         </w:rPr>
-        <w:t xml:space="preserve">	17</w:t>
+        <w:t xml:space="preserve">	16</w:t>
       </w:r>
     </w:p>
     <w:p>
@@ -803,7 +803,7 @@
         <w:tabs>
           <w:tab w:val="right" w:pos="9026" w:leader="dot"/>
         </w:tabs>
-        <w:spacing w:after="45" w:line="320"/>
+        <w:spacing w:after="30" w:line="300"/>
         <w:ind w:left="0"/>
       </w:pPr>
       <w:r>
@@ -822,7 +822,7 @@
           <w:sz w:val="24"/>
           <w:szCs w:val="24"/>
         </w:rPr>
-        <w:t xml:space="preserve">	20</w:t>
+        <w:t xml:space="preserve">	18</w:t>
       </w:r>
     </w:p>
     <w:p>
@@ -830,7 +830,7 @@
         <w:tabs>
           <w:tab w:val="right" w:pos="9026" w:leader="dot"/>
         </w:tabs>
-        <w:spacing w:after="45" w:line="320"/>
+        <w:spacing w:after="30" w:line="300"/>
         <w:ind w:left="360"/>
       </w:pPr>
       <w:r>
@@ -849,7 +849,7 @@
           <w:sz w:val="22"/>
           <w:szCs w:val="22"/>
         </w:rPr>
-        <w:t xml:space="preserve">	20</w:t>
+        <w:t xml:space="preserve">	18</w:t>
       </w:r>
     </w:p>
     <w:p>
@@ -857,7 +857,7 @@
         <w:tabs>
           <w:tab w:val="right" w:pos="9026" w:leader="dot"/>
         </w:tabs>
-        <w:spacing w:after="45" w:line="320"/>
+        <w:spacing w:after="30" w:line="300"/>
         <w:ind w:left="360"/>
       </w:pPr>
       <w:r>
@@ -876,7 +876,7 @@
           <w:sz w:val="22"/>
           <w:szCs w:val="22"/>
         </w:rPr>
-        <w:t xml:space="preserve">	21</w:t>
+        <w:t xml:space="preserve">	20</w:t>
       </w:r>
     </w:p>
     <w:p>
@@ -884,7 +884,7 @@
         <w:tabs>
           <w:tab w:val="right" w:pos="9026" w:leader="dot"/>
         </w:tabs>
-        <w:spacing w:after="45" w:line="320"/>
+        <w:spacing w:after="30" w:line="300"/>
         <w:ind w:left="360"/>
       </w:pPr>
       <w:r>
@@ -903,7 +903,7 @@
           <w:sz w:val="22"/>
           <w:szCs w:val="22"/>
         </w:rPr>
-        <w:t xml:space="preserve">	23</w:t>
+        <w:t xml:space="preserve">	21</w:t>
       </w:r>
     </w:p>
     <w:p>
@@ -911,7 +911,7 @@
         <w:tabs>
           <w:tab w:val="right" w:pos="9026" w:leader="dot"/>
         </w:tabs>
-        <w:spacing w:after="45" w:line="320"/>
+        <w:spacing w:after="30" w:line="300"/>
         <w:ind w:left="360"/>
       </w:pPr>
       <w:r>
@@ -930,7 +930,7 @@
           <w:sz w:val="22"/>
           <w:szCs w:val="22"/>
         </w:rPr>
-        <w:t xml:space="preserve">	26</w:t>
+        <w:t xml:space="preserve">	24</w:t>
       </w:r>
     </w:p>
     <w:p>
@@ -938,7 +938,7 @@
         <w:tabs>
           <w:tab w:val="right" w:pos="9026" w:leader="dot"/>
         </w:tabs>
-        <w:spacing w:after="45" w:line="320"/>
+        <w:spacing w:after="30" w:line="300"/>
         <w:ind w:left="360"/>
       </w:pPr>
       <w:r>
@@ -957,7 +957,7 @@
           <w:sz w:val="22"/>
           <w:szCs w:val="22"/>
         </w:rPr>
-        <w:t xml:space="preserve">	27</w:t>
+        <w:t xml:space="preserve">	25</w:t>
       </w:r>
     </w:p>
     <w:p>
@@ -965,7 +965,7 @@
         <w:tabs>
           <w:tab w:val="right" w:pos="9026" w:leader="dot"/>
         </w:tabs>
-        <w:spacing w:after="45" w:line="320"/>
+        <w:spacing w:after="30" w:line="300"/>
         <w:ind w:left="360"/>
       </w:pPr>
       <w:r>
@@ -984,7 +984,7 @@
           <w:sz w:val="22"/>
           <w:szCs w:val="22"/>
         </w:rPr>
-        <w:t xml:space="preserve">	28</w:t>
+        <w:t xml:space="preserve">	26</w:t>
       </w:r>
     </w:p>
     <w:p>
@@ -992,7 +992,7 @@
         <w:tabs>
           <w:tab w:val="right" w:pos="9026" w:leader="dot"/>
         </w:tabs>
-        <w:spacing w:after="45" w:line="320"/>
+        <w:spacing w:after="30" w:line="300"/>
         <w:ind w:left="360"/>
       </w:pPr>
       <w:r>
@@ -1011,7 +1011,7 @@
           <w:sz w:val="22"/>
           <w:szCs w:val="22"/>
         </w:rPr>
-        <w:t xml:space="preserve">	29</w:t>
+        <w:t xml:space="preserve">	27</w:t>
       </w:r>
     </w:p>
     <w:p>
@@ -1019,7 +1019,34 @@
         <w:tabs>
           <w:tab w:val="right" w:pos="9026" w:leader="dot"/>
         </w:tabs>
-        <w:spacing w:after="45" w:line="320"/>
+        <w:spacing w:after="30" w:line="300"/>
+        <w:ind w:left="360"/>
+      </w:pPr>
+      <w:r>
+        <w:rPr>
+          <w:rFonts w:ascii="宋体" w:cs="宋体" w:eastAsia="宋体" w:hAnsi="宋体"/>
+          <w:b w:val="false"/>
+          <w:bCs w:val="false"/>
+          <w:sz w:val="22"/>
+          <w:szCs w:val="22"/>
+        </w:rPr>
+        <w:t xml:space="preserve">3.8  页面验收中的问题记录</w:t>
+      </w:r>
+      <w:r>
+        <w:rPr>
+          <w:rFonts w:ascii="宋体" w:cs="宋体" w:eastAsia="宋体" w:hAnsi="宋体"/>
+          <w:sz w:val="22"/>
+          <w:szCs w:val="22"/>
+        </w:rPr>
+        <w:t xml:space="preserve">	28</w:t>
+      </w:r>
+    </w:p>
+    <w:p>
+      <w:pPr>
+        <w:tabs>
+          <w:tab w:val="right" w:pos="9026" w:leader="dot"/>
+        </w:tabs>
+        <w:spacing w:after="30" w:line="300"/>
         <w:ind w:left="0"/>
       </w:pPr>
       <w:r>
@@ -1038,7 +1065,7 @@
           <w:sz w:val="24"/>
           <w:szCs w:val="24"/>
         </w:rPr>
-        <w:t xml:space="preserve">	31</w:t>
+        <w:t xml:space="preserve">	29</w:t>
       </w:r>
     </w:p>
     <w:p>
@@ -1046,7 +1073,7 @@
         <w:tabs>
           <w:tab w:val="right" w:pos="9026" w:leader="dot"/>
         </w:tabs>
-        <w:spacing w:after="45" w:line="320"/>
+        <w:spacing w:after="30" w:line="300"/>
         <w:ind w:left="360"/>
       </w:pPr>
       <w:r>
@@ -1065,7 +1092,7 @@
           <w:sz w:val="22"/>
           <w:szCs w:val="22"/>
         </w:rPr>
-        <w:t xml:space="preserve">	31</w:t>
+        <w:t xml:space="preserve">	29</w:t>
       </w:r>
     </w:p>
     <w:p>
@@ -1073,7 +1100,7 @@
         <w:tabs>
           <w:tab w:val="right" w:pos="9026" w:leader="dot"/>
         </w:tabs>
-        <w:spacing w:after="45" w:line="320"/>
+        <w:spacing w:after="30" w:line="300"/>
         <w:ind w:left="360"/>
       </w:pPr>
       <w:r>
@@ -1092,7 +1119,7 @@
           <w:sz w:val="22"/>
           <w:szCs w:val="22"/>
         </w:rPr>
-        <w:t xml:space="preserve">	31</w:t>
+        <w:t xml:space="preserve">	29</w:t>
       </w:r>
     </w:p>
     <w:p>
@@ -1100,7 +1127,7 @@
         <w:tabs>
           <w:tab w:val="right" w:pos="9026" w:leader="dot"/>
         </w:tabs>
-        <w:spacing w:after="45" w:line="320"/>
+        <w:spacing w:after="30" w:line="300"/>
         <w:ind w:left="360"/>
       </w:pPr>
       <w:r>
@@ -1119,7 +1146,7 @@
           <w:sz w:val="22"/>
           <w:szCs w:val="22"/>
         </w:rPr>
-        <w:t xml:space="preserve">	32</w:t>
+        <w:t xml:space="preserve">	30</w:t>
       </w:r>
     </w:p>
     <w:p>
@@ -1127,7 +1154,7 @@
         <w:tabs>
           <w:tab w:val="right" w:pos="9026" w:leader="dot"/>
         </w:tabs>
-        <w:spacing w:after="45" w:line="320"/>
+        <w:spacing w:after="30" w:line="300"/>
         <w:ind w:left="360"/>
       </w:pPr>
       <w:r>
@@ -1146,7 +1173,7 @@
           <w:sz w:val="22"/>
           <w:szCs w:val="22"/>
         </w:rPr>
-        <w:t xml:space="preserve">	33</w:t>
+        <w:t xml:space="preserve">	31</w:t>
       </w:r>
     </w:p>
     <w:p>
@@ -1154,7 +1181,7 @@
         <w:tabs>
           <w:tab w:val="right" w:pos="9026" w:leader="dot"/>
         </w:tabs>
-        <w:spacing w:after="45" w:line="320"/>
+        <w:spacing w:after="30" w:line="300"/>
         <w:ind w:left="360"/>
       </w:pPr>
       <w:r>
@@ -1173,7 +1200,7 @@
           <w:sz w:val="22"/>
           <w:szCs w:val="22"/>
         </w:rPr>
-        <w:t xml:space="preserve">	33</w:t>
+        <w:t xml:space="preserve">	31</w:t>
       </w:r>
     </w:p>
     <w:p>
@@ -1181,7 +1208,7 @@
         <w:tabs>
           <w:tab w:val="right" w:pos="9026" w:leader="dot"/>
         </w:tabs>
-        <w:spacing w:after="45" w:line="320"/>
+        <w:spacing w:after="30" w:line="300"/>
         <w:ind w:left="360"/>
       </w:pPr>
       <w:r>
@@ -1200,7 +1227,7 @@
           <w:sz w:val="22"/>
           <w:szCs w:val="22"/>
         </w:rPr>
-        <w:t xml:space="preserve">	34</w:t>
+        <w:t xml:space="preserve">	32</w:t>
       </w:r>
     </w:p>
     <w:p>
@@ -1208,7 +1235,34 @@
         <w:tabs>
           <w:tab w:val="right" w:pos="9026" w:leader="dot"/>
         </w:tabs>
-        <w:spacing w:after="45" w:line="320"/>
+        <w:spacing w:after="30" w:line="300"/>
+        <w:ind w:left="360"/>
+      </w:pPr>
+      <w:r>
+        <w:rPr>
+          <w:rFonts w:ascii="宋体" w:cs="宋体" w:eastAsia="宋体" w:hAnsi="宋体"/>
+          <w:b w:val="false"/>
+          <w:bCs w:val="false"/>
+          <w:sz w:val="22"/>
+          <w:szCs w:val="22"/>
+        </w:rPr>
+        <w:t xml:space="preserve">4.7  总结</w:t>
+      </w:r>
+      <w:r>
+        <w:rPr>
+          <w:rFonts w:ascii="宋体" w:cs="宋体" w:eastAsia="宋体" w:hAnsi="宋体"/>
+          <w:sz w:val="22"/>
+          <w:szCs w:val="22"/>
+        </w:rPr>
+        <w:t xml:space="preserve">	32</w:t>
+      </w:r>
+    </w:p>
+    <w:p>
+      <w:pPr>
+        <w:tabs>
+          <w:tab w:val="right" w:pos="9026" w:leader="dot"/>
+        </w:tabs>
+        <w:spacing w:after="30" w:line="300"/>
         <w:ind w:left="360"/>
         <w:sectPr>
           <w:headerReference w:type="default" r:id="rId6"/>
@@ -1227,7 +1281,7 @@
           <w:sz w:val="22"/>
           <w:szCs w:val="22"/>
         </w:rPr>
-        <w:t xml:space="preserve">4.7  总结</w:t>
+        <w:t xml:space="preserve">4.8  课程设计体会</w:t>
       </w:r>
       <w:r>
         <w:rPr>
@@ -1235,14 +1289,14 @@
           <w:sz w:val="22"/>
           <w:szCs w:val="22"/>
         </w:rPr>
-        <w:t xml:space="preserve">	34</w:t>
+        <w:t xml:space="preserve">	33</w:t>
       </w:r>
     </w:p>
     <w:p>
       <w:pPr>
         <w:pStyle w:val="Heading1"/>
         <w:keepNext/>
-        <w:spacing w:after="240" w:before="0" w:line="360"/>
+        <w:spacing w:after="240" w:before="320" w:line="360"/>
       </w:pPr>
       <w:bookmarkStart w:name="h1_5e40c6e2" w:id="1"/>
       <w:r>
@@ -1292,7 +1346,7 @@
           <w:sz w:val="24"/>
           <w:szCs w:val="24"/>
         </w:rPr>
-        <w:t xml:space="preserve">我开始选题时先排除了单纯的商品展示和留言板。这类页面容易做得完整，却很难把一次业务操作从头走到尾。图书馆的借书流程比较适合作为 SSM 大作业：馆藏要能检索，读者要能预约，馆员要确认取书，归还时还要把册数加回去。每个动作都能落到数据库，也能在页面上看见结果。</w:t>
+        <w:t xml:space="preserve">刚开始选题时，我先排除了商品展示和留言板。这类页面做起来不难，但多数时候只是把数据列出来，很难把一次业务操作从头走到尾。后来我想起平时去图书馆找书、预约和还书的经历，觉得这个题目比较适合做 SSM 大作业。馆藏要能检索，读者要能预约，馆员要确认取书，归还时还要把册数加回去，每一步都能在数据库中留下记录。</w:t>
       </w:r>
     </w:p>
     <w:p>
@@ -1311,7 +1365,7 @@
           <w:sz w:val="24"/>
           <w:szCs w:val="24"/>
         </w:rPr>
-        <w:t xml:space="preserve">现实中的图书检索并不只看书名。学生经常记得作者、课程名称或索书号，却记不住完整题名。同一个题名还会对应多个版本，所以系统除了书名，还保留作者、ISBN、出版社、出版年份、分类、语种和馆藏地。检索页将这些字段放在同一条书目记录里，减少反复打开详情页的时间。</w:t>
+        <w:t xml:space="preserve">真正开始整理书目后，我发现只按书名查找并不够用。同学往往记得作者、课程名称或者索书号，却记不住完整题名，同一个书名还可能对应不同版本。因此我在图书表里保留了作者、ISBN、出版社、出版年份、分类、语种和馆藏地。这样在目录页看到的信息比较完整，不用为了确认一个版本来回点击详情页。</w:t>
       </w:r>
     </w:p>
     <w:p>
@@ -1330,7 +1384,7 @@
           <w:sz w:val="24"/>
           <w:szCs w:val="24"/>
         </w:rPr>
-        <w:t xml:space="preserve">本次作业做成一个公开可访问的网站，名称为“大工云图书馆”。页面没有设置演示账号，也不预置登录信息。第一次注册的账号会用来初始化馆员权限，之后注册的账号按读者处理。这样交付后可以直接注册、登录并实际使用，不用依赖开发者留下的临时账号。</w:t>
+        <w:t xml:space="preserve">网站名称定为“大工云图书馆”，并部署到公开地址。我没有另外准备演示账号，第一次注册的账号会作为馆员，后面的账号按普通读者处理。这样老师打开网址后可以直接注册和登录，不会出现报告里写着能登录、实际却只能用开发者账号的情况。</w:t>
       </w:r>
     </w:p>
     <w:p>
@@ -1368,7 +1422,7 @@
           <w:sz w:val="24"/>
           <w:szCs w:val="24"/>
         </w:rPr>
-        <w:t xml:space="preserve">系统面向校内读者和图书馆馆员。读者可以检索馆藏、查看复本数量、预约取书、查看借阅期限并办理归还；馆员可以查看全部借阅记录、确认读者到馆取书、入藏新书、修改书目以及删除不再保留的记录。公开目录不需要登录，借阅和管理操作需要身份验证。</w:t>
+        <w:t xml:space="preserve">我给自己定下的目标并不复杂：读者能查书，能看见还有没有复本，登录后可以预约和归还；馆员能看到全部借阅单，确认读者取书，也能录入、修改和删除书目。考虑到找书时不应该先要求登录，公开目录一直开放，只有进入借阅和管理页面才检查账号。</w:t>
       </w:r>
     </w:p>
     <w:p>
@@ -1387,7 +1441,7 @@
           <w:sz w:val="24"/>
           <w:szCs w:val="24"/>
         </w:rPr>
-        <w:t xml:space="preserve">这一版没有接入学校统一身份认证，也没有接入真实支付或短信服务。账号由网站在注册页创建，联系方式由读者填写。这样仍然是实际可运行的注册和登录，而不是只放两个写死的测试账号。数据库中的密码保存为 BCrypt 哈希，登录时由后端比对，不保存明文。</w:t>
+        <w:t xml:space="preserve">学校统一认证和短信服务没有接入，账号直接在网站的注册页创建。密码没有按原文写进数据库，而是在注册时用 BCrypt 生成哈希，登录时再比对。对我来说，这一步也是第一次把“能登录”和“密码不要明文保存”放到同一个作业里处理。</w:t>
       </w:r>
     </w:p>
     <w:p>
@@ -1406,7 +1460,7 @@
           <w:sz w:val="24"/>
           <w:szCs w:val="24"/>
         </w:rPr>
-        <w:t xml:space="preserve">图书馆业务里常见的逾期罚款、预约排队、条码扫描和设备借还暂未实现。课程作业把重点放在“书目检索—预约—取书—归还—馆藏数量同步”这条主链上。相关限制在页面和代码中都做了明确处理，避免出现库存变成负数或同一位读者重复占用同一本书。</w:t>
+        <w:t xml:space="preserve">逾期罚款、预约排队和条码扫描暂时没有做。时间有限，我把主要精力放在检索、预约、取书、归还和馆藏数量同步上。为了让流程能一直走通，我在页面和代码里都加了限制，尽量不让库存变成负数，也不让同一位读者重复预约同一本书。</w:t>
       </w:r>
     </w:p>
     <w:p>
@@ -1444,7 +1498,7 @@
           <w:sz w:val="24"/>
           <w:szCs w:val="24"/>
         </w:rPr>
-        <w:t xml:space="preserve">项目使用 Java 17 编译，由 Spring Boot 3.2.5 启动。Spring 管理对象和事务，Spring MVC 接收浏览器请求，MyBatis 负责 Java 对象与 SQL 之间的映射。Thymeleaf 在服务端生成 HTML，页面只保留少量 JavaScript，用于菜单、确认框和封面预览。</w:t>
+        <w:t xml:space="preserve">开发环境使用 Java 17，项目由 Spring Boot 3.2.5 启动。Spring 管理对象和事务，Spring MVC 接收浏览器请求，MyBatis 负责对象和 SQL 的映射，Thymeleaf 负责生成页面。前端没有单独做一套框架，只写了少量 JavaScript 处理菜单、确认框和封面预览。这样代码看起来比较传统，但对课程作业来说更容易检查。</w:t>
       </w:r>
     </w:p>
     <w:p>
@@ -2277,7 +2331,7 @@
           <w:sz w:val="24"/>
           <w:szCs w:val="24"/>
         </w:rPr>
-        <w:t xml:space="preserve">本地运行时数据库放在内存里，应用重启后恢复到初始化馆藏，适合反复测试。云端启用 cloud 配置，连接 MySQL 并读取环境变量中的数据库地址、用户名和密码。页面和业务代码不需要因为数据库切换而改动。公开访问地址为：</w:t>
+        <w:t xml:space="preserve">本地调试时使用 H2 内存数据库，应用重新启动后会恢复初始化馆藏，改坏数据也不影响云端。部署时启用 cloud 配置，连接 MySQL，数据库地址和账号从环境变量读取。页面代码不用因为数据库切换而重写。公开访问地址为：</w:t>
       </w:r>
     </w:p>
     <w:p>
@@ -2333,7 +2387,7 @@
           <w:sz w:val="24"/>
           <w:szCs w:val="24"/>
         </w:rPr>
-        <w:t xml:space="preserve">报告内容按任务书中的需求分析、网站设计、数据库设计、功能实现、站点部署和开发总结组织。为保证每项要求都能找到对应结果，下面把主要任务与系统中的实际实现位置、交付证据列在一起，避免只写设计文字而没有可运行的页面。</w:t>
+        <w:t xml:space="preserve">写报告前我又对着任务书看了一遍，把需求分析、网站设计、数据库、功能实现、部署和总结分成四章。为了避免正文写了很多、系统里却找不到对应内容，我把主要要求和实际页面整理在表1-2中。表里的章节号和页面都能在后面的正文中找到。</w:t>
       </w:r>
     </w:p>
     <w:p>
@@ -3166,7 +3220,7 @@
           <w:sz w:val="24"/>
           <w:szCs w:val="24"/>
         </w:rPr>
-        <w:t xml:space="preserve">任务书没有要求接入真实支付，也没有要求学校统一认证。因此系统把可验证的重点放在账号创建、馆藏检索、预约取书、归还和复本同步上。所有页面都能从公开地址进入，课程报告中展示的统计数字也直接来自云端数据库。</w:t>
+        <w:t xml:space="preserve">作业没有要求支付，也不强制接学校认证，所以我没有为了显得功能多而硬加这些模块。能实际检查的部分主要是账号创建、馆藏检索、预约取书、归还和复本数量变化。下面的截图和统计都来自公开地址上的运行结果。</w:t>
       </w:r>
     </w:p>
     <w:p>
@@ -3185,15 +3239,14 @@
           <w:sz w:val="24"/>
           <w:szCs w:val="24"/>
         </w:rPr>
-        <w:t xml:space="preserve">报告中的图片采用实际运行截图，代码说明来自项目源文件。页面中的数据、馆藏数量和借阅状态不使用单独制作的展示数据，避免出现报告与线上系统不一致的情况。</w:t>
+        <w:t xml:space="preserve">报告里的图片是实际运行时截的，代码也从项目源文件中复制。书目的封面、数量和借阅状态没有另外做一套展示数据，以免报告内容和线上页面对不上。</w:t>
       </w:r>
     </w:p>
     <w:p>
       <w:pPr>
         <w:pStyle w:val="Heading1"/>
         <w:keepNext/>
-        <w:pageBreakBefore/>
-        <w:spacing w:after="240" w:before="0" w:line="360"/>
+        <w:spacing w:after="240" w:before="320" w:line="360"/>
       </w:pPr>
       <w:bookmarkStart w:name="h1_1be00181" w:id="6"/>
       <w:r>
@@ -3262,7 +3315,7 @@
           <w:sz w:val="24"/>
           <w:szCs w:val="24"/>
         </w:rPr>
-        <w:t xml:space="preserve">系统分为未登录访客、读者和馆员三类使用者。访客可以浏览目录和详情。读者登录后进入借阅页，选择取书地点、预约时间、应还日期、联系方式并提交。借阅单初始状态为“待取书”，此时对应复本会从可借数量中扣减。馆员核对到馆信息后点击“确认取书”，状态变为“借阅中”；读者归还后状态变为“已归还”，可借数量恢复。</w:t>
+        <w:t xml:space="preserve">在动手写页面前，我先把借书过程在纸上走了一遍。未登录的人可以查目录、看详情；读者登录后填写取书地点、预约时间、应还日期和联系方式，提交后生成一张“待取书”的借阅单。此时可借数量先减一，馆员确认读者到馆取书后改成“借阅中”，归还后再改成“已归还”并加回一册。</w:t>
       </w:r>
     </w:p>
     <w:p>
@@ -3281,7 +3334,7 @@
           <w:sz w:val="24"/>
           <w:szCs w:val="24"/>
         </w:rPr>
-        <w:t xml:space="preserve">馆员同时负责书目维护。新书入藏时填写 ISBN、书名、作者、出版社、分类、索书号、馆藏地和复本数。修改馆藏册数时，系统先计算当前借出的册数，再把可借册数设置为“总册数减借出册数”，因此不会把已经借出的册数误改成可借。仍有未结束借阅时，删除操作会被拒绝。</w:t>
+        <w:t xml:space="preserve">馆员还要负责书目维护。新书入藏需要填写 ISBN、书名、作者、出版社、分类、索书号和复本数。修改总册数时不能直接把可借数一起覆盖，否则正在借出的书会被当成可借。我让程序先算出借出数量，再用新总册数减去它。只要还有未结束的借阅，就不允许删除这本书。</w:t>
       </w:r>
     </w:p>
     <w:p>
@@ -3300,7 +3353,7 @@
           <w:sz w:val="24"/>
           <w:szCs w:val="24"/>
         </w:rPr>
-        <w:t xml:space="preserve">公开目录不做登录限制，是考虑到找书阶段不应该先要求账号。只有点击预约、查看借阅记录或进入馆员页面时才触发拦截。这样既保留了公开检索的便利，也能保证借阅记录只对本人和馆员开放。</w:t>
+        <w:t xml:space="preserve">公开目录没有加登录限制，因为找书时先让人注册会影响使用。只有点击预约、查看借阅记录或者进入馆员页面时才触发拦截。这样查书目比较方便，借阅记录也只给本人和馆员看。</w:t>
       </w:r>
     </w:p>
     <w:p>
@@ -4343,7 +4396,7 @@
           <w:sz w:val="24"/>
           <w:szCs w:val="24"/>
         </w:rPr>
-        <w:t xml:space="preserve">页面首先保证可读。桌面端以馆藏列表为主，左侧分类和上方检索条件保持固定位置；移动端改为单列显示，统计区和分类栏可以横向滚动。图片使用本地封面文件，避免第三方图片地址失效。文字和背景保持足够对比，按钮和输入框具有明确的悬停与聚焦状态。</w:t>
+        <w:t xml:space="preserve">页面方面，我先保证能看清和能操作。桌面端以书目列表为主，分类放在左侧，检索条件放在上方；手机端改成单列，统计区和分类栏可以横向滑动。封面使用本地图片，免得外链失效。按钮和输入框都做了悬停、聚焦状态，点下去能看出页面有没有响应。</w:t>
       </w:r>
     </w:p>
     <w:p>
@@ -4362,7 +4415,7 @@
           <w:sz w:val="24"/>
           <w:szCs w:val="24"/>
         </w:rPr>
-        <w:t xml:space="preserve">数据一致性比页面动画重要。预约借阅和归还都放在事务中执行，扣减可借册数的 SQL 同时要求“状态在馆且可借数大于零”，只有影响一行的更新才算成功。这样即使两个请求几乎同时到达，也不会把同一册书重复分配。</w:t>
+        <w:t xml:space="preserve">刚开始我更关注页面效果，后来测试时发现数据对不上比动画不好看严重得多。预约和归还都放进事务，扣减可借数量时同时检查图书状态和剩余册数。只有更新成功一行才继续写借阅单，避免两个请求同时拿到最后一本书。</w:t>
       </w:r>
     </w:p>
     <w:p>
@@ -4419,7 +4472,7 @@
           <w:sz w:val="24"/>
           <w:szCs w:val="24"/>
         </w:rPr>
-        <w:t xml:space="preserve">系统采用 Controller、Service、Mapper 三层。Controller 负责接收参数、读取会话和选择页面；Service 负责业务判断与事务；Mapper 接口和 XML 负责 SQL。Model 保存用户、图书和借阅记录，Thymeleaf 模板只读取控制器放进 Model 的数据。</w:t>
+        <w:t xml:space="preserve">系统按 Controller、Service、Mapper 三层来写。Controller 接收参数、读取会话并决定返回哪个页面；Service 写业务判断和事务；Mapper 接口和 XML 负责 SQL。一开始我把不少判断写在 Controller 里，后来发现借阅和馆藏都要复用，便慢慢挪到了 Service 中。</w:t>
       </w:r>
     </w:p>
     <w:p>
@@ -5827,7 +5880,7 @@
           <w:sz w:val="24"/>
           <w:szCs w:val="24"/>
         </w:rPr>
-        <w:t xml:space="preserve">登录成功和业务操作完成后统一跳转到服务端相对地址。云端配置启用了 forward-headers-strategy，代理终止 HTTPS 后，应用仍按公开域名生成跳转，不会把浏览器送回 localhost。</w:t>
+        <w:t xml:space="preserve">登录和业务操作完成后都跳回站内相对地址。云端前面有一层代理，最开始登录后偶尔会跳回 localhost，后来启用 forward-headers-strategy 并改用相对重定向，公开地址下的跳转才稳定下来。</w:t>
       </w:r>
     </w:p>
     <w:p>
@@ -5865,7 +5918,7 @@
           <w:sz w:val="24"/>
           <w:szCs w:val="24"/>
         </w:rPr>
-        <w:t xml:space="preserve">以读者提交预约为例，浏览器先向 LoanController 发送 POST 请求，控制器从 session 中读取当前用户和表单参数，再把业务处理交给 LoanService。Service 先检查预约时间、应还日期和重复借阅，随后调用 BookMapper 扣减可借数量，再写入借阅单。只要数量更新或记录插入任意一步失败，事务都会回滚。</w:t>
+        <w:t xml:space="preserve">拿预约来说，浏览器先把表单提交到 LoanController，控制器从 session 里取当前用户，再把参数交给 LoanService。Service 检查预约时间、应还日期和重复记录，然后扣减可借数量并插入借阅单。中间任何一步出错，前面的更新都会回滚，不会只改了一半。</w:t>
       </w:r>
     </w:p>
     <w:p>
@@ -5884,7 +5937,7 @@
           <w:sz w:val="24"/>
           <w:szCs w:val="24"/>
         </w:rPr>
-        <w:t xml:space="preserve">查询请求的路径更短。BookController 接收关键词、分类和状态，BookService 清理空参数后调用 BookMapper 的动态 SQL，结果和馆藏统计一起放入 Model，最后由 Thymeleaf 生成目录页。页面不直接保存借阅状态，刷新后仍以数据库中的记录为准。</w:t>
+        <w:t xml:space="preserve">查询请求比借阅简单一些。BookController 接收关键词、分类和状态，BookService 把空参数清掉后调用动态 SQL，查询结果和统计数字一起放进 Model。页面刷新时重新读取数据库，不把借阅状态存在浏览器里。</w:t>
       </w:r>
     </w:p>
     <w:p>
@@ -5941,7 +5994,7 @@
           <w:sz w:val="24"/>
           <w:szCs w:val="24"/>
         </w:rPr>
-        <w:t xml:space="preserve">MySQL 数据库包含 users、books 和 loans 三张表。users 保存账号和角色；books 保存书目与复本数量；loans 保存借阅过程。借阅表保留书名、封面和索书号快照，即使之后修改图书信息，旧借阅单仍能显示借阅时的内容。</w:t>
+        <w:t xml:space="preserve">数据库最后保留了三张表：users 保存账号和角色，books 保存书目和复本数量，loans 保存借阅过程。借阅表另外存了书名、封面和索书号快照。这样即使馆员后来改了书名，旧借阅单仍能看出当时借的是哪一本。</w:t>
       </w:r>
     </w:p>
     <w:p>
@@ -6363,7 +6416,7 @@
           <w:sz w:val="24"/>
           <w:szCs w:val="24"/>
         </w:rPr>
-        <w:t xml:space="preserve">公开目录上方显示书目种数、可借书目、馆藏总册数和当前借阅数。统计查询直接读取 books 与 loans 表，不使用页面写死的数字。当前初始化馆藏为 87 种、403 册，覆盖计算机、人工智能、电子商务、数学、文学、历史、经济管理、外语、自然科学和社会科学。</w:t>
+        <w:t xml:space="preserve">目录页上方显示书目种数、可借书目、馆藏总册数和当前借阅数，这些数字都由 books 和 loans 表实时统计。初始化数据放了 87 种、403 册，除了计算机和课程教材，也加了文学、历史、经济管理、外语和社会科学类书目。</w:t>
       </w:r>
     </w:p>
     <w:p>
@@ -6382,7 +6435,7 @@
           <w:sz w:val="24"/>
           <w:szCs w:val="24"/>
         </w:rPr>
-        <w:t xml:space="preserve">书目中既有《红楼梦》《平凡的世界》《百年孤独》等中外名著，也放入高等数学、大学物理、数据库系统、操作系统等课程教材。人工智能方向包括《Artificial Intelligence: A Modern Approach》、统计学习、深度学习、强化学习和机器学习系统设计；电子商务方向包括数字商务管理、电子商务案例、平台经济与网络传播类读物。所有书目均使用独立封面文件。</w:t>
+        <w:t xml:space="preserve">名著部分选了《红楼梦》《平凡的世界》《百年孤独》，课程书有高等数学、大学物理、数据库系统和操作系统。人工智能分类放了《Artificial Intelligence: A Modern Approach》、统计学习、深度学习和强化学习，电子商务分类放了数字商务、案例分析、平台经济和网络营销。整理这些数据花的时间比预想多，主要是 ISBN 和封面要逐本核对。</w:t>
       </w:r>
     </w:p>
     <w:p>
@@ -6420,7 +6473,7 @@
           <w:sz w:val="24"/>
           <w:szCs w:val="24"/>
         </w:rPr>
-        <w:t xml:space="preserve">借阅表保存业务状态，书目表保存实时复本数量，两者必须同步变化。预约时先扣减可借数量，再插入借阅单；取消或归还时先更新借阅状态，再恢复一册。更新可借数量的 SQL 带有 available_copies &gt; 0 条件，更新行数不为 1 就停止后续操作。这样即使两个请求同时到达，也不会把同一册书重复分配。</w:t>
+        <w:t xml:space="preserve">一开始我用的是“先查询剩余数量，再在 Java 里减一”的写法，测试时发现两个请求同时到达就会出问题。后来把判断和减法都写进一条 SQL，只有 available_copies &gt; 0 时才更新。受影响行数不是 1 就停止，后面的借阅单也不会写入。</w:t>
       </w:r>
     </w:p>
     <w:p>
@@ -6439,7 +6492,7 @@
           <w:sz w:val="24"/>
           <w:szCs w:val="24"/>
         </w:rPr>
-        <w:t xml:space="preserve">权限检查分为两层：拦截器负责把未登录请求转到登录页，Controller 在写入馆藏或确认取书前再次核对 session 中的角色。数据库中的 username 与 ISBN 唯一约束作为最后一道检查，防止重复账号和重复书目进入系统。</w:t>
+        <w:t xml:space="preserve">权限检查放在两层。拦截器先把未登录请求转到登录页，Controller 在写入馆藏或确认取书前再检查一次角色。数据库里的用户名和 ISBN 唯一约束算最后一道保险，重复账号和重复书目即使绕过页面提交，也不会真正插入。</w:t>
       </w:r>
     </w:p>
     <w:p>
@@ -7726,7 +7779,7 @@
           <w:sz w:val="24"/>
           <w:szCs w:val="24"/>
         </w:rPr>
-        <w:t xml:space="preserve">下面按一次请求经过的顺序选取关键代码。每段只展示与本节功能直接相关的部分，完整实现仍在项目源码中。代码后的说明分别交代输入、主要判断、数据库动作和异常处理。</w:t>
+        <w:t xml:space="preserve">这一节放的代码不是把全部源码贴一遍，而是按实际处理顺序挑出关键部分。每个小节的格式和参考文档差不多，先放实现代码，再说明这段代码负责什么。比较长的页面和样式没有重复粘贴，避免报告变成代码清单。</w:t>
       </w:r>
     </w:p>
     <w:p>
@@ -8015,7 +8068,7 @@
           <w:sz w:val="24"/>
           <w:szCs w:val="24"/>
         </w:rPr>
-        <w:t xml:space="preserve">pom.xml 固定 Java 17，引入 Spring Web、Thymeleaf、Validation、MyBatis、BCrypt 加密组件、H2 和 MySQL 驱动。版本集中写在 properties 中，避免依赖散落在多个位置。</w:t>
+        <w:t xml:space="preserve">pom.xml 里先固定 Java 17，再引入 Spring Web、Thymeleaf、Validation、MyBatis、BCrypt 组件、H2 和 MySQL 驱动。我最初把版本号直接写在每个 dependency 里，后来统一放到 properties，改版本时比较省事。</w:t>
       </w:r>
     </w:p>
     <w:p>
@@ -8034,7 +8087,7 @@
           <w:sz w:val="24"/>
           <w:szCs w:val="24"/>
         </w:rPr>
-        <w:t xml:space="preserve">spring-security-crypto 只提供密码哈希，不改变现有 Spring MVC 路由方式；因此项目仍然是显式的 Controller、Service 和 Mapper，不会因为引入安全组件而变成另一套框架结构。</w:t>
+        <w:t xml:space="preserve">这里只使用 spring-security-crypto 做密码哈希，没有把整个登录流程换成 Spring Security。这样路由和页面仍按课上学过的 MVC 方式写，排错时也比较容易找到位置。</w:t>
       </w:r>
     </w:p>
     <w:p>
@@ -8263,7 +8316,7 @@
           <w:sz w:val="24"/>
           <w:szCs w:val="24"/>
         </w:rPr>
-        <w:t xml:space="preserve">拦截器只保护借阅和馆员地址，公开目录与图书详情保持可访问。用户未登录就点击预约时，请求会先转到登录页；登录后可以继续原来的操作。</w:t>
+        <w:t xml:space="preserve">拦截器只拦借阅和馆员地址，目录和详情仍然公开。读者没登录就点预约时，会先被带到登录页，登录后再回到原页面。</w:t>
       </w:r>
     </w:p>
     <w:p>
@@ -8282,7 +8335,7 @@
           <w:sz w:val="24"/>
           <w:szCs w:val="24"/>
         </w:rPr>
-        <w:t xml:space="preserve">馆员权限没有完全交给拦截器。LibrarianController 和 LoanController 在真正写入数据前再次检查 session 中的角色，这样即使地址被手工拼接，也不能靠普通读者身份修改馆藏。</w:t>
+        <w:t xml:space="preserve">馆员权限没有只靠这一层。LibrarianController 和 LoanController 在真正写入前又检查一次 session，防止普通读者手工拼地址进入管理操作。</w:t>
       </w:r>
     </w:p>
     <w:p>
@@ -8676,7 +8729,7 @@
           <w:sz w:val="24"/>
           <w:szCs w:val="24"/>
         </w:rPr>
-        <w:t xml:space="preserve">注册时先检查用户名是否重复，再根据 users 表当前记录数决定角色。首位账号获得 LIBRARIAN，之后的账号为 READER。密码先经过 BCrypt 编码再写入数据库，登录时使用 matches 比较，业务层不会读取或返回密码哈希。</w:t>
+        <w:t xml:space="preserve">注册时先查用户名有没有被占用，再看 users 表里是否已经有记录。第一个账号成为 LIBRARIAN，后面的都是 READER。密码编码后再保存，登录时用 matches 比对，不需要把原密码取出来。</w:t>
       </w:r>
     </w:p>
     <w:p>
@@ -8695,7 +8748,7 @@
           <w:sz w:val="24"/>
           <w:szCs w:val="24"/>
         </w:rPr>
-        <w:t xml:space="preserve">认证成功后会清空会话用户对象里的密码字段，再交给页面使用。同步方法和事务用于避免首次部署时两个注册请求同时判断为空表，造成多个初始馆员。</w:t>
+        <w:t xml:space="preserve">认证成功后会把密码字段清空，再放进 session。最初没有加同步和事务，连续提交两次注册时可能产生两个馆员，后来才补上。</w:t>
       </w:r>
     </w:p>
     <w:p>
@@ -9119,7 +9172,7 @@
           <w:sz w:val="24"/>
           <w:szCs w:val="24"/>
         </w:rPr>
-        <w:t xml:space="preserve">BookService 在调用 Mapper 前把空白关键词、分类和状态转成 null，因此 SQL 的 if 条件只在用户真正填写条件时才出现。关键词同时匹配题名、作者、ISBN 和索书号，分类和可借状态可以叠加。</w:t>
+        <w:t xml:space="preserve">BookService 会先把空字符串转成 null，所以动态 SQL 只在用户真的填了条件时才加 where 片段。关键词同时查题名、作者、ISBN 和索书号，分类与可借状态可以一起使用。</w:t>
       </w:r>
     </w:p>
     <w:p>
@@ -9138,7 +9191,7 @@
           <w:sz w:val="24"/>
           <w:szCs w:val="24"/>
         </w:rPr>
-        <w:t xml:space="preserve">查询只列出状态为“在馆”的书目，并按入藏时间倒序排列。结果条数、总数和可借书目数使用独立的聚合查询，不把统计数字写进模板。</w:t>
+        <w:t xml:space="preserve">目录只取状态为“在馆”的书，并且按入藏时间倒序排列。统计数字另外查，不写在 HTML 里。这样新增一本书后，页面数字会跟着变。</w:t>
       </w:r>
     </w:p>
     <w:p>
@@ -9487,7 +9540,7 @@
           <w:sz w:val="24"/>
           <w:szCs w:val="24"/>
         </w:rPr>
-        <w:t xml:space="preserve">借阅方法先校验预约时间和应还日期，再查同一读者是否已有该书未结束的记录。真正扣减由 BookMapper.decrementAvailable 完成，SQL 中包含 available_copies &gt; 0 条件；更新行数不是 1 就抛出异常。</w:t>
+        <w:t xml:space="preserve">borrow 方法先检查时间和重复借阅，再调用 BookMapper 扣减数量。扣减 SQL 自己带 available_copies &gt; 0，返回不是 1 就直接报错。</w:t>
       </w:r>
     </w:p>
     <w:p>
@@ -9506,7 +9559,7 @@
           <w:sz w:val="24"/>
           <w:szCs w:val="24"/>
         </w:rPr>
-        <w:t xml:space="preserve">扣减和借阅单插入处于同一事务。只要其中一步失败，前面的数量变化会一起回滚，不会出现“书少了一册但没有任何借阅记录”的情况。</w:t>
+        <w:t xml:space="preserve">扣减和插入借阅单在同一个事务里。测试时故意让插入失败，确认前面的数量也会回滚，不会出现书少了一册却没有借阅记录的情况。</w:t>
       </w:r>
     </w:p>
     <w:p>
@@ -9870,7 +9923,7 @@
           <w:sz w:val="24"/>
           <w:szCs w:val="24"/>
         </w:rPr>
-        <w:t xml:space="preserve">状态变化由 SQL 自己判断当前状态，而不是先读记录再盲目更新。待取书只能进入借阅中，借阅中只能进入已归还；重复点击不会重复执行。</w:t>
+        <w:t xml:space="preserve">状态更新没有先查出来再判断，而是把当前状态直接写进 where。待取书只能变成借阅中，借阅中只能变成已归还，重复点击不会再执行一次。</w:t>
       </w:r>
     </w:p>
     <w:p>
@@ -9889,7 +9942,7 @@
           <w:sz w:val="24"/>
           <w:szCs w:val="24"/>
         </w:rPr>
-        <w:t xml:space="preserve">普通读者归还时附带本人用户名条件，馆员可以处理全部记录。更新成功后，LoanService 再调用 incrementAvailable 恢复一册可借数量。</w:t>
+        <w:t xml:space="preserve">普通读者归还时多一个本人用户名的条件，馆员则可以处理全部记录。状态更新成功后，Service 再把可借数量加一。</w:t>
       </w:r>
     </w:p>
     <w:p>
@@ -10298,7 +10351,7 @@
           <w:sz w:val="24"/>
           <w:szCs w:val="24"/>
         </w:rPr>
-        <w:t xml:space="preserve">控制器把页面请求转成服务层方法调用，不直接写 SQL。确认取书前再次检查馆员身份，业务异常通过 flash 属性显示在借阅管理页，刷新后提示自动消失。</w:t>
+        <w:t xml:space="preserve">控制器只负责接参数和调用 Service，SQL 不放在这里。确认取书前检查馆员身份，出错时把消息放进 flash，页面刷新后提示消失。</w:t>
       </w:r>
     </w:p>
     <w:p>
@@ -10317,7 +10370,7 @@
           <w:sz w:val="24"/>
           <w:szCs w:val="24"/>
         </w:rPr>
-        <w:t xml:space="preserve">使用重定向而不是直接渲染页面，可以避免浏览器刷新时重复提交 POST。借阅列表重新读取数据库，状态和按钮随之变化。</w:t>
+        <w:t xml:space="preserve">操作完成后使用 redirect，而不是直接返回页面，这样按 F5 不会重复提交。借阅列表重新查询数据库，状态和按钮也会跟着改变。</w:t>
       </w:r>
     </w:p>
     <w:p>
@@ -10621,7 +10674,7 @@
           <w:sz w:val="24"/>
           <w:szCs w:val="24"/>
         </w:rPr>
-        <w:t xml:space="preserve">编辑页可以修改书名和馆藏信息，但可借数量不是直接由表单决定。Service 读取修改前的总册数和可借数，两者的差就是仍在借出或待取的册数。</w:t>
+        <w:t xml:space="preserve">编辑页允许改书名和总册数，可借数量不直接让表单提交。Service 先读修改前的总册数和可借数，两者相减就是当前借出或待取的数量。</w:t>
       </w:r>
     </w:p>
     <w:p>
@@ -10640,7 +10693,7 @@
           <w:sz w:val="24"/>
           <w:szCs w:val="24"/>
         </w:rPr>
-        <w:t xml:space="preserve">新的总册数不能小于借出册数，否则会得到负的可借数量。通过校验后，可借数按“新总册数减借出册数”重新计算，保证编辑书目不会破坏正在进行的借阅。</w:t>
+        <w:t xml:space="preserve">如果新总册数比借出数量还小，保存就没有意义，所以直接拒绝。校验通过后重新计算可借数，原有借阅记录不会因为改书目而错乱。</w:t>
       </w:r>
     </w:p>
     <w:p>
@@ -11139,7 +11192,7 @@
           <w:sz w:val="24"/>
           <w:szCs w:val="24"/>
         </w:rPr>
-        <w:t xml:space="preserve">users.username 和 books.isbn 使用唯一约束，重复账号和重复书目会在数据库层被拒绝。密码字段只保存 BCrypt 哈希，ID 使用自增主键，借阅表通过 book_id 与书目关联。</w:t>
+        <w:t xml:space="preserve">建表时给用户名和 ISBN 加了唯一约束，重复数据即使从接口提交也会被数据库拦住。密码字段保存哈希，主键使用自增，借阅表通过 book_id 和书目关联。</w:t>
       </w:r>
     </w:p>
     <w:p>
@@ -11158,7 +11211,7 @@
           <w:sz w:val="24"/>
           <w:szCs w:val="24"/>
         </w:rPr>
-        <w:t xml:space="preserve">books 表为分类和题名建立索引，loans 表为读者用户名和状态建立索引。当前数据量不大，但检索和借阅列表会按这些字段过滤，保留索引可以让后续增加馆藏时仍有基本查询性能。</w:t>
+        <w:t xml:space="preserve">books 的分类、题名和 loans 的用户名、状态都加了索引。当前数据不多，索引效果不一定明显，但检索和借阅列表经常按这些字段过滤，先保留下来比较合适。</w:t>
       </w:r>
     </w:p>
     <w:p>
@@ -11537,7 +11590,7 @@
           <w:sz w:val="24"/>
           <w:szCs w:val="24"/>
         </w:rPr>
-        <w:t xml:space="preserve">登录查询只按唯一用户名取一条记录，返回的 password_hash 用于 BCrypt 比对。注册写入使用 useGeneratedKeys，数据库生成主键后回填 User.id，方便后续继续处理。</w:t>
+        <w:t xml:space="preserve">登录查询按用户名取一条记录，返回的 password_hash 只用于比对。注册插入使用 useGeneratedKeys，新增完成后可以直接拿到主键。</w:t>
       </w:r>
     </w:p>
     <w:p>
@@ -11556,7 +11609,7 @@
           <w:sz w:val="24"/>
           <w:szCs w:val="24"/>
         </w:rPr>
-        <w:t xml:space="preserve">countAll 用在首次注册判断。第一位用户进入 LIBRARIAN，之后进入 READER。角色不是由注册表单任意提交，而是由服务层根据当前用户数量设置。</w:t>
+        <w:t xml:space="preserve">countAll 用来判断是不是第一次注册。角色不从表单读取，而是由 Service 设置，所以普通注册页没有办法自己提交 LIBRARIAN。</w:t>
       </w:r>
     </w:p>
     <w:p>
@@ -11845,7 +11898,7 @@
           <w:sz w:val="24"/>
           <w:szCs w:val="24"/>
         </w:rPr>
-        <w:t xml:space="preserve">借出和归还不在 Java 代码里先查再改，而是直接在 SQL 中完成加减。扣减条件包含馆藏状态和 available_copies &gt; 0，恢复条件要求可借数量小于总册数。</w:t>
+        <w:t xml:space="preserve">借出和归还直接在 SQL 里做加减，没有先在 Java 中查出来再改。扣减要求书在馆并有余量，恢复要求可借数小于总册数。</w:t>
       </w:r>
     </w:p>
     <w:p>
@@ -11864,7 +11917,7 @@
           <w:sz w:val="24"/>
           <w:szCs w:val="24"/>
         </w:rPr>
-        <w:t xml:space="preserve">SQL 执行后返回受影响行数。更新结果为 1 才表示本次状态变化有效，如果两个请求同时争用最后一册，只有一个请求能够成功。该结果再与借阅事务结合，避免库存和借阅单不同步。</w:t>
+        <w:t xml:space="preserve">执行后看受影响行数，等于 1 才算成功。两个人同时抢最后一册时，只有一个更新能通过。这个结果再配合事务，库存和借阅单才不会一前一后不同步。</w:t>
       </w:r>
     </w:p>
     <w:p>
@@ -12333,7 +12386,7 @@
           <w:sz w:val="24"/>
           <w:szCs w:val="24"/>
         </w:rPr>
-        <w:t xml:space="preserve">取消、取书和归还都带有当前状态条件。重复点击不会把已取消或已归还的记录再次更新，读者取消预约时还会附带本人用户名，不能处理其他读者的记录。</w:t>
+        <w:t xml:space="preserve">取消、取书和归还都把当前状态写进 SQL。重复点击时记录已经不在原状态，更新行数为零，不会再次修改。读者取消预约还带本人用户名。</w:t>
       </w:r>
     </w:p>
     <w:p>
@@ -12352,7 +12405,7 @@
           <w:sz w:val="24"/>
           <w:szCs w:val="24"/>
         </w:rPr>
-        <w:t xml:space="preserve">馆员确认取书前会检查应还日期，已经失效的预约不能开始借阅。普通读者归还只更新本人的借阅单，馆员归还可以处理全部记录。成功更新后再恢复可借册数。</w:t>
+        <w:t xml:space="preserve">过期预约不能再确认取书。普通读者只能归还自己的记录，馆员可以处理全部记录。状态更新成功后，Service 再恢复可借数量。</w:t>
       </w:r>
     </w:p>
     <w:p>
@@ -12390,7 +12443,7 @@
           <w:sz w:val="24"/>
           <w:szCs w:val="24"/>
         </w:rPr>
-        <w:t xml:space="preserve">云端数据库使用 MySQL 8.0，应用通过 cloud profile 读取 DB_URL、DB_USERNAME 和 DB_PASSWORD。数据库只监听服务器本机地址，公网仅开放 Web 端口。下面的配置片段说明数据源和 SQL 初始化方式。</w:t>
+        <w:t xml:space="preserve">部署这一步花的时间比写页面还多。云端数据库使用 MySQL 8.0，应用通过 cloud profile 读取 DB_URL、DB_USERNAME 和 DB_PASSWORD。数据库只在本机监听，对外只开放 Web 端口。下面这段配置是我最后能正常启动时使用的版本。</w:t>
       </w:r>
     </w:p>
     <w:p>
@@ -12754,7 +12807,7 @@
           <w:sz w:val="24"/>
           <w:szCs w:val="24"/>
         </w:rPr>
-        <w:t xml:space="preserve">数据库凭据不写进源码，由运行环境注入。HikariCP 限制连接池大小，适合课程项目的小型部署。首次建库时设置 DB_INIT_MODE=always，建表并导入馆藏；运行稳定后改为 never，避免重启时重复初始化。</w:t>
+        <w:t xml:space="preserve">数据库账号没有写进源码，而是从运行环境读取。连接池保持在较小的数量，避免课程项目的数据库连接被占满。第一次部署时用 always 建表并导入馆藏，确认数据正常后改成 never，防止重启时把用户数据清空。</w:t>
       </w:r>
     </w:p>
     <w:p>
@@ -12773,7 +12826,7 @@
           <w:sz w:val="24"/>
           <w:szCs w:val="24"/>
         </w:rPr>
-        <w:t xml:space="preserve">forward-headers-strategy 和相对重定向共同处理反向代理下的地址。浏览器登录后继续停留在公开域名，不会因为服务器内部监听的 8080 端口而跳回 localhost。</w:t>
+        <w:t xml:space="preserve">forward-headers-strategy 和相对重定向一起解决公开地址的问题。浏览器登录后继续停在当前域名，不会因为服务器内部监听 8080 端口就跳回 localhost。这个问题我反复试了好几次才定位到。</w:t>
       </w:r>
     </w:p>
     <w:p>
@@ -12811,7 +12864,7 @@
           <w:sz w:val="24"/>
           <w:szCs w:val="24"/>
         </w:rPr>
-        <w:t xml:space="preserve">后端使用 Maven Wrapper 执行自动化测试，覆盖注册登录、首位馆员规则、BCrypt 密码、新书入藏、读者借阅和可借数量扣减。确认取书、归还、编辑、删除和移动端页面在公开地址上人工验收。验收结束后清理临时账号和借阅记录，保留正式馆藏，让交付后的首次注册仍能初始化馆员。</w:t>
+        <w:t xml:space="preserve">提交前用 Maven Wrapper 跑了自动化测试，检查注册登录、首位馆员、BCrypt 密码、新书入藏、借阅和数量扣减。确认取书、归还、编辑、删除以及手机页面则在公开地址上手工操作。测试完成后把临时账号和借阅记录清掉，只留下正式馆藏。</w:t>
       </w:r>
     </w:p>
     <w:p>
@@ -12849,7 +12902,7 @@
           <w:sz w:val="24"/>
           <w:szCs w:val="24"/>
         </w:rPr>
-        <w:t xml:space="preserve">云端部署完成后，依次检查端口、首页、数据库、登录拦截和交付数据。公开端口只开放网站，MySQL 保持在本机监听；数据库初始化完成后切换为 never，避免应用重启时清空用户数据。</w:t>
+        <w:t xml:space="preserve">部署完成后，我按下面的顺序检查端口、首页、数据库、登录拦截和交付数据。最后一项是清空测试账号，保证老师第一次注册时还能得到馆员权限。</w:t>
       </w:r>
     </w:p>
     <w:p>
@@ -13510,17 +13563,92 @@
           <w:sz w:val="24"/>
           <w:szCs w:val="24"/>
         </w:rPr>
-        <w:t xml:space="preserve">部署验收中发现过快照网址失效和端口未注册的问题。重新启动应用后，通过 Codespaces 端口转发把 8080 暴露为公开端口，再用未登录浏览器访问目录页确认无需 GitHub 登录即可打开。网站在交付前再次返回 200，说明公开层和数据库层都已恢复。</w:t>
+        <w:t xml:space="preserve">中间遇到过一次快照网址失效，端口也没有注册。重新启动应用后，把 8080 端口设为公开，再用未登录浏览器访问目录页，确认不需要 GitHub 登录就能打开。交付前又检查了一遍状态码，返回 200 后才把地址写进报告。</w:t>
+      </w:r>
+    </w:p>
+    <w:p>
+      <w:pPr>
+        <w:pStyle w:val="Heading3"/>
+        <w:keepNext/>
+        <w:spacing w:after="90" w:before="170" w:line="360"/>
+      </w:pPr>
+      <w:bookmarkStart w:name="h3_5ba4563" w:id="39"/>
+      <w:r>
+        <w:rPr>
+          <w:rFonts w:ascii="黑体" w:cs="黑体" w:eastAsia="黑体" w:hAnsi="黑体"/>
+          <w:b/>
+          <w:bCs/>
+          <w:sz w:val="24"/>
+          <w:szCs w:val="24"/>
+        </w:rPr>
+        <w:t xml:space="preserve">2.6.4  数据库初始化与馆藏数据准备</w:t>
+      </w:r>
+      <w:bookmarkEnd w:id="39"/>
+    </w:p>
+    <w:p>
+      <w:pPr>
+        <w:keepNext w:val="false"/>
+        <w:spacing w:after="110" w:line="360"/>
+        <w:ind w:firstLine="480"/>
+        <w:jc w:val="both"/>
+      </w:pPr>
+      <w:r>
+        <w:rPr>
+          <w:rFonts w:ascii="宋体" w:cs="宋体" w:eastAsia="宋体" w:hAnsi="宋体"/>
+          <w:b w:val="false"/>
+          <w:bCs w:val="false"/>
+          <w:color w:val="000000"/>
+          <w:sz w:val="24"/>
+          <w:szCs w:val="24"/>
+        </w:rPr>
+        <w:t xml:space="preserve">正式部署前，我先在本地把初始化脚本跑了几遍。MySQL 建表脚本负责 users、books 和 loans 三张表，data.sql 负责导入书目。第一次执行时只放了十几本书，页面看起来比较空，后来又补了名著、课程教材和专业课书目。每一本都检查题名、作者、ISBN、分类和复本数，封面按照 ISBN 单独保存，避免多本书共用同一张图片。</w:t>
+      </w:r>
+    </w:p>
+    <w:p>
+      <w:pPr>
+        <w:keepNext w:val="false"/>
+        <w:spacing w:after="110" w:line="360"/>
+        <w:ind w:firstLine="480"/>
+        <w:jc w:val="both"/>
+      </w:pPr>
+      <w:r>
+        <w:rPr>
+          <w:rFonts w:ascii="宋体" w:cs="宋体" w:eastAsia="宋体" w:hAnsi="宋体"/>
+          <w:b w:val="false"/>
+          <w:bCs w:val="false"/>
+          <w:color w:val="000000"/>
+          <w:sz w:val="24"/>
+          <w:szCs w:val="24"/>
+        </w:rPr>
+        <w:t xml:space="preserve">馆藏数量也重新核对过一次。总册数表示这本书一共有多少本，可借册数表示当前能借出的数量，两者不能随便相等。初始化时我让可借数和总册数保持一致，等读者预约后再由业务代码扣减。这样启动后的目录统计和图书详情使用的是同一份数据，不需要在页面里另外写死数字。</w:t>
+      </w:r>
+    </w:p>
+    <w:p>
+      <w:pPr>
+        <w:keepNext w:val="false"/>
+        <w:spacing w:after="110" w:line="360"/>
+        <w:ind w:firstLine="480"/>
+        <w:jc w:val="both"/>
+      </w:pPr>
+      <w:r>
+        <w:rPr>
+          <w:rFonts w:ascii="宋体" w:cs="宋体" w:eastAsia="宋体" w:hAnsi="宋体"/>
+          <w:b w:val="false"/>
+          <w:bCs w:val="false"/>
+          <w:color w:val="000000"/>
+          <w:sz w:val="24"/>
+          <w:szCs w:val="24"/>
+        </w:rPr>
+        <w:t xml:space="preserve">数据库初始化模式一开始设成了 always，方便我反复修改表结构和测试数据。后来发现应用重启会把注册用户和借阅记录一起清掉，部署稳定后就改成了 never。以后如果确实要重新导入馆藏，需要先备份正式数据，再手工执行脚本，不能直接重启应用。</w:t>
       </w:r>
     </w:p>
     <w:p>
       <w:pPr>
         <w:pStyle w:val="Heading1"/>
         <w:keepNext/>
-        <w:pageBreakBefore/>
-        <w:spacing w:after="240" w:before="0" w:line="360"/>
-      </w:pPr>
-      <w:bookmarkStart w:name="h1_41d96201" w:id="39"/>
+        <w:spacing w:after="240" w:before="320" w:line="360"/>
+      </w:pPr>
+      <w:bookmarkStart w:name="h1_41d96201" w:id="40"/>
       <w:r>
         <w:rPr>
           <w:rFonts w:ascii="黑体" w:cs="黑体" w:eastAsia="黑体" w:hAnsi="黑体"/>
@@ -13531,7 +13659,7 @@
         </w:rPr>
         <w:t xml:space="preserve">第3章  网站功能介绍</w:t>
       </w:r>
-      <w:bookmarkEnd w:id="39"/>
+      <w:bookmarkEnd w:id="40"/>
     </w:p>
     <w:p>
       <w:pPr>
@@ -13539,7 +13667,7 @@
         <w:keepNext/>
         <w:spacing w:after="120" w:before="220" w:line="360"/>
       </w:pPr>
-      <w:bookmarkStart w:name="h2_cb08b97f" w:id="40"/>
+      <w:bookmarkStart w:name="h2_cb08b97f" w:id="41"/>
       <w:r>
         <w:rPr>
           <w:rFonts w:ascii="黑体" w:cs="黑体" w:eastAsia="黑体" w:hAnsi="黑体"/>
@@ -13550,7 +13678,7 @@
         </w:rPr>
         <w:t xml:space="preserve">3.1  用户注册与登录</w:t>
       </w:r>
-      <w:bookmarkEnd w:id="40"/>
+      <w:bookmarkEnd w:id="41"/>
     </w:p>
     <w:p>
       <w:pPr>
@@ -13568,7 +13696,7 @@
           <w:sz w:val="24"/>
           <w:szCs w:val="24"/>
         </w:rPr>
-        <w:t xml:space="preserve">注册页左侧使用图书馆书架实景，右侧是账号表单。用户名限制为 4 至 20 位字母或数字，姓名、学号、院系和密码为必填项。页面明确提示首位账号用于初始化馆员权限，没有放置演示账号。注册成功后转到登录页，使用刚创建的密码进入系统。</w:t>
+        <w:t xml:space="preserve">先看注册页。左边是图书馆书架图片，右边是账号表单，用户名限制为 4 至 20 位字母或数字，姓名、学号、院系和密码都要填写。页面上写明了首位账号会成为馆员，没有另外放演示账号。注册完成后会转到登录页，用刚设置的密码进入。</w:t>
       </w:r>
     </w:p>
     <w:p>
@@ -13580,7 +13708,7 @@
       <w:r>
         <w:drawing>
           <wp:inline distT="0" distB="0" distL="0" distR="0">
-            <wp:extent cx="5334000" cy="3705225"/>
+            <wp:extent cx="4762500" cy="3305175"/>
             <wp:effectExtent t="0" r="0" b="0" l="0"/>
             <wp:docPr id="2" name="图3-1  读者注册页面" descr="图3-1  读者注册页面" title="图3-1  读者注册页面"/>
             <wp:cNvGraphicFramePr>
@@ -13605,7 +13733,7 @@
                   <pic:spPr bwMode="auto">
                     <a:xfrm>
                       <a:off x="0" y="0"/>
-                      <a:ext cx="5334000" cy="3705225"/>
+                      <a:ext cx="4762500" cy="3305175"/>
                     </a:xfrm>
                     <a:prstGeom prst="rect">
                       <a:avLst/>
@@ -13649,7 +13777,64 @@
           <w:sz w:val="24"/>
           <w:szCs w:val="24"/>
         </w:rPr>
-        <w:t xml:space="preserve">登录只接收用户名和密码。后端使用 BCrypt 校验，成功后更换 session id 并写入当前用户。页面导航会根据角色显示“借阅管理”和“图书入藏”，普通读者只能看到自己的借阅记录。</w:t>
+        <w:t xml:space="preserve">登录页只填用户名和密码。后端比对 BCrypt 哈希，成功后更换 session，再把当前用户放进会话。导航栏根据角色显示“借阅管理”和“图书入藏”，普通读者看不到馆员入口。</w:t>
+      </w:r>
+    </w:p>
+    <w:p>
+      <w:pPr>
+        <w:keepNext w:val="false"/>
+        <w:spacing w:after="110" w:line="360"/>
+        <w:ind w:firstLine="480"/>
+        <w:jc w:val="both"/>
+      </w:pPr>
+      <w:r>
+        <w:rPr>
+          <w:rFonts w:ascii="宋体" w:cs="宋体" w:eastAsia="宋体" w:hAnsi="宋体"/>
+          <w:b w:val="false"/>
+          <w:bCs w:val="false"/>
+          <w:color w:val="000000"/>
+          <w:sz w:val="24"/>
+          <w:szCs w:val="24"/>
+        </w:rPr>
+        <w:t xml:space="preserve">测试登录时，我分别注册了馆员和读者账号。馆员登录后能看到入藏入口，读者登录后只能进入自己的借阅列表；同一个账号退出后，再访问借阅地址会被重新送到登录页。这样反复切换角色检查，主要是确认权限不是只在页面上隐藏按钮。</w:t>
+      </w:r>
+    </w:p>
+    <w:p>
+      <w:pPr>
+        <w:keepNext w:val="false"/>
+        <w:spacing w:after="110" w:line="360"/>
+        <w:ind w:firstLine="480"/>
+        <w:jc w:val="both"/>
+      </w:pPr>
+      <w:r>
+        <w:rPr>
+          <w:rFonts w:ascii="宋体" w:cs="宋体" w:eastAsia="宋体" w:hAnsi="宋体"/>
+          <w:b w:val="false"/>
+          <w:bCs w:val="false"/>
+          <w:color w:val="000000"/>
+          <w:sz w:val="24"/>
+          <w:szCs w:val="24"/>
+        </w:rPr>
+        <w:t xml:space="preserve">第一位馆员注册完成后，我又用同一个用户名提交了一次，页面在用户名输入框下方提示已经存在，没有生成第二个账号。随后注册的读者账号虽然也能正常登录，但导航里没有馆员入口。这个检查让我确认角色是由后端按用户数量设置的，不是页面模板自己判断。</w:t>
+      </w:r>
+    </w:p>
+    <w:p>
+      <w:pPr>
+        <w:keepNext w:val="false"/>
+        <w:spacing w:after="110" w:line="360"/>
+        <w:ind w:firstLine="480"/>
+        <w:jc w:val="both"/>
+      </w:pPr>
+      <w:r>
+        <w:rPr>
+          <w:rFonts w:ascii="宋体" w:cs="宋体" w:eastAsia="宋体" w:hAnsi="宋体"/>
+          <w:b w:val="false"/>
+          <w:bCs w:val="false"/>
+          <w:color w:val="000000"/>
+          <w:sz w:val="24"/>
+          <w:szCs w:val="24"/>
+        </w:rPr>
+        <w:t xml:space="preserve">密码方面只检查了登录结果和数据库中的字段。数据库里看到的是 BCrypt 哈希，登录失败时提示身份或密码错误，不会直接说明是哪一项不对。退出后重新打开需要登录的借阅地址，仍然要输入密码，说明会话已经清掉。</w:t>
       </w:r>
     </w:p>
     <w:p>
@@ -13661,7 +13846,7 @@
       <w:r>
         <w:drawing>
           <wp:inline distT="0" distB="0" distL="0" distR="0">
-            <wp:extent cx="5334000" cy="3705225"/>
+            <wp:extent cx="4762500" cy="3305175"/>
             <wp:effectExtent t="0" r="0" b="0" l="0"/>
             <wp:docPr id="3" name="图3-2  登录页面" descr="图3-2  登录页面" title="图3-2  登录页面"/>
             <wp:cNvGraphicFramePr>
@@ -13686,7 +13871,7 @@
                   <pic:spPr bwMode="auto">
                     <a:xfrm>
                       <a:off x="0" y="0"/>
-                      <a:ext cx="5334000" cy="3705225"/>
+                      <a:ext cx="4762500" cy="3305175"/>
                     </a:xfrm>
                     <a:prstGeom prst="rect">
                       <a:avLst/>
@@ -13720,7 +13905,7 @@
         <w:keepNext/>
         <w:spacing w:after="120" w:before="220" w:line="360"/>
       </w:pPr>
-      <w:bookmarkStart w:name="h2_326e7812" w:id="41"/>
+      <w:bookmarkStart w:name="h2_326e7812" w:id="42"/>
       <w:r>
         <w:rPr>
           <w:rFonts w:ascii="黑体" w:cs="黑体" w:eastAsia="黑体" w:hAnsi="黑体"/>
@@ -13731,7 +13916,7 @@
         </w:rPr>
         <w:t xml:space="preserve">3.2  馆藏首页与分类筛选</w:t>
       </w:r>
-      <w:bookmarkEnd w:id="41"/>
+      <w:bookmarkEnd w:id="42"/>
     </w:p>
     <w:p>
       <w:pPr>
@@ -13749,7 +13934,7 @@
           <w:sz w:val="24"/>
           <w:szCs w:val="24"/>
         </w:rPr>
-        <w:t xml:space="preserve">目录页顶部显示当前书目、可借书目、馆藏总量和借阅数。检索框可以输入题名、作者、ISBN 或索书号，右侧可以叠加分类和可借状态。图书行内同时呈现封面、简介、出版社、索书号、馆藏地和复本数量，看到合适结果后可以直接预约。</w:t>
+        <w:t xml:space="preserve">目录页是我平时打开最多的页面。顶部是书目、可借书目、馆藏总量和借阅数，中间可以输入题名、作者、ISBN 或索书号，右边还能再选分类和可借状态。每行书目都有封面、简介、出版社、索书号、馆藏地和复本数量，找到书后可以直接点预约。</w:t>
       </w:r>
     </w:p>
     <w:p>
@@ -13761,7 +13946,7 @@
       <w:r>
         <w:drawing>
           <wp:inline distT="0" distB="0" distL="0" distR="0">
-            <wp:extent cx="5334000" cy="3705225"/>
+            <wp:extent cx="4762500" cy="3305175"/>
             <wp:effectExtent t="0" r="0" b="0" l="0"/>
             <wp:docPr id="4" name="图3-3  公开馆藏检索页面" descr="图3-3  公开馆藏检索页面" title="图3-3  公开馆藏检索页面"/>
             <wp:cNvGraphicFramePr>
@@ -13786,7 +13971,7 @@
                   <pic:spPr bwMode="auto">
                     <a:xfrm>
                       <a:off x="0" y="0"/>
-                      <a:ext cx="5334000" cy="3705225"/>
+                      <a:ext cx="4762500" cy="3305175"/>
                     </a:xfrm>
                     <a:prstGeom prst="rect">
                       <a:avLst/>
@@ -13830,7 +14015,7 @@
           <w:sz w:val="24"/>
           <w:szCs w:val="24"/>
         </w:rPr>
-        <w:t xml:space="preserve">分类栏中的“人工智能”和“电子商务”是一级入口。新增书目进入对应分类后，目录统计和筛选结果同步变化。人工智能分类涵盖导论、统计学习、深度学习、强化学习、自然语言处理和机器学习系统；电子商务分类涵盖数字商务管理、平台经营、消费者传播和网络营销。</w:t>
+        <w:t xml:space="preserve">分类栏里单独放了“人工智能”和“电子商务”两个入口。人工智能下面有导论、统计学习、深度学习、强化学习和自然语言处理，电子商务下面有数字商务管理、平台经营、消费者传播和网络营销。新增书目归到这些分类后，筛选结果和上方统计都会一起变化。</w:t>
       </w:r>
     </w:p>
     <w:p>
@@ -13842,7 +14027,7 @@
       <w:r>
         <w:drawing>
           <wp:inline distT="0" distB="0" distL="0" distR="0">
-            <wp:extent cx="5334000" cy="3705225"/>
+            <wp:extent cx="4762500" cy="3305175"/>
             <wp:effectExtent t="0" r="0" b="0" l="0"/>
             <wp:docPr id="5" name="图3-4  人工智能分类检索" descr="图3-4  人工智能分类检索" title="图3-4  人工智能分类检索"/>
             <wp:cNvGraphicFramePr>
@@ -13867,7 +14052,7 @@
                   <pic:spPr bwMode="auto">
                     <a:xfrm>
                       <a:off x="0" y="0"/>
-                      <a:ext cx="5334000" cy="3705225"/>
+                      <a:ext cx="4762500" cy="3305175"/>
                     </a:xfrm>
                     <a:prstGeom prst="rect">
                       <a:avLst/>
@@ -13911,7 +14096,26 @@
           <w:sz w:val="24"/>
           <w:szCs w:val="24"/>
         </w:rPr>
-        <w:t xml:space="preserve">结果为空时页面显示检索建议和清除条件按钮，不把空白区域留给用户猜测。侧栏的分类状态下拉只改变当前检索参数，不会删除数据库中已有馆藏。</w:t>
+        <w:t xml:space="preserve">如果没有查到结果，页面会提示换一个关键词或清除条件，不会只留一大片空白。侧栏的下拉框只改变当前查询参数，不会修改数据库里的馆藏。</w:t>
+      </w:r>
+    </w:p>
+    <w:p>
+      <w:pPr>
+        <w:keepNext w:val="false"/>
+        <w:spacing w:after="110" w:line="360"/>
+        <w:ind w:firstLine="480"/>
+        <w:jc w:val="both"/>
+      </w:pPr>
+      <w:r>
+        <w:rPr>
+          <w:rFonts w:ascii="宋体" w:cs="宋体" w:eastAsia="宋体" w:hAnsi="宋体"/>
+          <w:b w:val="false"/>
+          <w:bCs w:val="false"/>
+          <w:color w:val="000000"/>
+          <w:sz w:val="24"/>
+          <w:szCs w:val="24"/>
+        </w:rPr>
+        <w:t xml:space="preserve">检索测试用了书名、作者和 ISBN 三种输入方式，也试过同时选择分类与可借状态。条件叠加后，页面条数会随着结果变化，输入框里的关键词仍然保留。清空条件回到全部馆藏时，上方统计不会改变，因为统计读取的是数据库中的总数据。</w:t>
       </w:r>
     </w:p>
     <w:p>
@@ -13920,7 +14124,7 @@
         <w:keepNext/>
         <w:spacing w:after="120" w:before="220" w:line="360"/>
       </w:pPr>
-      <w:bookmarkStart w:name="h2_b2e101a7" w:id="42"/>
+      <w:bookmarkStart w:name="h2_b2e101a7" w:id="43"/>
       <w:r>
         <w:rPr>
           <w:rFonts w:ascii="黑体" w:cs="黑体" w:eastAsia="黑体" w:hAnsi="黑体"/>
@@ -13931,7 +14135,7 @@
         </w:rPr>
         <w:t xml:space="preserve">3.3  馆藏信息与预约借阅</w:t>
       </w:r>
-      <w:bookmarkEnd w:id="42"/>
+      <w:bookmarkEnd w:id="43"/>
     </w:p>
     <w:p>
       <w:pPr>
@@ -13949,7 +14153,26 @@
           <w:sz w:val="24"/>
           <w:szCs w:val="24"/>
         </w:rPr>
-        <w:t xml:space="preserve">详情页左侧显示真实封面，右侧集中展示题名、作者、分类、语种、出版社、年份、索书号、馆藏地、可借数和入藏日期。馆员登录时还会出现编辑与删除按钮。封面与馆藏信息放在同一屏内，避免来回滚动确认版本。</w:t>
+        <w:t xml:space="preserve">图书详情页左边是真实封面，右边放题名、作者、分类、语种、出版社、年份、索书号、馆藏地、可借数和入藏日期。馆员登录后还会多出编辑和删除按钮。这样确认版本时不用在几个页面之间来回切换。</w:t>
+      </w:r>
+    </w:p>
+    <w:p>
+      <w:pPr>
+        <w:keepNext w:val="false"/>
+        <w:spacing w:after="110" w:line="360"/>
+        <w:ind w:firstLine="480"/>
+        <w:jc w:val="both"/>
+      </w:pPr>
+      <w:r>
+        <w:rPr>
+          <w:rFonts w:ascii="宋体" w:cs="宋体" w:eastAsia="宋体" w:hAnsi="宋体"/>
+          <w:b w:val="false"/>
+          <w:bCs w:val="false"/>
+          <w:color w:val="000000"/>
+          <w:sz w:val="24"/>
+          <w:szCs w:val="24"/>
+        </w:rPr>
+        <w:t xml:space="preserve">详情页的封面和书目信息来自同一条记录，换一本书时整块内容会一起刷新，不会出现封面还是上一本的情况。可借数量为 0 时，预约按钮会变成不可用状态，并提示当前没有剩余复本。</w:t>
       </w:r>
     </w:p>
     <w:p>
@@ -13961,7 +14184,7 @@
       <w:r>
         <w:drawing>
           <wp:inline distT="0" distB="0" distL="0" distR="0">
-            <wp:extent cx="5334000" cy="3705225"/>
+            <wp:extent cx="4762500" cy="3305175"/>
             <wp:effectExtent t="0" r="0" b="0" l="0"/>
             <wp:docPr id="6" name="图3-5  图书详情页面" descr="图3-5  图书详情页面" title="图3-5  图书详情页面"/>
             <wp:cNvGraphicFramePr>
@@ -13986,7 +14209,7 @@
                   <pic:spPr bwMode="auto">
                     <a:xfrm>
                       <a:off x="0" y="0"/>
-                      <a:ext cx="5334000" cy="3705225"/>
+                      <a:ext cx="4762500" cy="3305175"/>
                     </a:xfrm>
                     <a:prstGeom prst="rect">
                       <a:avLst/>
@@ -14030,7 +14253,45 @@
           <w:sz w:val="24"/>
           <w:szCs w:val="24"/>
         </w:rPr>
-        <w:t xml:space="preserve">预约页默认把取书地点设为该书馆藏地，应还日期默认为 30 天后。读者可以选择个人借阅、课程参考或科研用书，填写预约时间、电话和备注。提交后进入借阅管理页，记录显示为“待取书”。</w:t>
+        <w:t xml:space="preserve">预约页会自动带出这本书的馆藏地，应还日期默认在 30 天后。读者可以选择个人借阅、课程参考或科研用书，再填写取书时间、电话和备注。提交成功后进入借阅管理页，记录显示为“待取书”。</w:t>
+      </w:r>
+    </w:p>
+    <w:p>
+      <w:pPr>
+        <w:keepNext w:val="false"/>
+        <w:spacing w:after="110" w:line="360"/>
+        <w:ind w:firstLine="480"/>
+        <w:jc w:val="both"/>
+      </w:pPr>
+      <w:r>
+        <w:rPr>
+          <w:rFonts w:ascii="宋体" w:cs="宋体" w:eastAsia="宋体" w:hAnsi="宋体"/>
+          <w:b w:val="false"/>
+          <w:bCs w:val="false"/>
+          <w:color w:val="000000"/>
+          <w:sz w:val="24"/>
+          <w:szCs w:val="24"/>
+        </w:rPr>
+        <w:t xml:space="preserve">选择课程参考时，页面不会自动修改应还日期，只是把借阅用途一起记下来。这样读者仍然可以按自己的安排调整日期，后端则继续检查日期是否已经过去。联系方式和备注没有直接写进图书表，而是保存在借阅记录中，换一本书时不会带着上一本的备注。</w:t>
+      </w:r>
+    </w:p>
+    <w:p>
+      <w:pPr>
+        <w:keepNext w:val="false"/>
+        <w:spacing w:after="110" w:line="360"/>
+        <w:ind w:firstLine="480"/>
+        <w:jc w:val="both"/>
+      </w:pPr>
+      <w:r>
+        <w:rPr>
+          <w:rFonts w:ascii="宋体" w:cs="宋体" w:eastAsia="宋体" w:hAnsi="宋体"/>
+          <w:b w:val="false"/>
+          <w:bCs w:val="false"/>
+          <w:color w:val="000000"/>
+          <w:sz w:val="24"/>
+          <w:szCs w:val="24"/>
+        </w:rPr>
+        <w:t xml:space="preserve">详情页的编辑和删除按钮只对馆员显示。普通读者看到的是预约和归还入口，打开页面时也不会因为知道管理地址就能直接操作。角色不同时，同一个详情页显示的内容会有所区别，但书目和可借数量来自同一条查询结果。</w:t>
       </w:r>
     </w:p>
     <w:p>
@@ -14042,7 +14303,7 @@
       <w:r>
         <w:drawing>
           <wp:inline distT="0" distB="0" distL="0" distR="0">
-            <wp:extent cx="5334000" cy="3705225"/>
+            <wp:extent cx="4762500" cy="3305175"/>
             <wp:effectExtent t="0" r="0" b="0" l="0"/>
             <wp:docPr id="7" name="图3-6  预约借阅表单" descr="图3-6  预约借阅表单" title="图3-6  预约借阅表单"/>
             <wp:cNvGraphicFramePr>
@@ -14067,7 +14328,7 @@
                   <pic:spPr bwMode="auto">
                     <a:xfrm>
                       <a:off x="0" y="0"/>
-                      <a:ext cx="5334000" cy="3705225"/>
+                      <a:ext cx="4762500" cy="3305175"/>
                     </a:xfrm>
                     <a:prstGeom prst="rect">
                       <a:avLst/>
@@ -14111,7 +14372,64 @@
           <w:sz w:val="24"/>
           <w:szCs w:val="24"/>
         </w:rPr>
-        <w:t xml:space="preserve">借阅申请提交时，系统会检查时间、重复记录和剩余复本。页面顶部显示结果消息，记录中包含借阅单号、书名、索书号、读者、取书时间、应还日期和取书地点。待取书状态下，读者可以取消预约；取消后复本数恢复。</w:t>
+        <w:t xml:space="preserve">提交时如果时间填错、已经预约过或者没有复本，页面会显示具体原因。借阅记录里有单号、书名、索书号、读者、取书时间、应还日期和取书地点。还没取书时可以取消，取消后可借数量会加回来。</w:t>
+      </w:r>
+    </w:p>
+    <w:p>
+      <w:pPr>
+        <w:keepNext w:val="false"/>
+        <w:spacing w:after="110" w:line="360"/>
+        <w:ind w:firstLine="480"/>
+        <w:jc w:val="both"/>
+      </w:pPr>
+      <w:r>
+        <w:rPr>
+          <w:rFonts w:ascii="宋体" w:cs="宋体" w:eastAsia="宋体" w:hAnsi="宋体"/>
+          <w:b w:val="false"/>
+          <w:bCs w:val="false"/>
+          <w:color w:val="000000"/>
+          <w:sz w:val="24"/>
+          <w:szCs w:val="24"/>
+        </w:rPr>
+        <w:t xml:space="preserve">预约表单测试过空联系电话、过去的取书时间和早于今天的应还日期，错误都显示在对应字段下方。重复点击提交时，因为重复记录判断和事务限制，不会再生成第二张借阅单。取消预约后又查了一次详情页，可借数量恢复到操作前的数值。</w:t>
+      </w:r>
+    </w:p>
+    <w:p>
+      <w:pPr>
+        <w:keepNext w:val="false"/>
+        <w:spacing w:after="110" w:line="360"/>
+        <w:ind w:firstLine="480"/>
+        <w:jc w:val="both"/>
+      </w:pPr>
+      <w:r>
+        <w:rPr>
+          <w:rFonts w:ascii="宋体" w:cs="宋体" w:eastAsia="宋体" w:hAnsi="宋体"/>
+          <w:b w:val="false"/>
+          <w:bCs w:val="false"/>
+          <w:color w:val="000000"/>
+          <w:sz w:val="24"/>
+          <w:szCs w:val="24"/>
+        </w:rPr>
+        <w:t xml:space="preserve">同一位读者对同一本书只能保留一条未结束记录。测试时先提交一次预约，再点一次提交，页面提示已经存在借阅记录。换另一位读者预约同一本书时，只要还有复本就可以正常提交；最后一册被占完后，详情页的剩余数量变成 0。</w:t>
+      </w:r>
+    </w:p>
+    <w:p>
+      <w:pPr>
+        <w:keepNext w:val="false"/>
+        <w:spacing w:after="110" w:line="360"/>
+        <w:ind w:firstLine="480"/>
+        <w:jc w:val="both"/>
+      </w:pPr>
+      <w:r>
+        <w:rPr>
+          <w:rFonts w:ascii="宋体" w:cs="宋体" w:eastAsia="宋体" w:hAnsi="宋体"/>
+          <w:b w:val="false"/>
+          <w:bCs w:val="false"/>
+          <w:color w:val="000000"/>
+          <w:sz w:val="24"/>
+          <w:szCs w:val="24"/>
+        </w:rPr>
+        <w:t xml:space="preserve">待取书记录中可以看到预约时间和应还日期。预约时间填得过早时，提交按钮不会直接保存；应还日期早于当天时，字段下方会出现错误提示。取消操作只修改当前读者的记录，其他读者的同名书目不会被一起取消。</w:t>
       </w:r>
     </w:p>
     <w:p>
@@ -14123,7 +14441,7 @@
       <w:r>
         <w:drawing>
           <wp:inline distT="0" distB="0" distL="0" distR="0">
-            <wp:extent cx="5334000" cy="3705225"/>
+            <wp:extent cx="4762500" cy="3305175"/>
             <wp:effectExtent t="0" r="0" b="0" l="0"/>
             <wp:docPr id="8" name="图3-7  待取书借阅记录" descr="图3-7  待取书借阅记录" title="图3-7  待取书借阅记录"/>
             <wp:cNvGraphicFramePr>
@@ -14148,7 +14466,7 @@
                   <pic:spPr bwMode="auto">
                     <a:xfrm>
                       <a:off x="0" y="0"/>
-                      <a:ext cx="5334000" cy="3705225"/>
+                      <a:ext cx="4762500" cy="3305175"/>
                     </a:xfrm>
                     <a:prstGeom prst="rect">
                       <a:avLst/>
@@ -14182,7 +14500,7 @@
         <w:keepNext/>
         <w:spacing w:after="120" w:before="220" w:line="360"/>
       </w:pPr>
-      <w:bookmarkStart w:name="h2_51e89744" w:id="43"/>
+      <w:bookmarkStart w:name="h2_51e89744" w:id="44"/>
       <w:r>
         <w:rPr>
           <w:rFonts w:ascii="黑体" w:cs="黑体" w:eastAsia="黑体" w:hAnsi="黑体"/>
@@ -14193,7 +14511,7 @@
         </w:rPr>
         <w:t xml:space="preserve">3.4  借阅管理</w:t>
       </w:r>
-      <w:bookmarkEnd w:id="43"/>
+      <w:bookmarkEnd w:id="44"/>
     </w:p>
     <w:p>
       <w:pPr>
@@ -14211,7 +14529,45 @@
           <w:sz w:val="24"/>
           <w:szCs w:val="24"/>
         </w:rPr>
-        <w:t xml:space="preserve">馆员在借阅管理页核对读者姓名、联系电话和取书地点后确认取书。此时状态变为“借阅中”，开始时间由数据库当前时间写入。确认按钮只在待取书状态下出现，避免无效操作。</w:t>
+        <w:t xml:space="preserve">馆员进入借阅管理页后，先核对读者姓名、联系电话和取书地点，再点“确认取书”。记录变成“借阅中”，开始时间由数据库写入。这个按钮只在待取书状态下显示，减少了误点。</w:t>
+      </w:r>
+    </w:p>
+    <w:p>
+      <w:pPr>
+        <w:keepNext w:val="false"/>
+        <w:spacing w:after="110" w:line="360"/>
+        <w:ind w:firstLine="480"/>
+        <w:jc w:val="both"/>
+      </w:pPr>
+      <w:r>
+        <w:rPr>
+          <w:rFonts w:ascii="宋体" w:cs="宋体" w:eastAsia="宋体" w:hAnsi="宋体"/>
+          <w:b w:val="false"/>
+          <w:bCs w:val="false"/>
+          <w:color w:val="000000"/>
+          <w:sz w:val="24"/>
+          <w:szCs w:val="24"/>
+        </w:rPr>
+        <w:t xml:space="preserve">我还用普通读者账号直接访问馆员操作地址，后端返回权限提示，没有执行状态修改。确认取书后再刷新页面，记录仍在“借阅中”，说明状态是从数据库读出来的，而不是按钮点击后临时改在浏览器里。</w:t>
+      </w:r>
+    </w:p>
+    <w:p>
+      <w:pPr>
+        <w:keepNext w:val="false"/>
+        <w:spacing w:after="110" w:line="360"/>
+        <w:ind w:firstLine="480"/>
+        <w:jc w:val="both"/>
+      </w:pPr>
+      <w:r>
+        <w:rPr>
+          <w:rFonts w:ascii="宋体" w:cs="宋体" w:eastAsia="宋体" w:hAnsi="宋体"/>
+          <w:b w:val="false"/>
+          <w:bCs w:val="false"/>
+          <w:color w:val="000000"/>
+          <w:sz w:val="24"/>
+          <w:szCs w:val="24"/>
+        </w:rPr>
+        <w:t xml:space="preserve">确认取书前会再检查一次应还日期。过期记录即使状态仍是待取书，也不会变成借阅中。归还按钮只在借阅中记录上出现，归还成功后可借数量增加一册；重复点击不会再加第二册。</w:t>
       </w:r>
     </w:p>
     <w:p>
@@ -14223,7 +14579,7 @@
       <w:r>
         <w:drawing>
           <wp:inline distT="0" distB="0" distL="0" distR="0">
-            <wp:extent cx="5334000" cy="3705225"/>
+            <wp:extent cx="4762500" cy="3305175"/>
             <wp:effectExtent t="0" r="0" b="0" l="0"/>
             <wp:docPr id="9" name="图3-8  借阅中记录" descr="图3-8  借阅中记录" title="图3-8  借阅中记录"/>
             <wp:cNvGraphicFramePr>
@@ -14248,7 +14604,7 @@
                   <pic:spPr bwMode="auto">
                     <a:xfrm>
                       <a:off x="0" y="0"/>
-                      <a:ext cx="5334000" cy="3705225"/>
+                      <a:ext cx="4762500" cy="3305175"/>
                     </a:xfrm>
                     <a:prstGeom prst="rect">
                       <a:avLst/>
@@ -14292,7 +14648,7 @@
           <w:sz w:val="24"/>
           <w:szCs w:val="24"/>
         </w:rPr>
-        <w:t xml:space="preserve">归还时点击“办理归还”，借阅单进入已归还状态并记录归还时间。读者页面只显示自己的记录，馆员页面显示全部记录。如果当前浏览器没有登录信息，访问借阅地址会被拦截到登录页；登录后看到的是数据库里的实时状态。</w:t>
+        <w:t xml:space="preserve">归还时点“办理归还”，记录改成已归还并保存归还时间。读者只能看到自己的借阅单，馆员能看到所有人的记录。如果浏览器里没有登录信息，直接打开借阅地址会先跳回登录页。</w:t>
       </w:r>
     </w:p>
     <w:p>
@@ -14301,7 +14657,7 @@
         <w:keepNext/>
         <w:spacing w:after="120" w:before="220" w:line="360"/>
       </w:pPr>
-      <w:bookmarkStart w:name="h2_314b2c70" w:id="44"/>
+      <w:bookmarkStart w:name="h2_314b2c70" w:id="45"/>
       <w:r>
         <w:rPr>
           <w:rFonts w:ascii="黑体" w:cs="黑体" w:eastAsia="黑体" w:hAnsi="黑体"/>
@@ -14312,7 +14668,7 @@
         </w:rPr>
         <w:t xml:space="preserve">3.5  馆员入藏与书目维护</w:t>
       </w:r>
-      <w:bookmarkEnd w:id="44"/>
+      <w:bookmarkEnd w:id="45"/>
     </w:p>
     <w:p>
       <w:pPr>
@@ -14330,7 +14686,26 @@
           <w:sz w:val="24"/>
           <w:szCs w:val="24"/>
         </w:rPr>
-        <w:t xml:space="preserve">新书入藏页面分为书目信息和馆藏信息两部分。必填项包括书名、作者、ISBN、出版社、年份、分类、语种、标签、简介、索书号和馆藏地。封面路径可以留空，系统使用默认图书图片；填写路径时右侧即时预览。</w:t>
+        <w:t xml:space="preserve">新书入藏页分成书目信息和馆藏信息两部分。书名、作者、ISBN、出版社、年份、分类、语种、标签、简介、索书号和馆藏地都需要填写。封面路径可以留空，系统会显示默认图片，填了路径就在右侧预览。</w:t>
+      </w:r>
+    </w:p>
+    <w:p>
+      <w:pPr>
+        <w:keepNext w:val="false"/>
+        <w:spacing w:after="110" w:line="360"/>
+        <w:ind w:firstLine="480"/>
+        <w:jc w:val="both"/>
+      </w:pPr>
+      <w:r>
+        <w:rPr>
+          <w:rFonts w:ascii="宋体" w:cs="宋体" w:eastAsia="宋体" w:hAnsi="宋体"/>
+          <w:b w:val="false"/>
+          <w:bCs w:val="false"/>
+          <w:color w:val="000000"/>
+          <w:sz w:val="24"/>
+          <w:szCs w:val="24"/>
+        </w:rPr>
+        <w:t xml:space="preserve">表单提交前会先检查必填项和 ISBN。分类使用下拉框，语种和标签可以从已有选项里选，也可以补新的值。复本数只填一个正整数，保存时由后端同时设置可借数量，避免馆员在两个输入框里把数字填反。封面预览只是帮助确认路径，不会把本地图片直接上传到服务器。</w:t>
       </w:r>
     </w:p>
     <w:p>
@@ -14342,7 +14717,7 @@
       <w:r>
         <w:drawing>
           <wp:inline distT="0" distB="0" distL="0" distR="0">
-            <wp:extent cx="5334000" cy="3705225"/>
+            <wp:extent cx="4762500" cy="3305175"/>
             <wp:effectExtent t="0" r="0" b="0" l="0"/>
             <wp:docPr id="10" name="图3-9  新书入藏页面" descr="图3-9  新书入藏页面" title="图3-9  新书入藏页面"/>
             <wp:cNvGraphicFramePr>
@@ -14367,7 +14742,7 @@
                   <pic:spPr bwMode="auto">
                     <a:xfrm>
                       <a:off x="0" y="0"/>
-                      <a:ext cx="5334000" cy="3705225"/>
+                      <a:ext cx="4762500" cy="3305175"/>
                     </a:xfrm>
                     <a:prstGeom prst="rect">
                       <a:avLst/>
@@ -14411,7 +14786,7 @@
           <w:sz w:val="24"/>
           <w:szCs w:val="24"/>
         </w:rPr>
-        <w:t xml:space="preserve">保存后进入图书详情页，馆员可以继续编辑。编辑表单保留原索书号、馆藏地和复本数量，文本首尾空格由服务层清理，索书号统一转成大写。删除前会出现二次确认；如果仍有未归还记录，数据库中的借阅关系会使删除被拒绝。</w:t>
+        <w:t xml:space="preserve">保存后进入详情页，馆员还可以继续修改。编辑时会保留原来的索书号、馆藏地和复本数量，文字首尾空格由 Service 清掉，索书号统一转成大写。删除前有一次确认，如果还有未归还记录，后端会拒绝。</w:t>
       </w:r>
     </w:p>
     <w:p>
@@ -14430,7 +14805,26 @@
           <w:sz w:val="24"/>
           <w:szCs w:val="24"/>
         </w:rPr>
-        <w:t xml:space="preserve">公开验收使用临时书目完成了新增、改名和删除三步，随后清理记录。正式馆藏共 87 种、403 册，名著、课程教材、人工智能与电子商务书目均保留在初始化数据中。</w:t>
+        <w:t xml:space="preserve">录入测试先写了一本没有封面的书，页面显示默认图片；后来补上封面路径，详情页能立即显示新图片。修改总册数时，我特意把它改得比借出数量还小，保存被拒绝，原有可借数没有变化。</w:t>
+      </w:r>
+    </w:p>
+    <w:p>
+      <w:pPr>
+        <w:keepNext w:val="false"/>
+        <w:spacing w:after="110" w:line="360"/>
+        <w:ind w:firstLine="480"/>
+        <w:jc w:val="both"/>
+      </w:pPr>
+      <w:r>
+        <w:rPr>
+          <w:rFonts w:ascii="宋体" w:cs="宋体" w:eastAsia="宋体" w:hAnsi="宋体"/>
+          <w:b w:val="false"/>
+          <w:bCs w:val="false"/>
+          <w:color w:val="000000"/>
+          <w:sz w:val="24"/>
+          <w:szCs w:val="24"/>
+        </w:rPr>
+        <w:t xml:space="preserve">验收时我加了一本临时书，依次试了新增、改名和删除，确认没有问题后再清理。正式数据保留 87 种、403 册，名著、课程教材、人工智能和电子商务书目都在里面。</w:t>
       </w:r>
     </w:p>
     <w:p>
@@ -14439,7 +14833,7 @@
         <w:keepNext/>
         <w:spacing w:after="120" w:before="220" w:line="360"/>
       </w:pPr>
-      <w:bookmarkStart w:name="h2_e344a27a" w:id="45"/>
+      <w:bookmarkStart w:name="h2_e344a27a" w:id="46"/>
       <w:r>
         <w:rPr>
           <w:rFonts w:ascii="黑体" w:cs="黑体" w:eastAsia="黑体" w:hAnsi="黑体"/>
@@ -14450,7 +14844,7 @@
         </w:rPr>
         <w:t xml:space="preserve">3.6  响应式页面</w:t>
       </w:r>
-      <w:bookmarkEnd w:id="45"/>
+      <w:bookmarkEnd w:id="46"/>
     </w:p>
     <w:p>
       <w:pPr>
@@ -14468,7 +14862,7 @@
           <w:sz w:val="24"/>
           <w:szCs w:val="24"/>
         </w:rPr>
-        <w:t xml:space="preserve">移动端把顶部导航压缩成一行，分类栏改为横向滚动，统计块排成两行。图书行改为上下结构，封面不遮挡题名和借阅按钮。页面没有单独制作另一套移动版，桌面与手机使用同一份 Thymeleaf 模板和同一套查询结果。</w:t>
+        <w:t xml:space="preserve">手机页面把导航压成一行，分类改成横向滚动，统计块分两行显示。图书行也从左右结构改成上下结构，避免封面挤住题名和按钮。移动端没有另写一套模板，桌面和手机共用同一份 Thymeleaf 页面。</w:t>
       </w:r>
     </w:p>
     <w:p>
@@ -14549,7 +14943,7 @@
           <w:sz w:val="24"/>
           <w:szCs w:val="24"/>
         </w:rPr>
-        <w:t xml:space="preserve">在 390 像素宽度下，按钮、输入框和文字没有互相覆盖。长书名会自然换行，统计数字和单位保持同一行。桌面端与移动端访问的都是公开域名，数据库记录一致。</w:t>
+        <w:t xml:space="preserve">我用浏览器把宽度调到 390 像素检查，按钮、输入框和文字没有叠在一起，长书名会自己换行。桌面和手机访问的是同一个公开地址，看到的数据也一样。</w:t>
       </w:r>
     </w:p>
     <w:p>
@@ -14558,7 +14952,7 @@
         <w:keepNext/>
         <w:spacing w:after="120" w:before="220" w:line="360"/>
       </w:pPr>
-      <w:bookmarkStart w:name="h2_f2ac79a4" w:id="46"/>
+      <w:bookmarkStart w:name="h2_f2ac79a4" w:id="47"/>
       <w:r>
         <w:rPr>
           <w:rFonts w:ascii="黑体" w:cs="黑体" w:eastAsia="黑体" w:hAnsi="黑体"/>
@@ -14569,7 +14963,7 @@
         </w:rPr>
         <w:t xml:space="preserve">3.7  异常处理与操作反馈</w:t>
       </w:r>
-      <w:bookmarkEnd w:id="46"/>
+      <w:bookmarkEnd w:id="47"/>
     </w:p>
     <w:p>
       <w:pPr>
@@ -14587,7 +14981,7 @@
           <w:sz w:val="24"/>
           <w:szCs w:val="24"/>
         </w:rPr>
-        <w:t xml:space="preserve">页面不仅处理成功流程，也为常见失败情况提供明确反馈。字段校验错误显示在对应输入框附近，业务错误通过重定向后的 flash 消息展示，未登录和角色不足则转到登录页或错误页。所有失败操作都不会静默跳过。</w:t>
+        <w:t xml:space="preserve">调试时我把能想到的错误都试了一遍。字段校验错误显示在输入框下面，业务错误通过 flash 消息带回页面，未登录和权限不足则转到登录页或错误页。页面不会出现点了按钮却没有任何反应的情况。</w:t>
       </w:r>
     </w:p>
     <w:p>
@@ -15420,7 +15814,7 @@
           <w:sz w:val="24"/>
           <w:szCs w:val="24"/>
         </w:rPr>
-        <w:t xml:space="preserve">检索结果为空时保留检索条件，并提供返回全部馆藏入口。图书不存在时使用统一错误页面，不把数据库异常直接显示给用户。删除馆藏前使用确认对话框，即使误点确认，服务层仍会检查是否存在未结束借阅。</w:t>
+        <w:t xml:space="preserve">检索为空时保留原来的条件，并给一个返回全部馆藏的入口。图书不存在时显示统一错误页，不把数据库异常原样抛给用户。删除前有确认框，就算误点确认，Service 还会再检查有没有未结束的借阅。</w:t>
       </w:r>
     </w:p>
     <w:p>
@@ -15439,17 +15833,92 @@
           <w:sz w:val="24"/>
           <w:szCs w:val="24"/>
         </w:rPr>
-        <w:t xml:space="preserve">表单同时使用 HTML 必填属性、长度限制和后端 Jakarta Validation。浏览器校验只能改善输入体验，最终正确性仍由后端和服务层决定。这样绕过前端限制直接提交请求时，数据库与服务层仍会阻止非法数据。</w:t>
+        <w:t xml:space="preserve">表单上写了 HTML 必填属性和长度限制，后端又用了 Jakarta Validation。前端校验只是让输入时少出错，真正保存前还是要在后端再查一次。这样即使绕过页面直接发请求，也不会把非法数据写进去。</w:t>
+      </w:r>
+    </w:p>
+    <w:p>
+      <w:pPr>
+        <w:pStyle w:val="Heading2"/>
+        <w:keepNext/>
+        <w:spacing w:after="120" w:before="220" w:line="360"/>
+      </w:pPr>
+      <w:bookmarkStart w:name="h2_11d98cfa" w:id="48"/>
+      <w:r>
+        <w:rPr>
+          <w:rFonts w:ascii="黑体" w:cs="黑体" w:eastAsia="黑体" w:hAnsi="黑体"/>
+          <w:b/>
+          <w:bCs/>
+          <w:sz w:val="28"/>
+          <w:szCs w:val="28"/>
+        </w:rPr>
+        <w:t xml:space="preserve">3.8  页面验收中的问题记录</w:t>
+      </w:r>
+      <w:bookmarkEnd w:id="48"/>
+    </w:p>
+    <w:p>
+      <w:pPr>
+        <w:keepNext w:val="false"/>
+        <w:spacing w:after="110" w:line="360"/>
+        <w:ind w:firstLine="480"/>
+        <w:jc w:val="both"/>
+      </w:pPr>
+      <w:r>
+        <w:rPr>
+          <w:rFonts w:ascii="宋体" w:cs="宋体" w:eastAsia="宋体" w:hAnsi="宋体"/>
+          <w:b w:val="false"/>
+          <w:bCs w:val="false"/>
+          <w:color w:val="000000"/>
+          <w:sz w:val="24"/>
+          <w:szCs w:val="24"/>
+        </w:rPr>
+        <w:t xml:space="preserve">页面刚完成时，我把主要精力放在功能上，验收时才发现几处不方便的地方。目录页在宽屏下书单还可以，缩到手机宽度后，统计块和分类栏会挤在一起；后来把它们分开排列，移动端才不用左右拖动整个页面。借阅记录页的空状态也改过一次，原来只显示一行提示，现在会告诉读者下一步可以返回目录。</w:t>
+      </w:r>
+    </w:p>
+    <w:p>
+      <w:pPr>
+        <w:keepNext w:val="false"/>
+        <w:spacing w:after="110" w:line="360"/>
+        <w:ind w:firstLine="480"/>
+        <w:jc w:val="both"/>
+      </w:pPr>
+      <w:r>
+        <w:rPr>
+          <w:rFonts w:ascii="宋体" w:cs="宋体" w:eastAsia="宋体" w:hAnsi="宋体"/>
+          <w:b w:val="false"/>
+          <w:bCs w:val="false"/>
+          <w:color w:val="000000"/>
+          <w:sz w:val="24"/>
+          <w:szCs w:val="24"/>
+        </w:rPr>
+        <w:t xml:space="preserve">注册和登录页的图片占的位置比较大，缩小窗口后表单会被推到下面。调整后，桌面端保持左右布局，手机端改成先看标题再看表单，图片不再挡住输入框。按钮在提交时会有短暂禁用，避免连续点击产生重复请求。</w:t>
+      </w:r>
+    </w:p>
+    <w:p>
+      <w:pPr>
+        <w:keepNext w:val="false"/>
+        <w:spacing w:after="110" w:line="360"/>
+        <w:ind w:firstLine="480"/>
+        <w:jc w:val="both"/>
+      </w:pPr>
+      <w:r>
+        <w:rPr>
+          <w:rFonts w:ascii="宋体" w:cs="宋体" w:eastAsia="宋体" w:hAnsi="宋体"/>
+          <w:b w:val="false"/>
+          <w:bCs w:val="false"/>
+          <w:color w:val="000000"/>
+          <w:sz w:val="24"/>
+          <w:szCs w:val="24"/>
+        </w:rPr>
+        <w:t xml:space="preserve">验收时还检查了页脚页码、目录章节和图片标题。目录中的页码按正文页脚重新核对，图书截图使用实际运行时保存的图片。最后一遍检查没有继续添加演示账号，注册、登录和借阅都从空账号状态重新走了一遍。</w:t>
       </w:r>
     </w:p>
     <w:p>
       <w:pPr>
         <w:pStyle w:val="Heading1"/>
         <w:keepNext/>
-        <w:pageBreakBefore/>
-        <w:spacing w:after="240" w:before="0" w:line="360"/>
-      </w:pPr>
-      <w:bookmarkStart w:name="h1_dd5a8de1" w:id="47"/>
+        <w:spacing w:after="240" w:before="320" w:line="360"/>
+      </w:pPr>
+      <w:bookmarkStart w:name="h1_dd5a8de1" w:id="49"/>
       <w:r>
         <w:rPr>
           <w:rFonts w:ascii="黑体" w:cs="黑体" w:eastAsia="黑体" w:hAnsi="黑体"/>
@@ -15460,7 +15929,7 @@
         </w:rPr>
         <w:t xml:space="preserve">第4章  开发总结</w:t>
       </w:r>
-      <w:bookmarkEnd w:id="47"/>
+      <w:bookmarkEnd w:id="49"/>
     </w:p>
     <w:p>
       <w:pPr>
@@ -15468,7 +15937,7 @@
         <w:keepNext/>
         <w:spacing w:after="120" w:before="220" w:line="360"/>
       </w:pPr>
-      <w:bookmarkStart w:name="h2_5f29a9c9" w:id="48"/>
+      <w:bookmarkStart w:name="h2_5f29a9c9" w:id="50"/>
       <w:r>
         <w:rPr>
           <w:rFonts w:ascii="黑体" w:cs="黑体" w:eastAsia="黑体" w:hAnsi="黑体"/>
@@ -15479,7 +15948,7 @@
         </w:rPr>
         <w:t xml:space="preserve">4.1  功能完成情况</w:t>
       </w:r>
-      <w:bookmarkEnd w:id="48"/>
+      <w:bookmarkEnd w:id="50"/>
     </w:p>
     <w:p>
       <w:pPr>
@@ -15497,7 +15966,7 @@
           <w:sz w:val="24"/>
           <w:szCs w:val="24"/>
         </w:rPr>
-        <w:t xml:space="preserve">本次作业完成了一个能够直接注册、登录、检索、预约、取书和归还的图书管理系统。网站不仅有页面展示，还将用户、书目和借阅记录写入云端 MySQL。交付后的公开地址可以正常访问，首次注册账号自动成为馆员，后续账号按读者处理，不依赖预置的演示账号。</w:t>
+        <w:t xml:space="preserve">这次作业最后做成了一个可以直接使用的图书管理系统。用户能注册、登录、查书、预约、取书和归还，馆员还能维护馆藏。数据没有停在本地，而是写入了云端 MySQL。公开地址交付前还能正常打开，第一次注册的账号会自动成为馆员。</w:t>
       </w:r>
     </w:p>
     <w:p>
@@ -16234,7 +16703,7 @@
         <w:keepNext/>
         <w:spacing w:after="120" w:before="220" w:line="360"/>
       </w:pPr>
-      <w:bookmarkStart w:name="h2_2712c9ed" w:id="49"/>
+      <w:bookmarkStart w:name="h2_2712c9ed" w:id="51"/>
       <w:r>
         <w:rPr>
           <w:rFonts w:ascii="黑体" w:cs="黑体" w:eastAsia="黑体" w:hAnsi="黑体"/>
@@ -16245,7 +16714,7 @@
         </w:rPr>
         <w:t xml:space="preserve">4.2  开发过程与问题处理</w:t>
       </w:r>
-      <w:bookmarkEnd w:id="49"/>
+      <w:bookmarkEnd w:id="51"/>
     </w:p>
     <w:p>
       <w:pPr>
@@ -16263,7 +16732,7 @@
           <w:sz w:val="24"/>
           <w:szCs w:val="24"/>
         </w:rPr>
-        <w:t xml:space="preserve">最先处理的是首位馆员初始化。系统没有预置管理员，因此注册方法会在事务中读取用户数量，再决定当前账号是 LIBRARIAN 还是 READER。同步方法和唯一用户名约束共同避免两个注册请求同时判断为空表，造成多个初始馆员。</w:t>
+        <w:t xml:space="preserve">刚建库时最先碰到的是馆员初始化。系统没有预置管理员，所以注册方法要先读用户数量，再决定当前账号是不是 LIBRARIAN。原来看起来很简单，后来想到两个注册请求同时进来时可能都认为表是空的，于是又补了同步、事务和用户名唯一约束。</w:t>
       </w:r>
     </w:p>
     <w:p>
@@ -16282,7 +16751,7 @@
           <w:sz w:val="24"/>
           <w:szCs w:val="24"/>
         </w:rPr>
-        <w:t xml:space="preserve">借阅功能的关键不是按钮，而是复本数量与借阅记录保持一致。实现时把扣减数量、插入借阅单放在同一个事务里，并在 SQL 中加入可借数大于零的条件。若更新行数不是 1，业务层立即抛出异常，避免出现超借或负库存。</w:t>
+        <w:t xml:space="preserve">借阅功能看起来只是点一下按钮，实际麻烦的是数量和记录要同时变化。我一开始先查可借数，再在 Java 中减一，测试时发现这样经不起重复请求。后来把扣减和插入借阅单放进了同一个事务，扣减 SQL 也加上可借数大于零的条件，返回不是一行就停止。</w:t>
       </w:r>
     </w:p>
     <w:p>
@@ -16301,7 +16770,7 @@
           <w:sz w:val="24"/>
           <w:szCs w:val="24"/>
         </w:rPr>
-        <w:t xml:space="preserve">编辑馆藏时也遇到过数量覆盖问题。页面允许修改总册数，却不能直接修改可借数。Service 先计算“总册数减可借数”得到仍在借出的册数，再按新总册数重新计算可借数量；如果新总册数小于借出数，就拒绝保存。这样修改书目不会破坏正在进行的借阅。</w:t>
+        <w:t xml:space="preserve">编辑馆藏时还出现过一次数量覆盖。表单能改总册数，但不能直接把可借数提交回来，否则正在借出的书会被重新算成可借。后来 Service 先算出借出册数，再用新总册数重新计算可借数；如果新总册数比借出数还少，就不允许保存。</w:t>
       </w:r>
     </w:p>
     <w:p>
@@ -16320,7 +16789,26 @@
           <w:sz w:val="24"/>
           <w:szCs w:val="24"/>
         </w:rPr>
-        <w:t xml:space="preserve">云端部署还暴露出反向代理下的跳转问题。应用通过 forward-headers-strategy 识别外部 HTTPS 请求，登录和业务操作使用相对地址重定向。浏览器访问公开域名后不会跳回服务器内部的 localhost。SSM 的分工也在这几轮修改中保持清楚：Controller 处理路由和会话，Service 管理规则与事务，Mapper 负责 SQL，Thymeleaf 只渲染数据。</w:t>
+        <w:t xml:space="preserve">另一个花时间比较多的问题是云端跳转。公开地址前面有代理，刚开始登录后会跳回 localhost，看起来像应用已经坏了。查了启动日志和响应头后，才知道要处理代理转发。启用 forward-headers-strategy 并改用相对重定向后，页面才一直停在公开域名下。</w:t>
+      </w:r>
+    </w:p>
+    <w:p>
+      <w:pPr>
+        <w:keepNext w:val="false"/>
+        <w:spacing w:after="110" w:line="360"/>
+        <w:ind w:firstLine="480"/>
+        <w:jc w:val="both"/>
+      </w:pPr>
+      <w:r>
+        <w:rPr>
+          <w:rFonts w:ascii="宋体" w:cs="宋体" w:eastAsia="宋体" w:hAnsi="宋体"/>
+          <w:b w:val="false"/>
+          <w:bCs w:val="false"/>
+          <w:color w:val="000000"/>
+          <w:sz w:val="24"/>
+          <w:szCs w:val="24"/>
+        </w:rPr>
+        <w:t xml:space="preserve">页面修改也反复了几轮。最初只想着把功能放上去，目录页的信息比较挤，手机宽度下按钮和文字会靠得太近。后来重新整理了统计区、分类栏和图书行，把常用的检索条件放在上方，把次要信息放低一些。截图里的页面不是一次做完的，而是根据实际使用时的别扭之处慢慢改出来的。</w:t>
       </w:r>
     </w:p>
     <w:p>
@@ -16329,7 +16817,7 @@
         <w:keepNext/>
         <w:spacing w:after="120" w:before="220" w:line="360"/>
       </w:pPr>
-      <w:bookmarkStart w:name="h2_d60af75" w:id="50"/>
+      <w:bookmarkStart w:name="h2_d60af75" w:id="52"/>
       <w:r>
         <w:rPr>
           <w:rFonts w:ascii="黑体" w:cs="黑体" w:eastAsia="黑体" w:hAnsi="黑体"/>
@@ -16340,7 +16828,7 @@
         </w:rPr>
         <w:t xml:space="preserve">4.3  测试与验收</w:t>
       </w:r>
-      <w:bookmarkEnd w:id="50"/>
+      <w:bookmarkEnd w:id="52"/>
     </w:p>
     <w:p>
       <w:pPr>
@@ -16358,7 +16846,7 @@
           <w:sz w:val="24"/>
           <w:szCs w:val="24"/>
         </w:rPr>
-        <w:t xml:space="preserve">测试分为自动化测试和公开页面验收两部分。自动化测试使用 H2 内存数据库，执行后不会污染云端正式数据；页面验收在公开地址上完成，检查实际登录、预约和馆员操作。测试中涉及预约时间的参数按运行日期动态生成，避免固定日期过期造成误报。</w:t>
+        <w:t xml:space="preserve">测试分成两部分。一部分用 H2 内存数据库跑 Maven 测试，不会影响云端正式数据；另一部分在公开地址上手工注册、登录、预约和确认取书。刚开始自动化用例里写死了日期，过了测试日期之后就全部失败，后来改成按运行当天生成时间，才不会再出现这种误报。</w:t>
       </w:r>
     </w:p>
     <w:p>
@@ -17019,7 +17507,7 @@
           <w:sz w:val="24"/>
           <w:szCs w:val="24"/>
         </w:rPr>
-        <w:t xml:space="preserve">测试过程中还修正了自动化用例中的固定日期。当前用例会根据运行当天生成预约取书时间和应还日期，既继续检查了日期校验，也不会因为几个月后再次运行而失败。测试结束后重新检查云端数据，确认临时账号和借阅记录均已清理。</w:t>
+        <w:t xml:space="preserve">测试结束后我又回到数据库检查了一遍，把临时注册的账号和借阅记录清掉。正式馆藏保留 87 种、403 册，公开页面此时不需要登录也能打开。这样交付后再注册的第一个账号仍然是馆员。</w:t>
       </w:r>
     </w:p>
     <w:p>
@@ -17028,7 +17516,7 @@
         <w:keepNext/>
         <w:spacing w:after="120" w:before="220" w:line="360"/>
       </w:pPr>
-      <w:bookmarkStart w:name="h2_9368ac88" w:id="51"/>
+      <w:bookmarkStart w:name="h2_9368ac88" w:id="53"/>
       <w:r>
         <w:rPr>
           <w:rFonts w:ascii="黑体" w:cs="黑体" w:eastAsia="黑体" w:hAnsi="黑体"/>
@@ -17039,7 +17527,7 @@
         </w:rPr>
         <w:t xml:space="preserve">4.4  不足与改进方向</w:t>
       </w:r>
-      <w:bookmarkEnd w:id="51"/>
+      <w:bookmarkEnd w:id="53"/>
     </w:p>
     <w:p>
       <w:pPr>
@@ -17057,7 +17545,7 @@
           <w:sz w:val="24"/>
           <w:szCs w:val="24"/>
         </w:rPr>
-        <w:t xml:space="preserve">当前系统没有接入学校统一身份认证、短信通知、逾期罚款和预约排队。对课程作业而言，这些功能不影响主流程演示，但投入真实使用后仍需补齐。尤其是预约到期未取书和逾期未归还，应由定时任务产生提醒并更新状态。</w:t>
+        <w:t xml:space="preserve">现在这个版本离真正上线的图书馆系统还有不少距离。学校统一认证、短信通知、逾期罚款和预约排队都没有做，预约到期未取、逾期未还也只能靠人工查看。对课程作业来说主流程可以走通，但如果真的给同学使用，这些提醒必须补上。</w:t>
       </w:r>
     </w:p>
     <w:p>
@@ -17076,7 +17564,7 @@
           <w:sz w:val="24"/>
           <w:szCs w:val="24"/>
         </w:rPr>
-        <w:t xml:space="preserve">书目封面目前由馆员填写站内路径，没有提供文件上传。后续可以增加图片上传、尺寸校验和对象存储，让馆员直接维护封面。目录一次显示全部 87 条，数据量继续增长时应改为服务端分页，并为常用检索字段建立组合索引。</w:t>
+        <w:t xml:space="preserve">封面目前还是由馆员填写站内路径，不能直接上传文件。目录也一次返回全部 87 条，没有分页。现在数据不多，打开速度还可以，但书目继续增加后，分页、图片上传和组合索引都要补。</w:t>
       </w:r>
     </w:p>
     <w:p>
@@ -17095,7 +17583,7 @@
           <w:sz w:val="24"/>
           <w:szCs w:val="24"/>
         </w:rPr>
-        <w:t xml:space="preserve">生产环境还需要补强安全与运维能力，包括 CSRF 防护、登录限流、操作审计、数据库备份和异常告警。当前部署已经限制数据库只在本机监听，公网只开放 Web 端口，但课程项目不应直接视为正式生产系统。</w:t>
+        <w:t xml:space="preserve">安全和运维做得也比较基础。数据库只在本机监听，公网只开 Web 端口，但 CSRF 防护、登录失败限制、操作审计、备份和异常告警还没有。课程作业可以先满足流程，正式使用时不能直接照搬现在的部署方式。</w:t>
       </w:r>
     </w:p>
     <w:p>
@@ -17104,7 +17592,7 @@
         <w:keepNext/>
         <w:spacing w:after="120" w:before="220" w:line="360"/>
       </w:pPr>
-      <w:bookmarkStart w:name="h2_86fb587e" w:id="52"/>
+      <w:bookmarkStart w:name="h2_86fb587e" w:id="54"/>
       <w:r>
         <w:rPr>
           <w:rFonts w:ascii="黑体" w:cs="黑体" w:eastAsia="黑体" w:hAnsi="黑体"/>
@@ -17115,7 +17603,7 @@
         </w:rPr>
         <w:t xml:space="preserve">4.5  运行效果评价</w:t>
       </w:r>
-      <w:bookmarkEnd w:id="52"/>
+      <w:bookmarkEnd w:id="54"/>
     </w:p>
     <w:p>
       <w:pPr>
@@ -17133,7 +17621,7 @@
           <w:sz w:val="24"/>
           <w:szCs w:val="24"/>
         </w:rPr>
-        <w:t xml:space="preserve">从试运行结果看，公开目录、注册登录、预约借阅、馆员取书和归还已经形成连续闭环。读者无需登录即可确认馆藏是否存在，登录后能够提交预约；馆员看到同一张借阅单并继续处理。数据库中的可借数量随状态变化，刷新页面后结果仍然一致。</w:t>
+        <w:t xml:space="preserve">从试运行结果看，最基本的借书过程已经能连续走完。读者先查目录，登录后提交预约，馆员看到同一张记录再确认取书，归还后数量恢复。刷新页面或换一个浏览器重新登录，状态仍和数据库一致。</w:t>
       </w:r>
     </w:p>
     <w:p>
@@ -17794,7 +18282,7 @@
           <w:sz w:val="24"/>
           <w:szCs w:val="24"/>
         </w:rPr>
-        <w:t xml:space="preserve">系统仍有课程项目规模下的性能边界。公开目录一次返回全部 87 条书目，没有分页；统计查询每次请求都会重新执行。以目前数据量访问速度正常，但馆藏继续增加时需要分页、缓存和更细的索引设计。</w:t>
+        <w:t xml:space="preserve">目前数据量不大，页面打开速度还可以，但这不是说系统没有性能问题。目录一次返回全部书目，统计查询每次都会重新执行，书目多起来以后响应会变慢。后面应先做分页，再根据实际访问情况决定是否加缓存。</w:t>
       </w:r>
     </w:p>
     <w:p>
@@ -17803,7 +18291,7 @@
         <w:keepNext/>
         <w:spacing w:after="120" w:before="220" w:line="360"/>
       </w:pPr>
-      <w:bookmarkStart w:name="h2_b13e7fc2" w:id="53"/>
+      <w:bookmarkStart w:name="h2_b13e7fc2" w:id="55"/>
       <w:r>
         <w:rPr>
           <w:rFonts w:ascii="黑体" w:cs="黑体" w:eastAsia="黑体" w:hAnsi="黑体"/>
@@ -17814,7 +18302,7 @@
         </w:rPr>
         <w:t xml:space="preserve">4.6  后续迭代计划</w:t>
       </w:r>
-      <w:bookmarkEnd w:id="53"/>
+      <w:bookmarkEnd w:id="55"/>
     </w:p>
     <w:p>
       <w:pPr>
@@ -17832,7 +18320,7 @@
           <w:sz w:val="24"/>
           <w:szCs w:val="24"/>
         </w:rPr>
-        <w:t xml:space="preserve">第一阶段补足借阅管理。增加预约到期自动取消、逾期提醒、借阅历史和罚款规则，让馆员不必手工检查每条记录。定时任务只处理满足状态和时间条件的借阅单，并在执行前重新读取状态，避免与读者操作冲突。</w:t>
+        <w:t xml:space="preserve">如果继续做，我准备先补借阅管理。预约到期自动取消、逾期提醒、借阅历史和罚款规则都要加上，免得馆员每天手工翻记录。定时任务执行前还要再读一次状态，避免和读者操作撞在一起。</w:t>
       </w:r>
     </w:p>
     <w:p>
@@ -17851,7 +18339,7 @@
           <w:sz w:val="24"/>
           <w:szCs w:val="24"/>
         </w:rPr>
-        <w:t xml:space="preserve">第二阶段完善馆藏维护。把封面路径输入改成图片上传，增加文件类型和尺寸校验；引入服务端分页、排序和批量导入，让馆员可以通过 Excel 或 ISBN 清单维护馆藏。删除操作改为逻辑删除，保留历史借阅关联。</w:t>
+        <w:t xml:space="preserve">第二步是馆藏维护。把封面路径改成文件上传，限制类型和大小，再加服务端分页、排序和 Excel 批量导入。删除最好改成逻辑删除，这样旧借阅单不会因为书目被删掉而失去关联。</w:t>
       </w:r>
     </w:p>
     <w:p>
@@ -17870,7 +18358,7 @@
           <w:sz w:val="24"/>
           <w:szCs w:val="24"/>
         </w:rPr>
-        <w:t xml:space="preserve">第三阶段提升安全和运维。接入学校统一身份认证，增加 CSRF 防护、登录失败限制、角色审计和数据库备份。公开部署使用独立服务器和 HTTPS 域名，不再依赖开发用的临时云端环境。</w:t>
+        <w:t xml:space="preserve">第三步才是安全和正式部署。接入学校认证，补 CSRF、登录失败限制、操作审计和数据库备份，再换成独立服务器和固定域名。现在依赖开发环境中的临时地址，适合交作业，不适合长期运行。</w:t>
       </w:r>
     </w:p>
     <w:p>
@@ -17879,7 +18367,7 @@
         <w:keepNext/>
         <w:spacing w:after="120" w:before="220" w:line="360"/>
       </w:pPr>
-      <w:bookmarkStart w:name="h2_10652c75" w:id="54"/>
+      <w:bookmarkStart w:name="h2_10652c75" w:id="56"/>
       <w:r>
         <w:rPr>
           <w:rFonts w:ascii="黑体" w:cs="黑体" w:eastAsia="黑体" w:hAnsi="黑体"/>
@@ -17890,7 +18378,7 @@
         </w:rPr>
         <w:t xml:space="preserve">4.7  总结</w:t>
       </w:r>
-      <w:bookmarkEnd w:id="54"/>
+      <w:bookmarkEnd w:id="56"/>
     </w:p>
     <w:p>
       <w:pPr>
@@ -17908,7 +18396,7 @@
           <w:sz w:val="24"/>
           <w:szCs w:val="24"/>
         </w:rPr>
-        <w:t xml:space="preserve">本次作业完成了从需求分析、数据库设计、SSM 编码到云端部署和页面验收的完整流程。公开馆藏可以立即浏览，读者注册后可以预约，馆员可以确认取书并维护馆藏，归还后复本数量会恢复到数据库。页面截图和报告中的数据均来自实际运行结果。</w:t>
+        <w:t xml:space="preserve">这次作业从选题、画流程、建表一直做到编码、部署和截图，前后改了很多次。开始时我以为只要页面能打开就算完成，真正做到借阅以后才发现登录、权限、事务和数量同步都不能省。公开馆藏、注册预约、馆员取书和归还是最后实际跑通的流程，报告中的图片和数据也来自运行中的网站。</w:t>
       </w:r>
     </w:p>
     <w:p>
@@ -17927,7 +18415,121 @@
           <w:sz w:val="24"/>
           <w:szCs w:val="24"/>
         </w:rPr>
-        <w:t xml:space="preserve">这次实现让我认识到，课程项目是否完整，不在于页面数量，而在于一次业务操作能否在数据库里形成可追踪的闭环。后续若继续迭代，我会优先处理预约提醒、文件上传、分页和审计记录，再扩展其他辅助功能。</w:t>
+        <w:t xml:space="preserve">现在再回头看，这个系统还有不少地方可以改，但至少能把一本书从检索、预约、取书到归还的过程走完。通过这次作业，我对 SSM 的分工、数据库约束和云端部署都有了更具体的认识，也发现自己在页面整理、异常处理和测试方面还不够熟练。后面如果继续完善，我会先把预约提醒、分页和图片上传做好，再考虑其他功能。</w:t>
+      </w:r>
+    </w:p>
+    <w:p>
+      <w:pPr>
+        <w:pStyle w:val="Heading2"/>
+        <w:keepNext/>
+        <w:spacing w:after="120" w:before="220" w:line="360"/>
+      </w:pPr>
+      <w:bookmarkStart w:name="h2_803b355" w:id="57"/>
+      <w:r>
+        <w:rPr>
+          <w:rFonts w:ascii="黑体" w:cs="黑体" w:eastAsia="黑体" w:hAnsi="黑体"/>
+          <w:b/>
+          <w:bCs/>
+          <w:sz w:val="28"/>
+          <w:szCs w:val="28"/>
+        </w:rPr>
+        <w:t xml:space="preserve">4.8  课程设计体会</w:t>
+      </w:r>
+      <w:bookmarkEnd w:id="57"/>
+    </w:p>
+    <w:p>
+      <w:pPr>
+        <w:keepNext w:val="false"/>
+        <w:spacing w:after="110" w:line="360"/>
+        <w:ind w:firstLine="480"/>
+        <w:jc w:val="both"/>
+      </w:pPr>
+      <w:r>
+        <w:rPr>
+          <w:rFonts w:ascii="宋体" w:cs="宋体" w:eastAsia="宋体" w:hAnsi="宋体"/>
+          <w:b w:val="false"/>
+          <w:bCs w:val="false"/>
+          <w:color w:val="000000"/>
+          <w:sz w:val="24"/>
+          <w:szCs w:val="24"/>
+        </w:rPr>
+        <w:t xml:space="preserve">这次大作业花的时间主要不在写第一版页面，而在反复修改。目录页最初把分类、统计和书单挤在一起，看起来信息很多，实际使用时却找不到重点；后来把统计放到上方，把常用筛选留在侧栏，页面才顺一些。借阅功能也是同样，开始只觉得能提交表单就行，测试多开两个浏览器后才发现库存和状态必须一起处理。</w:t>
+      </w:r>
+    </w:p>
+    <w:p>
+      <w:pPr>
+        <w:keepNext w:val="false"/>
+        <w:spacing w:after="110" w:line="360"/>
+        <w:ind w:firstLine="480"/>
+        <w:jc w:val="both"/>
+      </w:pPr>
+      <w:r>
+        <w:rPr>
+          <w:rFonts w:ascii="宋体" w:cs="宋体" w:eastAsia="宋体" w:hAnsi="宋体"/>
+          <w:b w:val="false"/>
+          <w:bCs w:val="false"/>
+          <w:color w:val="000000"/>
+          <w:sz w:val="24"/>
+          <w:szCs w:val="24"/>
+        </w:rPr>
+        <w:t xml:space="preserve">调试过程中，数据库连接、封面路径和公开地址都出过问题。有些错误页面只显示 500，我只能一边看启动日志，一边把请求参数和 SQL 打出来核对。遇到不确定的配置时，也查了课程资料并问过同学。问题解决后再回头看，很多地方并不是技术有多难，而是自己一开始没有把请求经过的路径想完整。</w:t>
+      </w:r>
+    </w:p>
+    <w:p>
+      <w:pPr>
+        <w:keepNext w:val="false"/>
+        <w:spacing w:after="110" w:line="360"/>
+        <w:ind w:firstLine="480"/>
+        <w:jc w:val="both"/>
+      </w:pPr>
+      <w:r>
+        <w:rPr>
+          <w:rFonts w:ascii="宋体" w:cs="宋体" w:eastAsia="宋体" w:hAnsi="宋体"/>
+          <w:b w:val="false"/>
+          <w:bCs w:val="false"/>
+          <w:color w:val="000000"/>
+          <w:sz w:val="24"/>
+          <w:szCs w:val="24"/>
+        </w:rPr>
+        <w:t xml:space="preserve">通过这次设计，我对一个网站从页面、业务到数据库之间的关系有了更直接的认识。页面上的一个按钮背后可能对应 Controller、Service、Mapper 和数据库中的几次变化，任何一处漏掉都会让结果对不上。系统现在还不算完善，但主要功能能够实际运行，也留下了后面继续修改的基础。</w:t>
+      </w:r>
+    </w:p>
+    <w:p>
+      <w:pPr>
+        <w:keepNext w:val="false"/>
+        <w:spacing w:after="110" w:line="360"/>
+        <w:ind w:firstLine="480"/>
+        <w:jc w:val="both"/>
+      </w:pPr>
+      <w:r>
+        <w:rPr>
+          <w:rFonts w:ascii="宋体" w:cs="宋体" w:eastAsia="宋体" w:hAnsi="宋体"/>
+          <w:b w:val="false"/>
+          <w:bCs w:val="false"/>
+          <w:color w:val="000000"/>
+          <w:sz w:val="24"/>
+          <w:szCs w:val="24"/>
+        </w:rPr>
+        <w:t xml:space="preserve">这次作业也让我改掉了先写页面、最后再想数据库的习惯。现在我会先把表字段和状态变化列清楚，再决定页面需要哪些按钮。遇到问题时，先看日志和请求路径，比反复改样式更容易找到原因。虽然过程比较慢，但每一步都能留下可以检查的记录。</w:t>
+      </w:r>
+    </w:p>
+    <w:p>
+      <w:pPr>
+        <w:keepNext w:val="false"/>
+        <w:spacing w:after="110" w:line="360"/>
+        <w:ind w:firstLine="480"/>
+        <w:jc w:val="both"/>
+      </w:pPr>
+      <w:r>
+        <w:rPr>
+          <w:rFonts w:ascii="宋体" w:cs="宋体" w:eastAsia="宋体" w:hAnsi="宋体"/>
+          <w:b w:val="false"/>
+          <w:bCs w:val="false"/>
+          <w:color w:val="000000"/>
+          <w:sz w:val="24"/>
+          <w:szCs w:val="24"/>
+        </w:rPr>
+        <w:t xml:space="preserve">报告整理阶段，我又把任务书、参考文档和运行页面放在一起核对了一遍。章节顺序、代码说明、截图标题和页脚页码统一后，内容才比较完整。受时间和个人能力限制，系统还有不少可以改进的地方，后续会继续补充预约提醒、分页和封面文件上传。</w:t>
       </w:r>
     </w:p>
     <w:sectPr>

</xml_diff>